<commit_message>
Add booking times to public calendar API
</commit_message>
<xml_diff>
--- a/templates/rental-contract-template-1782471508838.docx
+++ b/templates/rental-contract-template-1782471508838.docx
@@ -23,84 +23,6 @@
         </w:rPr>
         <w:t>Договор аренды автомобиля без экипажа № {{contract_number}} от {{contract_date}}</w:t>
       </w:r>
-      <w:r>
-        <w:rPr>
-          <w:color w:val="1D2021"/>
-          <w:spacing w:val="-1"/>
-        </w:rPr>
-        <w:t xml:space="preserve"/>
-      </w:r>
-      <w:r>
-        <w:rPr>
-          <w:color w:val="1D2021"/>
-        </w:rPr>
-        <w:t/>
-      </w:r>
-      <w:r>
-        <w:rPr>
-          <w:color w:val="1D2021"/>
-          <w:spacing w:val="-1"/>
-        </w:rPr>
-        <w:t xml:space="preserve"/>
-      </w:r>
-      <w:r>
-        <w:rPr>
-          <w:color w:val="1D2021"/>
-        </w:rPr>
-        <w:t/>
-      </w:r>
-      <w:r>
-        <w:rPr>
-          <w:color w:val="1D2021"/>
-          <w:spacing w:val="-1"/>
-        </w:rPr>
-        <w:t xml:space="preserve"/>
-      </w:r>
-      <w:r>
-        <w:rPr>
-          <w:color w:val="1D2021"/>
-        </w:rPr>
-        <w:t/>
-      </w:r>
-      <w:r>
-        <w:rPr>
-          <w:color w:val="1D2021"/>
-          <w:spacing w:val="-1"/>
-        </w:rPr>
-        <w:t xml:space="preserve"/>
-      </w:r>
-      <w:r>
-        <w:rPr>
-          <w:color w:val="1D2021"/>
-        </w:rPr>
-        <w:t/>
-      </w:r>
-      <w:r>
-        <w:rPr>
-          <w:color w:val="1D2021"/>
-          <w:spacing w:val="-1"/>
-        </w:rPr>
-        <w:t xml:space="preserve"/>
-      </w:r>
-      <w:r>
-        <w:rPr>
-          <w:color w:val="1D2021"/>
-        </w:rPr>
-        <w:t/>
-      </w:r>
-      <w:r>
-        <w:rPr>
-          <w:color w:val="1D2021"/>
-          <w:spacing w:val="-1"/>
-        </w:rPr>
-        <w:t xml:space="preserve"/>
-      </w:r>
-      <w:r>
-        <w:rPr>
-          <w:color w:val="1D2021"/>
-        </w:rPr>
-        <w:t/>
-      </w:r>
     </w:p>
     <w:p>
       <w:pPr>
@@ -112,342 +34,6 @@
           <w:color w:val="545454"/>
         </w:rPr>
         <w:t>{{owner_full_name}}, именуемый в дальнейшем «Арендодатель», с одной стороны, и {{client_full_name}}, именуемый(ая) в дальнейшем «Арендатор», с другой стороны, совместно именуемые «Стороны», заключили настоящий договор о нижеследующем:</w:t>
-      </w:r>
-      <w:r>
-        <w:rPr>
-          <w:color w:val="545454"/>
-          <w:spacing w:val="-12"/>
-        </w:rPr>
-        <w:t xml:space="preserve"/>
-      </w:r>
-      <w:r>
-        <w:rPr>
-          <w:color w:val="545454"/>
-        </w:rPr>
-        <w:t/>
-      </w:r>
-      <w:r>
-        <w:rPr>
-          <w:color w:val="545454"/>
-          <w:spacing w:val="-9"/>
-        </w:rPr>
-        <w:t xml:space="preserve"/>
-      </w:r>
-      <w:r>
-        <w:rPr>
-          <w:color w:val="545454"/>
-        </w:rPr>
-        <w:t/>
-      </w:r>
-      <w:r>
-        <w:rPr>
-          <w:color w:val="545454"/>
-          <w:spacing w:val="-9"/>
-        </w:rPr>
-        <w:t xml:space="preserve"/>
-      </w:r>
-      <w:r>
-        <w:rPr>
-          <w:color w:val="545454"/>
-        </w:rPr>
-        <w:t/>
-      </w:r>
-      <w:r>
-        <w:rPr>
-          <w:color w:val="545454"/>
-          <w:spacing w:val="-10"/>
-        </w:rPr>
-        <w:t xml:space="preserve"/>
-      </w:r>
-      <w:r>
-        <w:rPr>
-          <w:color w:val="545454"/>
-        </w:rPr>
-        <w:t/>
-      </w:r>
-      <w:r>
-        <w:rPr>
-          <w:color w:val="545454"/>
-          <w:spacing w:val="-9"/>
-        </w:rPr>
-        <w:t xml:space="preserve"/>
-      </w:r>
-      <w:r>
-        <w:rPr>
-          <w:color w:val="545454"/>
-        </w:rPr>
-        <w:t/>
-      </w:r>
-      <w:r>
-        <w:rPr>
-          <w:color w:val="545454"/>
-          <w:spacing w:val="-9"/>
-        </w:rPr>
-        <w:t xml:space="preserve"/>
-      </w:r>
-      <w:r>
-        <w:rPr>
-          <w:color w:val="545454"/>
-        </w:rPr>
-        <w:t/>
-      </w:r>
-      <w:r>
-        <w:rPr>
-          <w:color w:val="545454"/>
-          <w:spacing w:val="-10"/>
-        </w:rPr>
-        <w:t xml:space="preserve"/>
-      </w:r>
-      <w:r>
-        <w:rPr>
-          <w:color w:val="545454"/>
-        </w:rPr>
-        <w:t/>
-      </w:r>
-      <w:r>
-        <w:rPr>
-          <w:color w:val="545454"/>
-          <w:spacing w:val="-9"/>
-        </w:rPr>
-        <w:t xml:space="preserve"/>
-      </w:r>
-      <w:r>
-        <w:rPr>
-          <w:color w:val="545454"/>
-        </w:rPr>
-        <w:t/>
-      </w:r>
-      <w:r>
-        <w:rPr>
-          <w:color w:val="545454"/>
-          <w:spacing w:val="-9"/>
-        </w:rPr>
-        <w:t xml:space="preserve"/>
-      </w:r>
-      <w:r>
-        <w:rPr>
-          <w:color w:val="545454"/>
-        </w:rPr>
-        <w:t/>
-      </w:r>
-      <w:r>
-        <w:rPr>
-          <w:color w:val="545454"/>
-          <w:spacing w:val="-9"/>
-        </w:rPr>
-        <w:t xml:space="preserve"/>
-      </w:r>
-      <w:r>
-        <w:rPr>
-          <w:color w:val="545454"/>
-          <w:spacing w:val="-10"/>
-        </w:rPr>
-        <w:t/>
-      </w:r>
-      <w:r>
-        <w:t xml:space="preserve"/>
-      </w:r>
-      <w:r>
-        <w:rPr>
-          <w:color w:val="545454"/>
-        </w:rPr>
-        <w:t xml:space="preserve"/>
-      </w:r>
-      <w:r>
-        <w:rPr>
-          <w:color w:val="545454"/>
-        </w:rPr>
-        <w:t/>
-      </w:r>
-      <w:proofErr w:type="spellStart"/>
-      <w:r>
-        <w:rPr>
-          <w:color w:val="545454"/>
-        </w:rPr>
-        <w:t/>
-      </w:r>
-      <w:proofErr w:type="spellEnd"/>
-      <w:r>
-        <w:rPr>
-          <w:color w:val="545454"/>
-        </w:rPr>
-        <w:t/>
-      </w:r>
-      <w:r>
-        <w:rPr>
-          <w:color w:val="545454"/>
-        </w:rPr>
-        <w:t xml:space="preserve"/>
-      </w:r>
-      <w:r>
-        <w:rPr>
-          <w:color w:val="545454"/>
-        </w:rPr>
-        <w:t/>
-      </w:r>
-      <w:r>
-        <w:rPr>
-          <w:color w:val="545454"/>
-          <w:spacing w:val="-8"/>
-        </w:rPr>
-        <w:t xml:space="preserve"/>
-      </w:r>
-      <w:r>
-        <w:rPr>
-          <w:color w:val="545454"/>
-          <w:spacing w:val="-2"/>
-        </w:rPr>
-        <w:t/>
-      </w:r>
-      <w:r>
-        <w:rPr>
-          <w:color w:val="545454"/>
-          <w:spacing w:val="-2"/>
-        </w:rPr>
-        <w:t xml:space="preserve"/>
-      </w:r>
-      <w:r>
-        <w:rPr>
-          <w:color w:val="545454"/>
-        </w:rPr>
-        <w:t/>
-      </w:r>
-      <w:r>
-        <w:rPr>
-          <w:color w:val="545454"/>
-          <w:spacing w:val="-8"/>
-        </w:rPr>
-        <w:t xml:space="preserve"/>
-      </w:r>
-      <w:r>
-        <w:rPr>
-          <w:color w:val="545454"/>
-        </w:rPr>
-        <w:t/>
-      </w:r>
-      <w:r>
-        <w:rPr>
-          <w:color w:val="545454"/>
-          <w:spacing w:val="-8"/>
-        </w:rPr>
-        <w:t xml:space="preserve"/>
-      </w:r>
-      <w:r>
-        <w:rPr>
-          <w:color w:val="545454"/>
-        </w:rPr>
-        <w:t/>
-      </w:r>
-      <w:r>
-        <w:rPr>
-          <w:color w:val="545454"/>
-          <w:spacing w:val="-8"/>
-        </w:rPr>
-        <w:t xml:space="preserve"/>
-      </w:r>
-      <w:r>
-        <w:rPr>
-          <w:color w:val="545454"/>
-        </w:rPr>
-        <w:t/>
-      </w:r>
-      <w:r>
-        <w:rPr>
-          <w:color w:val="545454"/>
-          <w:spacing w:val="-8"/>
-        </w:rPr>
-        <w:t xml:space="preserve"/>
-      </w:r>
-      <w:r>
-        <w:rPr>
-          <w:color w:val="545454"/>
-        </w:rPr>
-        <w:t/>
-      </w:r>
-      <w:r>
-        <w:rPr>
-          <w:color w:val="545454"/>
-          <w:spacing w:val="-8"/>
-        </w:rPr>
-        <w:t xml:space="preserve"/>
-      </w:r>
-      <w:r>
-        <w:rPr>
-          <w:color w:val="545454"/>
-        </w:rPr>
-        <w:t/>
-      </w:r>
-      <w:r>
-        <w:rPr>
-          <w:color w:val="545454"/>
-          <w:spacing w:val="-8"/>
-        </w:rPr>
-        <w:t xml:space="preserve"/>
-      </w:r>
-      <w:r>
-        <w:rPr>
-          <w:color w:val="545454"/>
-        </w:rPr>
-        <w:t/>
-      </w:r>
-      <w:r>
-        <w:rPr>
-          <w:color w:val="545454"/>
-          <w:spacing w:val="-8"/>
-        </w:rPr>
-        <w:t xml:space="preserve"/>
-      </w:r>
-      <w:r>
-        <w:rPr>
-          <w:color w:val="545454"/>
-        </w:rPr>
-        <w:t/>
-      </w:r>
-      <w:r>
-        <w:rPr>
-          <w:color w:val="545454"/>
-          <w:spacing w:val="-8"/>
-        </w:rPr>
-        <w:t xml:space="preserve"/>
-      </w:r>
-      <w:r>
-        <w:rPr>
-          <w:color w:val="545454"/>
-        </w:rPr>
-        <w:t/>
-      </w:r>
-      <w:r>
-        <w:rPr>
-          <w:color w:val="545454"/>
-          <w:spacing w:val="-8"/>
-        </w:rPr>
-        <w:t xml:space="preserve"/>
-      </w:r>
-      <w:r>
-        <w:rPr>
-          <w:color w:val="545454"/>
-        </w:rPr>
-        <w:t/>
-      </w:r>
-      <w:r>
-        <w:rPr>
-          <w:color w:val="545454"/>
-          <w:spacing w:val="-8"/>
-        </w:rPr>
-        <w:t xml:space="preserve"/>
-      </w:r>
-      <w:r>
-        <w:rPr>
-          <w:color w:val="545454"/>
-        </w:rPr>
-        <w:t xml:space="preserve"/>
-      </w:r>
-      <w:r>
-        <w:rPr>
-          <w:color w:val="545454"/>
-          <w:spacing w:val="-2"/>
-        </w:rPr>
-        <w:t/>
       </w:r>
     </w:p>
     <w:p>
@@ -835,60 +421,6 @@
           <w:color w:val="545454"/>
         </w:rPr>
         <w:tab/>
-        <w:t/>
-      </w:r>
-      <w:r>
-        <w:rPr>
-          <w:color w:val="545454"/>
-          <w:spacing w:val="-9"/>
-        </w:rPr>
-        <w:t xml:space="preserve"/>
-      </w:r>
-      <w:r>
-        <w:rPr>
-          <w:color w:val="545454"/>
-        </w:rPr>
-        <w:t/>
-      </w:r>
-      <w:r>
-        <w:rPr>
-          <w:color w:val="545454"/>
-          <w:spacing w:val="-9"/>
-        </w:rPr>
-        <w:t xml:space="preserve"/>
-      </w:r>
-      <w:r>
-        <w:rPr>
-          <w:color w:val="545454"/>
-        </w:rPr>
-        <w:t/>
-      </w:r>
-      <w:r>
-        <w:rPr>
-          <w:color w:val="545454"/>
-          <w:spacing w:val="-9"/>
-        </w:rPr>
-        <w:t xml:space="preserve"/>
-      </w:r>
-      <w:r>
-        <w:rPr>
-          <w:color w:val="545454"/>
-        </w:rPr>
-        <w:t/>
-      </w:r>
-      <w:r>
-        <w:rPr>
-          <w:color w:val="545454"/>
-          <w:spacing w:val="-9"/>
-        </w:rPr>
-        <w:t xml:space="preserve"/>
-      </w:r>
-      <w:r>
-        <w:rPr>
-          <w:color w:val="545454"/>
-          <w:spacing w:val="-2"/>
-        </w:rPr>
-        <w:t/>
       </w:r>
     </w:p>
     <w:p>
@@ -910,34 +442,6 @@
           <w:color w:val="545454"/>
         </w:rPr>
         <w:tab/>
-        <w:t/>
-      </w:r>
-      <w:r>
-        <w:rPr>
-          <w:color w:val="545454"/>
-          <w:spacing w:val="-11"/>
-        </w:rPr>
-        <w:t xml:space="preserve"/>
-      </w:r>
-      <w:r>
-        <w:rPr>
-          <w:color w:val="545454"/>
-        </w:rPr>
-        <w:t/>
-      </w:r>
-      <w:r>
-        <w:rPr>
-          <w:color w:val="545454"/>
-          <w:spacing w:val="-11"/>
-        </w:rPr>
-        <w:t xml:space="preserve"/>
-      </w:r>
-      <w:r>
-        <w:rPr>
-          <w:color w:val="545454"/>
-          <w:spacing w:val="-2"/>
-        </w:rPr>
-        <w:t/>
       </w:r>
     </w:p>
     <w:p>
@@ -959,21 +463,6 @@
           <w:color w:val="545454"/>
         </w:rPr>
         <w:tab/>
-        <w:t/>
-      </w:r>
-      <w:r>
-        <w:rPr>
-          <w:color w:val="545454"/>
-          <w:spacing w:val="-4"/>
-        </w:rPr>
-        <w:t xml:space="preserve"/>
-      </w:r>
-      <w:r>
-        <w:rPr>
-          <w:color w:val="545454"/>
-          <w:spacing w:val="-2"/>
-        </w:rPr>
-        <w:t/>
       </w:r>
     </w:p>
     <w:p>
@@ -996,26 +485,6 @@
         </w:rPr>
         <w:tab/>
       </w:r>
-      <w:r>
-        <w:rPr>
-          <w:color w:val="545454"/>
-          <w:spacing w:val="-2"/>
-        </w:rPr>
-        <w:t/>
-      </w:r>
-      <w:r>
-        <w:rPr>
-          <w:color w:val="545454"/>
-        </w:rPr>
-        <w:t xml:space="preserve"/>
-      </w:r>
-      <w:r>
-        <w:rPr>
-          <w:color w:val="545454"/>
-          <w:spacing w:val="-2"/>
-        </w:rPr>
-        <w:t/>
-      </w:r>
     </w:p>
     <w:p>
       <w:pPr>
@@ -1036,47 +505,6 @@
           <w:color w:val="545454"/>
         </w:rPr>
         <w:tab/>
-        <w:t/>
-      </w:r>
-      <w:r>
-        <w:rPr>
-          <w:color w:val="545454"/>
-          <w:spacing w:val="-10"/>
-        </w:rPr>
-        <w:t xml:space="preserve"/>
-      </w:r>
-      <w:r>
-        <w:rPr>
-          <w:color w:val="545454"/>
-        </w:rPr>
-        <w:t/>
-      </w:r>
-      <w:r>
-        <w:rPr>
-          <w:color w:val="545454"/>
-          <w:spacing w:val="-10"/>
-        </w:rPr>
-        <w:t xml:space="preserve"/>
-      </w:r>
-      <w:r>
-        <w:rPr>
-          <w:color w:val="545454"/>
-        </w:rPr>
-        <w:t/>
-      </w:r>
-      <w:r>
-        <w:rPr>
-          <w:color w:val="545454"/>
-          <w:spacing w:val="-9"/>
-        </w:rPr>
-        <w:t xml:space="preserve"/>
-      </w:r>
-      <w:r>
-        <w:rPr>
-          <w:color w:val="545454"/>
-          <w:spacing w:val="-5"/>
-        </w:rPr>
-        <w:t/>
       </w:r>
     </w:p>
     <w:p>
@@ -1098,34 +526,6 @@
           <w:color w:val="545454"/>
         </w:rPr>
         <w:tab/>
-        <w:t/>
-      </w:r>
-      <w:r>
-        <w:rPr>
-          <w:color w:val="545454"/>
-          <w:spacing w:val="-7"/>
-        </w:rPr>
-        <w:t xml:space="preserve"/>
-      </w:r>
-      <w:r>
-        <w:rPr>
-          <w:color w:val="545454"/>
-        </w:rPr>
-        <w:t/>
-      </w:r>
-      <w:r>
-        <w:rPr>
-          <w:color w:val="545454"/>
-          <w:spacing w:val="-6"/>
-        </w:rPr>
-        <w:t xml:space="preserve"/>
-      </w:r>
-      <w:r>
-        <w:rPr>
-          <w:color w:val="545454"/>
-          <w:spacing w:val="-2"/>
-        </w:rPr>
-        <w:t/>
       </w:r>
     </w:p>
     <w:p>
@@ -1148,40 +548,6 @@
         </w:rPr>
         <w:tab/>
       </w:r>
-      <w:r>
-        <w:rPr>
-          <w:color w:val="545454"/>
-          <w:spacing w:val="-2"/>
-        </w:rPr>
-        <w:t/>
-      </w:r>
-      <w:r>
-        <w:rPr>
-          <w:color w:val="545454"/>
-        </w:rPr>
-        <w:t xml:space="preserve"/>
-      </w:r>
-      <w:r>
-        <w:rPr>
-          <w:color w:val="545454"/>
-          <w:spacing w:val="-2"/>
-        </w:rPr>
-        <w:t/>
-      </w:r>
-      <w:r>
-        <w:rPr>
-          <w:color w:val="545454"/>
-          <w:spacing w:val="1"/>
-        </w:rPr>
-        <w:t xml:space="preserve"/>
-      </w:r>
-      <w:r>
-        <w:rPr>
-          <w:color w:val="545454"/>
-          <w:spacing w:val="-2"/>
-        </w:rPr>
-        <w:t/>
-      </w:r>
     </w:p>
     <w:p>
       <w:pPr>
@@ -1202,60 +568,6 @@
           <w:color w:val="545454"/>
         </w:rPr>
         <w:tab/>
-        <w:t/>
-      </w:r>
-      <w:r>
-        <w:rPr>
-          <w:color w:val="545454"/>
-          <w:spacing w:val="-14"/>
-        </w:rPr>
-        <w:t xml:space="preserve"/>
-      </w:r>
-      <w:r>
-        <w:rPr>
-          <w:color w:val="545454"/>
-        </w:rPr>
-        <w:t/>
-      </w:r>
-      <w:r>
-        <w:rPr>
-          <w:color w:val="545454"/>
-          <w:spacing w:val="-11"/>
-        </w:rPr>
-        <w:t xml:space="preserve"/>
-      </w:r>
-      <w:r>
-        <w:rPr>
-          <w:color w:val="545454"/>
-        </w:rPr>
-        <w:t/>
-      </w:r>
-      <w:r>
-        <w:rPr>
-          <w:color w:val="545454"/>
-          <w:spacing w:val="-12"/>
-        </w:rPr>
-        <w:t xml:space="preserve"/>
-      </w:r>
-      <w:r>
-        <w:rPr>
-          <w:color w:val="545454"/>
-        </w:rPr>
-        <w:t/>
-      </w:r>
-      <w:r>
-        <w:rPr>
-          <w:color w:val="545454"/>
-          <w:spacing w:val="-11"/>
-        </w:rPr>
-        <w:t xml:space="preserve"/>
-      </w:r>
-      <w:r>
-        <w:rPr>
-          <w:color w:val="545454"/>
-          <w:spacing w:val="-2"/>
-        </w:rPr>
-        <w:t/>
       </w:r>
     </w:p>
     <w:p>
@@ -1277,27 +589,6 @@
           <w:color w:val="545454"/>
         </w:rPr>
         <w:tab/>
-      </w:r>
-      <w:r>
-        <w:rPr>
-          <w:color w:val="545454"/>
-          <w:spacing w:val="-2"/>
-        </w:rPr>
-        <w:t/>
-      </w:r>
-      <w:r>
-        <w:rPr>
-          <w:color w:val="545454"/>
-          <w:spacing w:val="-9"/>
-        </w:rPr>
-        <w:t xml:space="preserve"/>
-      </w:r>
-      <w:r>
-        <w:rPr>
-          <w:color w:val="545454"/>
-          <w:spacing w:val="-5"/>
-        </w:rPr>
-        <w:t/>
       </w:r>
     </w:p>
     <w:p>
@@ -3089,65 +2380,89 @@
         <w:rPr>
           <w:i/>
           <w:sz w:val="20"/>
-        </w:rPr>
-      </w:pPr>
-      <w:r>
-        <w:rPr>
-          <w:color w:val="545454"/>
-          <w:sz w:val="20"/>
-        </w:rPr>
-        <w:t xml:space="preserve">Начало срока аренды: {{rental_start_date}} {{rental_start_time}}</w:t>
-      </w:r>
-      <w:r>
-        <w:rPr>
-          <w:color w:val="545454"/>
-          <w:sz w:val="20"/>
-        </w:rPr>
-        <w:t/>
-      </w:r>
-      <w:r>
-        <w:rPr>
-          <w:color w:val="545454"/>
-          <w:sz w:val="20"/>
-        </w:rPr>
-        <w:t xml:space="preserve"/>
-      </w:r>
-      <w:r>
-        <w:rPr>
-          <w:color w:val="545454"/>
-          <w:sz w:val="20"/>
-        </w:rPr>
-        <w:t/>
-      </w:r>
-      <w:r>
-        <w:rPr>
-          <w:color w:val="545454"/>
-          <w:sz w:val="20"/>
-        </w:rPr>
-        <w:t/>
-      </w:r>
-      <w:r>
-        <w:rPr>
-          <w:color w:val="545454"/>
-          <w:sz w:val="20"/>
-        </w:rPr>
-        <w:t xml:space="preserve"/>
-      </w:r>
-      <w:r>
-        <w:rPr>
-          <w:color w:val="545454"/>
-          <w:sz w:val="20"/>
-        </w:rPr>
-        <w:t/>
-      </w:r>
-      <w:r>
-        <w:rPr>
-          <w:i/>
-          <w:color w:val="545454"/>
-          <w:spacing w:val="-5"/>
-          <w:sz w:val="20"/>
-        </w:rPr>
-        <w:t/>
+          <w:lang w:val="en-US"/>
+        </w:rPr>
+      </w:pPr>
+      <w:r>
+        <w:rPr>
+          <w:color w:val="545454"/>
+          <w:sz w:val="20"/>
+        </w:rPr>
+        <w:t>Начало</w:t>
+      </w:r>
+      <w:r>
+        <w:rPr>
+          <w:color w:val="545454"/>
+          <w:sz w:val="20"/>
+          <w:lang w:val="en-US"/>
+        </w:rPr>
+        <w:t xml:space="preserve"> </w:t>
+      </w:r>
+      <w:r>
+        <w:rPr>
+          <w:color w:val="545454"/>
+          <w:sz w:val="20"/>
+        </w:rPr>
+        <w:t>срока</w:t>
+      </w:r>
+      <w:r>
+        <w:rPr>
+          <w:color w:val="545454"/>
+          <w:sz w:val="20"/>
+          <w:lang w:val="en-US"/>
+        </w:rPr>
+        <w:t xml:space="preserve"> </w:t>
+      </w:r>
+      <w:r>
+        <w:rPr>
+          <w:color w:val="545454"/>
+          <w:sz w:val="20"/>
+        </w:rPr>
+        <w:t>аренды</w:t>
+      </w:r>
+      <w:r>
+        <w:rPr>
+          <w:color w:val="545454"/>
+          <w:sz w:val="20"/>
+          <w:lang w:val="en-US"/>
+        </w:rPr>
+        <w:t>: {{</w:t>
+      </w:r>
+      <w:proofErr w:type="spellStart"/>
+      <w:r>
+        <w:rPr>
+          <w:color w:val="545454"/>
+          <w:sz w:val="20"/>
+          <w:lang w:val="en-US"/>
+        </w:rPr>
+        <w:t>rental_start_date</w:t>
+      </w:r>
+      <w:proofErr w:type="spellEnd"/>
+      <w:r>
+        <w:rPr>
+          <w:color w:val="545454"/>
+          <w:sz w:val="20"/>
+          <w:lang w:val="en-US"/>
+        </w:rPr>
+        <w:t>}} {{</w:t>
+      </w:r>
+      <w:proofErr w:type="spellStart"/>
+      <w:r>
+        <w:rPr>
+          <w:color w:val="545454"/>
+          <w:sz w:val="20"/>
+          <w:lang w:val="en-US"/>
+        </w:rPr>
+        <w:t>rental_start_time</w:t>
+      </w:r>
+      <w:proofErr w:type="spellEnd"/>
+      <w:r>
+        <w:rPr>
+          <w:color w:val="545454"/>
+          <w:sz w:val="20"/>
+          <w:lang w:val="en-US"/>
+        </w:rPr>
+        <w:t>}}</w:t>
       </w:r>
     </w:p>
     <w:p>
@@ -3157,6 +2472,7 @@
         <w:ind w:left="0"/>
         <w:rPr>
           <w:i/>
+          <w:lang w:val="en-US"/>
         </w:rPr>
       </w:pPr>
     </w:p>
@@ -3177,59 +2493,134 @@
         <w:rPr>
           <w:i/>
           <w:sz w:val="20"/>
-        </w:rPr>
-      </w:pPr>
-      <w:r>
-        <w:rPr>
-          <w:color w:val="545454"/>
-          <w:sz w:val="20"/>
-        </w:rPr>
-        <w:t>Окончание срока аренды без учёта продления: {{rental_end_date}} {{rental_end_time}}</w:t>
-      </w:r>
-      <w:r>
-        <w:rPr>
-          <w:color w:val="545454"/>
-          <w:spacing w:val="54"/>
-          <w:sz w:val="20"/>
-        </w:rPr>
-        <w:t xml:space="preserve"/>
-      </w:r>
-      <w:r>
-        <w:rPr>
-          <w:color w:val="545454"/>
-          <w:sz w:val="20"/>
-        </w:rPr>
-        <w:t/>
-      </w:r>
-      <w:r>
-        <w:rPr>
-          <w:color w:val="545454"/>
-          <w:sz w:val="20"/>
-        </w:rPr>
-        <w:t/>
-      </w:r>
-      <w:r>
-        <w:rPr>
-          <w:color w:val="545454"/>
-          <w:sz w:val="20"/>
-        </w:rPr>
-        <w:t xml:space="preserve"/>
-      </w:r>
-      <w:r>
-        <w:rPr>
-          <w:color w:val="545454"/>
-          <w:sz w:val="20"/>
-        </w:rPr>
-        <w:t xml:space="preserve"/>
-      </w:r>
-      <w:r>
-        <w:rPr>
-          <w:i/>
-          <w:color w:val="545454"/>
-          <w:spacing w:val="-5"/>
-          <w:sz w:val="20"/>
-        </w:rPr>
-        <w:t/>
+          <w:lang w:val="en-US"/>
+        </w:rPr>
+      </w:pPr>
+      <w:r>
+        <w:rPr>
+          <w:color w:val="545454"/>
+          <w:sz w:val="20"/>
+        </w:rPr>
+        <w:t>Окончание</w:t>
+      </w:r>
+      <w:r>
+        <w:rPr>
+          <w:color w:val="545454"/>
+          <w:sz w:val="20"/>
+          <w:lang w:val="en-US"/>
+        </w:rPr>
+        <w:t xml:space="preserve"> </w:t>
+      </w:r>
+      <w:r>
+        <w:rPr>
+          <w:color w:val="545454"/>
+          <w:sz w:val="20"/>
+        </w:rPr>
+        <w:t>срока</w:t>
+      </w:r>
+      <w:r>
+        <w:rPr>
+          <w:color w:val="545454"/>
+          <w:sz w:val="20"/>
+          <w:lang w:val="en-US"/>
+        </w:rPr>
+        <w:t xml:space="preserve"> </w:t>
+      </w:r>
+      <w:r>
+        <w:rPr>
+          <w:color w:val="545454"/>
+          <w:sz w:val="20"/>
+        </w:rPr>
+        <w:t>аренды</w:t>
+      </w:r>
+      <w:r>
+        <w:rPr>
+          <w:color w:val="545454"/>
+          <w:sz w:val="20"/>
+          <w:lang w:val="en-US"/>
+        </w:rPr>
+        <w:t xml:space="preserve"> </w:t>
+      </w:r>
+      <w:r>
+        <w:rPr>
+          <w:color w:val="545454"/>
+          <w:sz w:val="20"/>
+        </w:rPr>
+        <w:t>без</w:t>
+      </w:r>
+      <w:r>
+        <w:rPr>
+          <w:color w:val="545454"/>
+          <w:sz w:val="20"/>
+          <w:lang w:val="en-US"/>
+        </w:rPr>
+        <w:t xml:space="preserve"> </w:t>
+      </w:r>
+      <w:r>
+        <w:rPr>
+          <w:color w:val="545454"/>
+          <w:sz w:val="20"/>
+        </w:rPr>
+        <w:t>учёта</w:t>
+      </w:r>
+      <w:r>
+        <w:rPr>
+          <w:color w:val="545454"/>
+          <w:sz w:val="20"/>
+          <w:lang w:val="en-US"/>
+        </w:rPr>
+        <w:t xml:space="preserve"> </w:t>
+      </w:r>
+      <w:r>
+        <w:rPr>
+          <w:color w:val="545454"/>
+          <w:sz w:val="20"/>
+        </w:rPr>
+        <w:t>продления</w:t>
+      </w:r>
+      <w:r>
+        <w:rPr>
+          <w:color w:val="545454"/>
+          <w:sz w:val="20"/>
+          <w:lang w:val="en-US"/>
+        </w:rPr>
+        <w:t>: {{</w:t>
+      </w:r>
+      <w:proofErr w:type="spellStart"/>
+      <w:r>
+        <w:rPr>
+          <w:color w:val="545454"/>
+          <w:sz w:val="20"/>
+          <w:lang w:val="en-US"/>
+        </w:rPr>
+        <w:t>rental_end_date</w:t>
+      </w:r>
+      <w:proofErr w:type="spellEnd"/>
+      <w:r>
+        <w:rPr>
+          <w:color w:val="545454"/>
+          <w:sz w:val="20"/>
+          <w:lang w:val="en-US"/>
+        </w:rPr>
+        <w:t>}} {{</w:t>
+      </w:r>
+      <w:proofErr w:type="spellStart"/>
+      <w:r>
+        <w:rPr>
+          <w:color w:val="545454"/>
+          <w:sz w:val="20"/>
+          <w:lang w:val="en-US"/>
+        </w:rPr>
+        <w:t>rental_end_time</w:t>
+      </w:r>
+      <w:proofErr w:type="spellEnd"/>
+      <w:r>
+        <w:rPr>
+          <w:color w:val="545454"/>
+          <w:sz w:val="20"/>
+          <w:lang w:val="en-US"/>
+        </w:rPr>
+        <w:t>}}</w:t>
       </w:r>
     </w:p>
     <w:p>
@@ -3239,6 +2630,7 @@
         <w:ind w:left="0"/>
         <w:rPr>
           <w:i/>
+          <w:lang w:val="en-US"/>
         </w:rPr>
       </w:pPr>
     </w:p>
@@ -3259,37 +2651,71 @@
         <w:rPr>
           <w:i/>
           <w:sz w:val="20"/>
-        </w:rPr>
-      </w:pPr>
-      <w:r>
-        <w:rPr>
-          <w:color w:val="545454"/>
-          <w:sz w:val="20"/>
-        </w:rPr>
-        <w:t>Срок аренды: {{rental_days}} суток.</w:t>
-      </w:r>
-      <w:r>
-        <w:rPr>
-          <w:color w:val="545454"/>
-          <w:sz w:val="20"/>
-        </w:rPr>
-        <w:t xml:space="preserve"/>
-      </w:r>
-      <w:r>
-        <w:rPr>
-          <w:color w:val="545454"/>
-          <w:sz w:val="20"/>
-        </w:rPr>
-        <w:t/>
-      </w:r>
-      <w:r>
-        <w:rPr>
-          <w:i/>
-          <w:color w:val="545454"/>
-          <w:spacing w:val="-2"/>
-          <w:sz w:val="20"/>
-        </w:rPr>
-        <w:t/>
+          <w:lang w:val="en-US"/>
+        </w:rPr>
+      </w:pPr>
+      <w:r>
+        <w:rPr>
+          <w:color w:val="545454"/>
+          <w:sz w:val="20"/>
+        </w:rPr>
+        <w:t>Срок</w:t>
+      </w:r>
+      <w:r>
+        <w:rPr>
+          <w:color w:val="545454"/>
+          <w:sz w:val="20"/>
+          <w:lang w:val="en-US"/>
+        </w:rPr>
+        <w:t xml:space="preserve"> </w:t>
+      </w:r>
+      <w:r>
+        <w:rPr>
+          <w:color w:val="545454"/>
+          <w:sz w:val="20"/>
+        </w:rPr>
+        <w:t>аренды</w:t>
+      </w:r>
+      <w:r>
+        <w:rPr>
+          <w:color w:val="545454"/>
+          <w:sz w:val="20"/>
+          <w:lang w:val="en-US"/>
+        </w:rPr>
+        <w:t>: {{</w:t>
+      </w:r>
+      <w:proofErr w:type="spellStart"/>
+      <w:r>
+        <w:rPr>
+          <w:color w:val="545454"/>
+          <w:sz w:val="20"/>
+          <w:lang w:val="en-US"/>
+        </w:rPr>
+        <w:t>rental_days</w:t>
+      </w:r>
+      <w:proofErr w:type="spellEnd"/>
+      <w:r>
+        <w:rPr>
+          <w:color w:val="545454"/>
+          <w:sz w:val="20"/>
+          <w:lang w:val="en-US"/>
+        </w:rPr>
+        <w:t xml:space="preserve">}} </w:t>
+      </w:r>
+      <w:r>
+        <w:rPr>
+          <w:color w:val="545454"/>
+          <w:sz w:val="20"/>
+        </w:rPr>
+        <w:t>суток</w:t>
+      </w:r>
+      <w:r>
+        <w:rPr>
+          <w:color w:val="545454"/>
+          <w:sz w:val="20"/>
+          <w:lang w:val="en-US"/>
+        </w:rPr>
+        <w:t>.</w:t>
       </w:r>
     </w:p>
     <w:p>
@@ -3299,6 +2725,7 @@
         <w:ind w:left="0"/>
         <w:rPr>
           <w:i/>
+          <w:lang w:val="en-US"/>
         </w:rPr>
       </w:pPr>
     </w:p>
@@ -3325,14 +2752,7 @@
           <w:color w:val="545454"/>
           <w:sz w:val="20"/>
         </w:rPr>
-        <w:t xml:space="preserve">Тариф: {{daily_price}}</w:t>
-      </w:r>
-      <w:r>
-        <w:rPr>
-          <w:color w:val="545454"/>
-          <w:sz w:val="20"/>
-        </w:rPr>
-        <w:t/>
+        <w:t>Тариф: {{daily_price}}</w:t>
       </w:r>
     </w:p>
     <w:p>
@@ -3406,21 +2826,74 @@
         <w:rPr>
           <w:color w:val="545454"/>
           <w:sz w:val="20"/>
-        </w:rPr>
-      </w:pPr>
-      <w:r>
-        <w:rPr>
-          <w:color w:val="545454"/>
-          <w:sz w:val="20"/>
-        </w:rPr>
-        <w:t xml:space="preserve">Цена договора: {{rent_amount}} ({{rent_amount_words}})</w:t>
-      </w:r>
-      <w:r>
-        <w:rPr>
-          <w:color w:val="545454"/>
-          <w:sz w:val="20"/>
-        </w:rPr>
-        <w:t/>
+          <w:lang w:val="en-US"/>
+        </w:rPr>
+      </w:pPr>
+      <w:r>
+        <w:rPr>
+          <w:color w:val="545454"/>
+          <w:sz w:val="20"/>
+        </w:rPr>
+        <w:t>Цена</w:t>
+      </w:r>
+      <w:r>
+        <w:rPr>
+          <w:color w:val="545454"/>
+          <w:sz w:val="20"/>
+          <w:lang w:val="en-US"/>
+        </w:rPr>
+        <w:t xml:space="preserve"> </w:t>
+      </w:r>
+      <w:r>
+        <w:rPr>
+          <w:color w:val="545454"/>
+          <w:sz w:val="20"/>
+        </w:rPr>
+        <w:t>договора</w:t>
+      </w:r>
+      <w:r>
+        <w:rPr>
+          <w:color w:val="545454"/>
+          <w:sz w:val="20"/>
+          <w:lang w:val="en-US"/>
+        </w:rPr>
+        <w:t>: {{</w:t>
+      </w:r>
+      <w:proofErr w:type="spellStart"/>
+      <w:r>
+        <w:rPr>
+          <w:color w:val="545454"/>
+          <w:sz w:val="20"/>
+          <w:lang w:val="en-US"/>
+        </w:rPr>
+        <w:t>rent_amount</w:t>
+      </w:r>
+      <w:proofErr w:type="spellEnd"/>
+      <w:r>
+        <w:rPr>
+          <w:color w:val="545454"/>
+          <w:sz w:val="20"/>
+          <w:lang w:val="en-US"/>
+        </w:rPr>
+        <w:t>}} ({{</w:t>
+      </w:r>
+      <w:proofErr w:type="spellStart"/>
+      <w:r>
+        <w:rPr>
+          <w:color w:val="545454"/>
+          <w:sz w:val="20"/>
+          <w:lang w:val="en-US"/>
+        </w:rPr>
+        <w:t>rent_amount_words</w:t>
+      </w:r>
+      <w:proofErr w:type="spellEnd"/>
+      <w:r>
+        <w:rPr>
+          <w:color w:val="545454"/>
+          <w:sz w:val="20"/>
+          <w:lang w:val="en-US"/>
+        </w:rPr>
+        <w:t>}})</w:t>
       </w:r>
     </w:p>
     <w:p>
@@ -3428,6 +2901,7 @@
         <w:rPr>
           <w:rFonts w:ascii="Times New Roman" w:hAnsi="Times New Roman"/>
           <w:sz w:val="20"/>
+          <w:lang w:val="en-US"/>
         </w:rPr>
         <w:sectPr>
           <w:type w:val="continuous"/>
@@ -3453,6 +2927,7 @@
         <w:rPr>
           <w:color w:val="545454"/>
           <w:sz w:val="20"/>
+          <w:lang w:val="en-US"/>
         </w:rPr>
       </w:pPr>
       <w:r>
@@ -3461,67 +2936,96 @@
           <w:sz w:val="20"/>
         </w:rPr>
         <w:lastRenderedPageBreak/>
-        <w:t>Сумма залога за ТС: {{deposit_amount}} ({{deposit_amount_words}})</w:t>
-      </w:r>
-      <w:r>
-        <w:rPr>
-          <w:color w:val="545454"/>
-          <w:spacing w:val="-1"/>
-          <w:sz w:val="20"/>
-        </w:rPr>
-        <w:t xml:space="preserve"/>
-      </w:r>
-      <w:r>
-        <w:rPr>
-          <w:color w:val="545454"/>
-          <w:sz w:val="20"/>
-        </w:rPr>
-        <w:t/>
-      </w:r>
-      <w:r>
-        <w:rPr>
-          <w:color w:val="545454"/>
-          <w:spacing w:val="-1"/>
-          <w:sz w:val="20"/>
-        </w:rPr>
-        <w:t xml:space="preserve"/>
-      </w:r>
-      <w:r>
-        <w:rPr>
-          <w:color w:val="545454"/>
-          <w:sz w:val="20"/>
-        </w:rPr>
-        <w:t/>
-      </w:r>
-      <w:r>
-        <w:rPr>
-          <w:color w:val="545454"/>
-          <w:spacing w:val="-1"/>
-          <w:sz w:val="20"/>
-        </w:rPr>
-        <w:t xml:space="preserve"/>
-      </w:r>
-      <w:r>
-        <w:rPr>
-          <w:color w:val="545454"/>
-          <w:sz w:val="20"/>
-        </w:rPr>
-        <w:t/>
-      </w:r>
-      <w:r>
-        <w:rPr>
-          <w:color w:val="545454"/>
-          <w:spacing w:val="-1"/>
-          <w:sz w:val="20"/>
-        </w:rPr>
-        <w:t xml:space="preserve"/>
-      </w:r>
-      <w:r>
-        <w:rPr>
-          <w:color w:val="545454"/>
-          <w:sz w:val="20"/>
-        </w:rPr>
-        <w:t/>
+        <w:t>Сумма</w:t>
+      </w:r>
+      <w:r>
+        <w:rPr>
+          <w:color w:val="545454"/>
+          <w:sz w:val="20"/>
+          <w:lang w:val="en-US"/>
+        </w:rPr>
+        <w:t xml:space="preserve"> </w:t>
+      </w:r>
+      <w:r>
+        <w:rPr>
+          <w:color w:val="545454"/>
+          <w:sz w:val="20"/>
+        </w:rPr>
+        <w:t>залога</w:t>
+      </w:r>
+      <w:r>
+        <w:rPr>
+          <w:color w:val="545454"/>
+          <w:sz w:val="20"/>
+          <w:lang w:val="en-US"/>
+        </w:rPr>
+        <w:t xml:space="preserve"> </w:t>
+      </w:r>
+      <w:r>
+        <w:rPr>
+          <w:color w:val="545454"/>
+          <w:sz w:val="20"/>
+        </w:rPr>
+        <w:t>за</w:t>
+      </w:r>
+      <w:r>
+        <w:rPr>
+          <w:color w:val="545454"/>
+          <w:sz w:val="20"/>
+          <w:lang w:val="en-US"/>
+        </w:rPr>
+        <w:t xml:space="preserve"> </w:t>
+      </w:r>
+      <w:r>
+        <w:rPr>
+          <w:color w:val="545454"/>
+          <w:sz w:val="20"/>
+        </w:rPr>
+        <w:t>ТС</w:t>
+      </w:r>
+      <w:r>
+        <w:rPr>
+          <w:color w:val="545454"/>
+          <w:sz w:val="20"/>
+          <w:lang w:val="en-US"/>
+        </w:rPr>
+        <w:t>: {{</w:t>
+      </w:r>
+      <w:proofErr w:type="spellStart"/>
+      <w:r>
+        <w:rPr>
+          <w:color w:val="545454"/>
+          <w:sz w:val="20"/>
+          <w:lang w:val="en-US"/>
+        </w:rPr>
+        <w:t>deposit_amount</w:t>
+      </w:r>
+      <w:proofErr w:type="spellEnd"/>
+      <w:r>
+        <w:rPr>
+          <w:color w:val="545454"/>
+          <w:sz w:val="20"/>
+          <w:lang w:val="en-US"/>
+        </w:rPr>
+        <w:t>}} ({{</w:t>
+      </w:r>
+      <w:proofErr w:type="spellStart"/>
+      <w:r>
+        <w:rPr>
+          <w:color w:val="545454"/>
+          <w:sz w:val="20"/>
+          <w:lang w:val="en-US"/>
+        </w:rPr>
+        <w:t>deposit_amount_words</w:t>
+      </w:r>
+      <w:proofErr w:type="spellEnd"/>
+      <w:r>
+        <w:rPr>
+          <w:color w:val="545454"/>
+          <w:sz w:val="20"/>
+          <w:lang w:val="en-US"/>
+        </w:rPr>
+        <w:t>}})</w:t>
       </w:r>
     </w:p>
     <w:p>
@@ -3532,6 +3036,7 @@
         <w:rPr>
           <w:rFonts w:ascii="Times New Roman"/>
           <w:sz w:val="12"/>
+          <w:lang w:val="en-US"/>
         </w:rPr>
       </w:pPr>
     </w:p>
@@ -9524,49 +9029,7 @@
           <w:color w:val="545454"/>
           <w:szCs w:val="22"/>
         </w:rPr>
-        <w:t xml:space="preserve">4.7.1. Арендатору устанавливается лимит пробега Автомобиля за весь срок аренды: {{allowed_mileage}}.</w:t>
-      </w:r>
-      <w:r>
-        <w:rPr>
-          <w:color w:val="545454"/>
-          <w:szCs w:val="22"/>
-        </w:rPr>
-        <w:t xml:space="preserve"/>
-      </w:r>
-      <w:r>
-        <w:rPr>
-          <w:color w:val="545454"/>
-          <w:szCs w:val="22"/>
-        </w:rPr>
-        <w:t/>
-      </w:r>
-      <w:r>
-        <w:rPr>
-          <w:color w:val="545454"/>
-          <w:szCs w:val="22"/>
-        </w:rPr>
-        <w:t xml:space="preserve"/>
-      </w:r>
-      <w:r>
-        <w:rPr>
-          <w:color w:val="545454"/>
-          <w:szCs w:val="22"/>
-        </w:rPr>
-        <w:t/>
-      </w:r>
-      <w:r>
-        <w:rPr>
-          <w:color w:val="545454"/>
-          <w:szCs w:val="22"/>
-        </w:rPr>
-        <w:t/>
-      </w:r>
-      <w:r>
-        <w:rPr>
-          <w:color w:val="545454"/>
-          <w:szCs w:val="22"/>
-        </w:rPr>
-        <w:t/>
+        <w:t>4.7.1. Арендатору устанавливается лимит пробега Автомобиля за весь срок аренды: {{allowed_mileage}}.</w:t>
       </w:r>
     </w:p>
     <w:p>
@@ -10324,7 +9787,14 @@
           <w:color w:val="545454"/>
           <w:sz w:val="20"/>
         </w:rPr>
-        <w:t xml:space="preserve">независимой оценкой, заказ-нарядом </w:t>
+        <w:t>независимой оценкой, заказ-нарядом СТО либо фактическими расходами на ремонт</w:t>
+      </w:r>
+      <w:r>
+        <w:rPr>
+          <w:color w:val="545454"/>
+          <w:sz w:val="20"/>
+        </w:rPr>
+        <w:t xml:space="preserve">. По соглашению сторон арендуемый автомобиль оценен в 1 </w:t>
       </w:r>
       <w:r>
         <w:rPr>
@@ -10332,14 +9802,7 @@
           <w:sz w:val="20"/>
         </w:rPr>
         <w:lastRenderedPageBreak/>
-        <w:t>СТО либо фактическими расходами на ремонт</w:t>
-      </w:r>
-      <w:r>
-        <w:rPr>
-          <w:color w:val="545454"/>
-          <w:sz w:val="20"/>
-        </w:rPr>
-        <w:t>. По соглашению сторон арендуемый автомобиль оценен в 1 400 000 (один миллион четыреста тысяч) рублей. Данная оценка учитывается при возмещении ущерба.</w:t>
+        <w:t>400 000 (один миллион четыреста тысяч) рублей. Данная оценка учитывается при возмещении ущерба.</w:t>
       </w:r>
     </w:p>
     <w:p>
@@ -21677,9 +21140,9 @@
         <w:tblLook w:val="04A0" w:firstRow="1" w:lastRow="0" w:firstColumn="1" w:lastColumn="0" w:noHBand="0" w:noVBand="1"/>
       </w:tblPr>
       <w:tblGrid>
-        <w:gridCol w:w="4968"/>
-        <w:gridCol w:w="555"/>
-        <w:gridCol w:w="4917"/>
+        <w:gridCol w:w="4974"/>
+        <w:gridCol w:w="545"/>
+        <w:gridCol w:w="4921"/>
       </w:tblGrid>
       <w:tr>
         <w:tc>
@@ -21715,19 +21178,13 @@
               </w:rPr>
               <w:t>ИНН: {{owner_inn}}</w:t>
             </w:r>
-            <w:r>
-              <w:rPr>
-                <w:color w:val="545454"/>
-                <w:sz w:val="20"/>
-              </w:rPr>
-              <w:t/>
-            </w:r>
           </w:p>
           <w:p>
             <w:pPr>
               <w:rPr>
                 <w:color w:val="545454"/>
                 <w:sz w:val="20"/>
+                <w:lang w:val="en-US"/>
               </w:rPr>
             </w:pPr>
             <w:r>
@@ -21735,75 +21192,66 @@
                 <w:color w:val="545454"/>
                 <w:sz w:val="20"/>
               </w:rPr>
-              <w:t xml:space="preserve">Паспорт {{owner_passport}}, выдан {{owner_passport_issued_by}}</w:t>
+              <w:t>Паспорт</w:t>
+            </w:r>
+            <w:r>
+              <w:rPr>
+                <w:color w:val="545454"/>
+                <w:sz w:val="20"/>
+                <w:lang w:val="en-US"/>
+              </w:rPr>
+              <w:t xml:space="preserve"> {{</w:t>
             </w:r>
             <w:proofErr w:type="spellStart"/>
             <w:r>
               <w:rPr>
                 <w:color w:val="545454"/>
                 <w:sz w:val="20"/>
+                <w:lang w:val="en-US"/>
               </w:rPr>
-              <w:t/>
+              <w:t>owner_passport</w:t>
             </w:r>
             <w:proofErr w:type="spellEnd"/>
             <w:r>
               <w:rPr>
                 <w:color w:val="545454"/>
                 <w:sz w:val="20"/>
+                <w:lang w:val="en-US"/>
               </w:rPr>
-              <w:t xml:space="preserve"/>
-            </w:r>
-          </w:p>
-          <w:p>
-            <w:pPr>
-              <w:rPr>
-                <w:color w:val="545454"/>
-                <w:sz w:val="20"/>
-              </w:rPr>
-            </w:pPr>
-            <w:r>
-              <w:rPr>
-                <w:color w:val="545454"/>
-                <w:sz w:val="20"/>
-              </w:rPr>
-              <w:t>Дата выдачи: {{owner_passport_issued_date}}</w:t>
-            </w:r>
-          </w:p>
-          <w:p>
-            <w:pPr>
-              <w:rPr>
-                <w:color w:val="545454"/>
-                <w:sz w:val="20"/>
-              </w:rPr>
-            </w:pPr>
-            <w:r>
-              <w:rPr>
-                <w:color w:val="545454"/>
-                <w:sz w:val="20"/>
-              </w:rPr>
-              <w:t>Код подразделения: {{owner_passport_department_code}}</w:t>
-            </w:r>
-          </w:p>
-          <w:p>
-            <w:pPr>
-              <w:rPr>
-                <w:color w:val="545454"/>
-                <w:sz w:val="20"/>
-              </w:rPr>
-            </w:pPr>
-            <w:r>
-              <w:rPr>
-                <w:color w:val="545454"/>
-                <w:sz w:val="20"/>
-              </w:rPr>
-              <w:t xml:space="preserve">Адрес регистрации: {{owner_registration_address}}</w:t>
+              <w:t xml:space="preserve">}}, </w:t>
             </w:r>
             <w:r>
               <w:rPr>
                 <w:color w:val="545454"/>
                 <w:sz w:val="20"/>
               </w:rPr>
-              <w:t/>
+              <w:t>выдан</w:t>
+            </w:r>
+            <w:r>
+              <w:rPr>
+                <w:color w:val="545454"/>
+                <w:sz w:val="20"/>
+                <w:lang w:val="en-US"/>
+              </w:rPr>
+              <w:t xml:space="preserve"> {{</w:t>
+            </w:r>
+            <w:proofErr w:type="spellStart"/>
+            <w:r>
+              <w:rPr>
+                <w:color w:val="545454"/>
+                <w:sz w:val="20"/>
+                <w:lang w:val="en-US"/>
+              </w:rPr>
+              <w:t>owner_passport_issued_by</w:t>
+            </w:r>
+            <w:proofErr w:type="spellEnd"/>
+            <w:r>
+              <w:rPr>
+                <w:color w:val="545454"/>
+                <w:sz w:val="20"/>
+                <w:lang w:val="en-US"/>
+              </w:rPr>
+              <w:t>}}</w:t>
             </w:r>
           </w:p>
           <w:p>
@@ -21819,7 +21267,7 @@
                 <w:color w:val="545454"/>
                 <w:sz w:val="20"/>
               </w:rPr>
-              <w:t>Тел.: {{owner_phone}}; Email: {{owner_email}}</w:t>
+              <w:t>Дата</w:t>
             </w:r>
             <w:r>
               <w:rPr>
@@ -21827,7 +21275,214 @@
                 <w:sz w:val="20"/>
                 <w:lang w:val="en-US"/>
               </w:rPr>
-              <w:t/>
+              <w:t xml:space="preserve"> </w:t>
+            </w:r>
+            <w:r>
+              <w:rPr>
+                <w:color w:val="545454"/>
+                <w:sz w:val="20"/>
+              </w:rPr>
+              <w:t>выдачи</w:t>
+            </w:r>
+            <w:r>
+              <w:rPr>
+                <w:color w:val="545454"/>
+                <w:sz w:val="20"/>
+                <w:lang w:val="en-US"/>
+              </w:rPr>
+              <w:t>: {{</w:t>
+            </w:r>
+            <w:proofErr w:type="spellStart"/>
+            <w:r>
+              <w:rPr>
+                <w:color w:val="545454"/>
+                <w:sz w:val="20"/>
+                <w:lang w:val="en-US"/>
+              </w:rPr>
+              <w:t>owner_passport_issued_date</w:t>
+            </w:r>
+            <w:proofErr w:type="spellEnd"/>
+            <w:r>
+              <w:rPr>
+                <w:color w:val="545454"/>
+                <w:sz w:val="20"/>
+                <w:lang w:val="en-US"/>
+              </w:rPr>
+              <w:t>}}</w:t>
+            </w:r>
+          </w:p>
+          <w:p>
+            <w:pPr>
+              <w:rPr>
+                <w:color w:val="545454"/>
+                <w:sz w:val="20"/>
+                <w:lang w:val="en-US"/>
+              </w:rPr>
+            </w:pPr>
+            <w:r>
+              <w:rPr>
+                <w:color w:val="545454"/>
+                <w:sz w:val="20"/>
+              </w:rPr>
+              <w:t>Код</w:t>
+            </w:r>
+            <w:r>
+              <w:rPr>
+                <w:color w:val="545454"/>
+                <w:sz w:val="20"/>
+                <w:lang w:val="en-US"/>
+              </w:rPr>
+              <w:t xml:space="preserve"> </w:t>
+            </w:r>
+            <w:r>
+              <w:rPr>
+                <w:color w:val="545454"/>
+                <w:sz w:val="20"/>
+              </w:rPr>
+              <w:t>подразделения</w:t>
+            </w:r>
+            <w:r>
+              <w:rPr>
+                <w:color w:val="545454"/>
+                <w:sz w:val="20"/>
+                <w:lang w:val="en-US"/>
+              </w:rPr>
+              <w:t>: {{</w:t>
+            </w:r>
+            <w:proofErr w:type="spellStart"/>
+            <w:r>
+              <w:rPr>
+                <w:color w:val="545454"/>
+                <w:sz w:val="20"/>
+                <w:lang w:val="en-US"/>
+              </w:rPr>
+              <w:t>owner_passport_department_code</w:t>
+            </w:r>
+            <w:proofErr w:type="spellEnd"/>
+            <w:r>
+              <w:rPr>
+                <w:color w:val="545454"/>
+                <w:sz w:val="20"/>
+                <w:lang w:val="en-US"/>
+              </w:rPr>
+              <w:t>}}</w:t>
+            </w:r>
+          </w:p>
+          <w:p>
+            <w:pPr>
+              <w:rPr>
+                <w:color w:val="545454"/>
+                <w:sz w:val="20"/>
+                <w:lang w:val="en-US"/>
+              </w:rPr>
+            </w:pPr>
+            <w:r>
+              <w:rPr>
+                <w:color w:val="545454"/>
+                <w:sz w:val="20"/>
+              </w:rPr>
+              <w:t>Адрес</w:t>
+            </w:r>
+            <w:r>
+              <w:rPr>
+                <w:color w:val="545454"/>
+                <w:sz w:val="20"/>
+                <w:lang w:val="en-US"/>
+              </w:rPr>
+              <w:t xml:space="preserve"> </w:t>
+            </w:r>
+            <w:r>
+              <w:rPr>
+                <w:color w:val="545454"/>
+                <w:sz w:val="20"/>
+              </w:rPr>
+              <w:t>регистрации</w:t>
+            </w:r>
+            <w:r>
+              <w:rPr>
+                <w:color w:val="545454"/>
+                <w:sz w:val="20"/>
+                <w:lang w:val="en-US"/>
+              </w:rPr>
+              <w:t>: {{</w:t>
+            </w:r>
+            <w:proofErr w:type="spellStart"/>
+            <w:r>
+              <w:rPr>
+                <w:color w:val="545454"/>
+                <w:sz w:val="20"/>
+                <w:lang w:val="en-US"/>
+              </w:rPr>
+              <w:t>owner_registration_address</w:t>
+            </w:r>
+            <w:proofErr w:type="spellEnd"/>
+            <w:r>
+              <w:rPr>
+                <w:color w:val="545454"/>
+                <w:sz w:val="20"/>
+                <w:lang w:val="en-US"/>
+              </w:rPr>
+              <w:t>}}</w:t>
+            </w:r>
+          </w:p>
+          <w:p>
+            <w:pPr>
+              <w:rPr>
+                <w:color w:val="545454"/>
+                <w:sz w:val="20"/>
+                <w:lang w:val="en-US"/>
+              </w:rPr>
+            </w:pPr>
+            <w:r>
+              <w:rPr>
+                <w:color w:val="545454"/>
+                <w:sz w:val="20"/>
+              </w:rPr>
+              <w:t>Тел</w:t>
+            </w:r>
+            <w:r>
+              <w:rPr>
+                <w:color w:val="545454"/>
+                <w:sz w:val="20"/>
+                <w:lang w:val="en-US"/>
+              </w:rPr>
+              <w:t>.: {{</w:t>
+            </w:r>
+            <w:proofErr w:type="spellStart"/>
+            <w:r>
+              <w:rPr>
+                <w:color w:val="545454"/>
+                <w:sz w:val="20"/>
+                <w:lang w:val="en-US"/>
+              </w:rPr>
+              <w:t>owner_phone</w:t>
+            </w:r>
+            <w:proofErr w:type="spellEnd"/>
+            <w:r>
+              <w:rPr>
+                <w:color w:val="545454"/>
+                <w:sz w:val="20"/>
+                <w:lang w:val="en-US"/>
+              </w:rPr>
+              <w:t>}}; Email: {{</w:t>
+            </w:r>
+            <w:proofErr w:type="spellStart"/>
+            <w:r>
+              <w:rPr>
+                <w:color w:val="545454"/>
+                <w:sz w:val="20"/>
+                <w:lang w:val="en-US"/>
+              </w:rPr>
+              <w:t>owner_email</w:t>
+            </w:r>
+            <w:proofErr w:type="spellEnd"/>
+            <w:r>
+              <w:rPr>
+                <w:color w:val="545454"/>
+                <w:sz w:val="20"/>
+                <w:lang w:val="en-US"/>
+              </w:rPr>
+              <w:t>}}</w:t>
             </w:r>
           </w:p>
           <w:p>
@@ -21901,14 +21556,6 @@
                 <w:lang w:val="en-US"/>
               </w:rPr>
             </w:pPr>
-            <w:r>
-              <w:rPr>
-                <w:color w:val="545454"/>
-                <w:sz w:val="20"/>
-                <w:lang w:val="en-US"/>
-              </w:rPr>
-              <w:t>________________ / ________________</w:t>
-            </w:r>
           </w:p>
         </w:tc>
         <w:tc>
@@ -21934,6 +21581,42 @@
               <w:rPr>
                 <w:color w:val="545454"/>
                 <w:sz w:val="20"/>
+                <w:lang w:val="en-US"/>
+              </w:rPr>
+            </w:pPr>
+            <w:r>
+              <w:rPr>
+                <w:color w:val="545454"/>
+                <w:sz w:val="20"/>
+                <w:lang w:val="en-US"/>
+              </w:rPr>
+              <w:t>{{</w:t>
+            </w:r>
+            <w:proofErr w:type="spellStart"/>
+            <w:r>
+              <w:rPr>
+                <w:color w:val="545454"/>
+                <w:sz w:val="20"/>
+                <w:lang w:val="en-US"/>
+              </w:rPr>
+              <w:t>client_full_name</w:t>
+            </w:r>
+            <w:proofErr w:type="spellEnd"/>
+            <w:r>
+              <w:rPr>
+                <w:color w:val="545454"/>
+                <w:sz w:val="20"/>
+                <w:lang w:val="en-US"/>
+              </w:rPr>
+              <w:t>}}</w:t>
+            </w:r>
+          </w:p>
+          <w:p>
+            <w:pPr>
+              <w:rPr>
+                <w:color w:val="545454"/>
+                <w:sz w:val="20"/>
+                <w:lang w:val="en-US"/>
               </w:rPr>
             </w:pPr>
             <w:r>
@@ -21941,7 +21624,33 @@
                 <w:color w:val="545454"/>
                 <w:sz w:val="20"/>
               </w:rPr>
-              <w:t>{{client_full_name}}</w:t>
+              <w:t>ИНН</w:t>
+            </w:r>
+            <w:r>
+              <w:rPr>
+                <w:color w:val="545454"/>
+                <w:sz w:val="20"/>
+                <w:lang w:val="en-US"/>
+              </w:rPr>
+              <w:t>: {{</w:t>
+            </w:r>
+            <w:proofErr w:type="spellStart"/>
+            <w:r>
+              <w:rPr>
+                <w:color w:val="545454"/>
+                <w:sz w:val="20"/>
+                <w:lang w:val="en-US"/>
+              </w:rPr>
+              <w:t>client_inn</w:t>
+            </w:r>
+            <w:proofErr w:type="spellEnd"/>
+            <w:r>
+              <w:rPr>
+                <w:color w:val="545454"/>
+                <w:sz w:val="20"/>
+                <w:lang w:val="en-US"/>
+              </w:rPr>
+              <w:t>}}</w:t>
             </w:r>
           </w:p>
           <w:p>
@@ -21949,6 +21658,7 @@
               <w:rPr>
                 <w:color w:val="545454"/>
                 <w:sz w:val="20"/>
+                <w:lang w:val="en-US"/>
               </w:rPr>
             </w:pPr>
             <w:r>
@@ -21956,14 +21666,66 @@
                 <w:color w:val="545454"/>
                 <w:sz w:val="20"/>
               </w:rPr>
-              <w:t xml:space="preserve">ИНН: {{client_inn}}</w:t>
+              <w:t>Паспорт</w:t>
+            </w:r>
+            <w:r>
+              <w:rPr>
+                <w:color w:val="545454"/>
+                <w:sz w:val="20"/>
+                <w:lang w:val="en-US"/>
+              </w:rPr>
+              <w:t xml:space="preserve"> {{</w:t>
+            </w:r>
+            <w:proofErr w:type="spellStart"/>
+            <w:r>
+              <w:rPr>
+                <w:color w:val="545454"/>
+                <w:sz w:val="20"/>
+                <w:lang w:val="en-US"/>
+              </w:rPr>
+              <w:t>client_passport</w:t>
+            </w:r>
+            <w:proofErr w:type="spellEnd"/>
+            <w:r>
+              <w:rPr>
+                <w:color w:val="545454"/>
+                <w:sz w:val="20"/>
+                <w:lang w:val="en-US"/>
+              </w:rPr>
+              <w:t xml:space="preserve">}}, </w:t>
             </w:r>
             <w:r>
               <w:rPr>
                 <w:color w:val="545454"/>
                 <w:sz w:val="20"/>
               </w:rPr>
-              <w:t/>
+              <w:t>выдан</w:t>
+            </w:r>
+            <w:r>
+              <w:rPr>
+                <w:color w:val="545454"/>
+                <w:sz w:val="20"/>
+                <w:lang w:val="en-US"/>
+              </w:rPr>
+              <w:t xml:space="preserve"> {{</w:t>
+            </w:r>
+            <w:proofErr w:type="spellStart"/>
+            <w:r>
+              <w:rPr>
+                <w:color w:val="545454"/>
+                <w:sz w:val="20"/>
+                <w:lang w:val="en-US"/>
+              </w:rPr>
+              <w:t>client_passport_issued_by</w:t>
+            </w:r>
+            <w:proofErr w:type="spellEnd"/>
+            <w:r>
+              <w:rPr>
+                <w:color w:val="545454"/>
+                <w:sz w:val="20"/>
+                <w:lang w:val="en-US"/>
+              </w:rPr>
+              <w:t>}}</w:t>
             </w:r>
           </w:p>
           <w:p>
@@ -21971,6 +21733,7 @@
               <w:rPr>
                 <w:color w:val="545454"/>
                 <w:sz w:val="20"/>
+                <w:lang w:val="en-US"/>
               </w:rPr>
             </w:pPr>
             <w:r>
@@ -21978,14 +21741,48 @@
                 <w:color w:val="545454"/>
                 <w:sz w:val="20"/>
               </w:rPr>
-              <w:t xml:space="preserve">Паспорт {{client_passport}}, выдан {{client_passport_issued_by}}</w:t>
+              <w:t>Дата</w:t>
+            </w:r>
+            <w:r>
+              <w:rPr>
+                <w:color w:val="545454"/>
+                <w:sz w:val="20"/>
+                <w:lang w:val="en-US"/>
+              </w:rPr>
+              <w:t xml:space="preserve"> </w:t>
             </w:r>
             <w:r>
               <w:rPr>
                 <w:color w:val="545454"/>
                 <w:sz w:val="20"/>
               </w:rPr>
-              <w:t/>
+              <w:t>выдачи</w:t>
+            </w:r>
+            <w:r>
+              <w:rPr>
+                <w:color w:val="545454"/>
+                <w:sz w:val="20"/>
+                <w:lang w:val="en-US"/>
+              </w:rPr>
+              <w:t>: {{</w:t>
+            </w:r>
+            <w:proofErr w:type="spellStart"/>
+            <w:r>
+              <w:rPr>
+                <w:color w:val="545454"/>
+                <w:sz w:val="20"/>
+                <w:lang w:val="en-US"/>
+              </w:rPr>
+              <w:t>client_passport_issued_date</w:t>
+            </w:r>
+            <w:proofErr w:type="spellEnd"/>
+            <w:r>
+              <w:rPr>
+                <w:color w:val="545454"/>
+                <w:sz w:val="20"/>
+                <w:lang w:val="en-US"/>
+              </w:rPr>
+              <w:t>}}</w:t>
             </w:r>
           </w:p>
           <w:p>
@@ -21993,6 +21790,7 @@
               <w:rPr>
                 <w:color w:val="545454"/>
                 <w:sz w:val="20"/>
+                <w:lang w:val="en-US"/>
               </w:rPr>
             </w:pPr>
             <w:r>
@@ -22000,7 +21798,48 @@
                 <w:color w:val="545454"/>
                 <w:sz w:val="20"/>
               </w:rPr>
-              <w:t>Дата выдачи: {{client_passport_issued_date}}</w:t>
+              <w:t>Код</w:t>
+            </w:r>
+            <w:r>
+              <w:rPr>
+                <w:color w:val="545454"/>
+                <w:sz w:val="20"/>
+                <w:lang w:val="en-US"/>
+              </w:rPr>
+              <w:t xml:space="preserve"> </w:t>
+            </w:r>
+            <w:r>
+              <w:rPr>
+                <w:color w:val="545454"/>
+                <w:sz w:val="20"/>
+              </w:rPr>
+              <w:t>подразделения</w:t>
+            </w:r>
+            <w:r>
+              <w:rPr>
+                <w:color w:val="545454"/>
+                <w:sz w:val="20"/>
+                <w:lang w:val="en-US"/>
+              </w:rPr>
+              <w:t>: {{</w:t>
+            </w:r>
+            <w:proofErr w:type="spellStart"/>
+            <w:r>
+              <w:rPr>
+                <w:color w:val="545454"/>
+                <w:sz w:val="20"/>
+                <w:lang w:val="en-US"/>
+              </w:rPr>
+              <w:t>client_passport_department_code</w:t>
+            </w:r>
+            <w:proofErr w:type="spellEnd"/>
+            <w:r>
+              <w:rPr>
+                <w:color w:val="545454"/>
+                <w:sz w:val="20"/>
+                <w:lang w:val="en-US"/>
+              </w:rPr>
+              <w:t>}}</w:t>
             </w:r>
           </w:p>
           <w:p>
@@ -22008,6 +21847,7 @@
               <w:rPr>
                 <w:color w:val="545454"/>
                 <w:sz w:val="20"/>
+                <w:lang w:val="en-US"/>
               </w:rPr>
             </w:pPr>
             <w:r>
@@ -22015,7 +21855,48 @@
                 <w:color w:val="545454"/>
                 <w:sz w:val="20"/>
               </w:rPr>
-              <w:t>Код подразделения: {{client_passport_department_code}}</w:t>
+              <w:t>Адрес</w:t>
+            </w:r>
+            <w:r>
+              <w:rPr>
+                <w:color w:val="545454"/>
+                <w:sz w:val="20"/>
+                <w:lang w:val="en-US"/>
+              </w:rPr>
+              <w:t xml:space="preserve"> </w:t>
+            </w:r>
+            <w:r>
+              <w:rPr>
+                <w:color w:val="545454"/>
+                <w:sz w:val="20"/>
+              </w:rPr>
+              <w:t>регистрации</w:t>
+            </w:r>
+            <w:r>
+              <w:rPr>
+                <w:color w:val="545454"/>
+                <w:sz w:val="20"/>
+                <w:lang w:val="en-US"/>
+              </w:rPr>
+              <w:t>: {{</w:t>
+            </w:r>
+            <w:proofErr w:type="spellStart"/>
+            <w:r>
+              <w:rPr>
+                <w:color w:val="545454"/>
+                <w:sz w:val="20"/>
+                <w:lang w:val="en-US"/>
+              </w:rPr>
+              <w:t>client_registration_address</w:t>
+            </w:r>
+            <w:proofErr w:type="spellEnd"/>
+            <w:r>
+              <w:rPr>
+                <w:color w:val="545454"/>
+                <w:sz w:val="20"/>
+                <w:lang w:val="en-US"/>
+              </w:rPr>
+              <w:t>}}</w:t>
             </w:r>
           </w:p>
           <w:p>
@@ -22023,6 +21904,7 @@
               <w:rPr>
                 <w:color w:val="545454"/>
                 <w:sz w:val="20"/>
+                <w:lang w:val="en-US"/>
               </w:rPr>
             </w:pPr>
             <w:r>
@@ -22030,50 +21912,23 @@
                 <w:color w:val="545454"/>
                 <w:sz w:val="20"/>
               </w:rPr>
-              <w:t>Адрес регистрации: {{client_registration_address}}</w:t>
+              <w:t>Тел.: {{</w:t>
             </w:r>
+            <w:proofErr w:type="spellStart"/>
             <w:r>
               <w:rPr>
                 <w:color w:val="545454"/>
                 <w:sz w:val="20"/>
               </w:rPr>
-              <w:t xml:space="preserve"/>
+              <w:t>client_phone</w:t>
             </w:r>
+            <w:proofErr w:type="spellEnd"/>
             <w:r>
               <w:rPr>
                 <w:color w:val="545454"/>
                 <w:sz w:val="20"/>
               </w:rPr>
-              <w:t xml:space="preserve"/>
-            </w:r>
-            <w:r>
-              <w:rPr>
-                <w:color w:val="545454"/>
-                <w:sz w:val="20"/>
-              </w:rPr>
-              <w:t/>
-            </w:r>
-          </w:p>
-          <w:p>
-            <w:pPr>
-              <w:rPr>
-                <w:color w:val="545454"/>
-                <w:sz w:val="20"/>
-              </w:rPr>
-            </w:pPr>
-            <w:r>
-              <w:rPr>
-                <w:color w:val="545454"/>
-                <w:sz w:val="20"/>
-              </w:rPr>
-              <w:t xml:space="preserve">Тел.: {{client_phone}}; Email: {{client_email}}; ВУ: {{client_driver_license_number}}, выдано {{client_driver_license_issued_date}}, действует до {{client_driver_license_expiry_date}}, категории {{client_driver_license_categories}}, страна выдачи {{client_driver_license_country}}</w:t>
-            </w:r>
-            <w:r>
-              <w:rPr>
-                <w:color w:val="545454"/>
-                <w:sz w:val="20"/>
-              </w:rPr>
-              <w:t/>
+              <w:t>}}</w:t>
             </w:r>
           </w:p>
           <w:p>
@@ -22124,11 +21979,84 @@
               </w:rPr>
             </w:pPr>
           </w:p>
+        </w:tc>
+      </w:tr>
+      <w:tr>
+        <w:tc>
+          <w:tcPr>
+            <w:tcW w:w="5070" w:type="dxa"/>
+          </w:tcPr>
           <w:p>
             <w:pPr>
               <w:rPr>
                 <w:color w:val="545454"/>
                 <w:sz w:val="20"/>
+                <w:lang w:val="en-US"/>
+              </w:rPr>
+            </w:pPr>
+            <w:r>
+              <w:rPr>
+                <w:color w:val="545454"/>
+                <w:sz w:val="20"/>
+                <w:lang w:val="en-US"/>
+              </w:rPr>
+              <w:t xml:space="preserve">________________ / </w:t>
+            </w:r>
+            <w:r>
+              <w:rPr>
+                <w:color w:val="545454"/>
+                <w:sz w:val="20"/>
+                <w:u w:val="single"/>
+                <w:lang w:val="en-US"/>
+              </w:rPr>
+              <w:t>{{</w:t>
+            </w:r>
+            <w:proofErr w:type="spellStart"/>
+            <w:r>
+              <w:rPr>
+                <w:color w:val="545454"/>
+                <w:sz w:val="20"/>
+                <w:u w:val="single"/>
+                <w:lang w:val="en-US"/>
+              </w:rPr>
+              <w:t>owner_signature_name</w:t>
+            </w:r>
+            <w:proofErr w:type="spellEnd"/>
+            <w:r>
+              <w:rPr>
+                <w:color w:val="545454"/>
+                <w:sz w:val="20"/>
+                <w:u w:val="single"/>
+                <w:lang w:val="en-US"/>
+              </w:rPr>
+              <w:t>}}</w:t>
+            </w:r>
+          </w:p>
+        </w:tc>
+        <w:tc>
+          <w:tcPr>
+            <w:tcW w:w="567" w:type="dxa"/>
+          </w:tcPr>
+          <w:p>
+            <w:pPr>
+              <w:rPr>
+                <w:color w:val="545454"/>
+                <w:sz w:val="20"/>
+                <w:lang w:val="en-US"/>
+              </w:rPr>
+            </w:pPr>
+          </w:p>
+        </w:tc>
+        <w:tc>
+          <w:tcPr>
+            <w:tcW w:w="5019" w:type="dxa"/>
+          </w:tcPr>
+          <w:p>
+            <w:pPr>
+              <w:rPr>
+                <w:color w:val="545454"/>
+                <w:sz w:val="20"/>
+                <w:lang w:val="en-US"/>
               </w:rPr>
             </w:pPr>
             <w:r>
@@ -22136,7 +22064,33 @@
                 <w:color w:val="545454"/>
                 <w:sz w:val="20"/>
               </w:rPr>
-              <w:t>________________ / ________________</w:t>
+              <w:t xml:space="preserve">________________ / </w:t>
+            </w:r>
+            <w:r>
+              <w:rPr>
+                <w:color w:val="545454"/>
+                <w:sz w:val="20"/>
+                <w:u w:val="single"/>
+              </w:rPr>
+              <w:t>{{</w:t>
+            </w:r>
+            <w:proofErr w:type="spellStart"/>
+            <w:r>
+              <w:rPr>
+                <w:color w:val="545454"/>
+                <w:sz w:val="20"/>
+                <w:u w:val="single"/>
+              </w:rPr>
+              <w:t>client_signature_name</w:t>
+            </w:r>
+            <w:proofErr w:type="spellEnd"/>
+            <w:r>
+              <w:rPr>
+                <w:color w:val="545454"/>
+                <w:sz w:val="20"/>
+                <w:u w:val="single"/>
+              </w:rPr>
+              <w:t>}}</w:t>
             </w:r>
           </w:p>
         </w:tc>
@@ -22393,60 +22347,6 @@
           <w:color w:val="545454"/>
         </w:rPr>
         <w:tab/>
-        <w:t/>
-      </w:r>
-      <w:r>
-        <w:rPr>
-          <w:color w:val="545454"/>
-          <w:spacing w:val="-9"/>
-        </w:rPr>
-        <w:t xml:space="preserve"/>
-      </w:r>
-      <w:r>
-        <w:rPr>
-          <w:color w:val="545454"/>
-        </w:rPr>
-        <w:t/>
-      </w:r>
-      <w:r>
-        <w:rPr>
-          <w:color w:val="545454"/>
-          <w:spacing w:val="-9"/>
-        </w:rPr>
-        <w:t xml:space="preserve"/>
-      </w:r>
-      <w:r>
-        <w:rPr>
-          <w:color w:val="545454"/>
-        </w:rPr>
-        <w:t/>
-      </w:r>
-      <w:r>
-        <w:rPr>
-          <w:color w:val="545454"/>
-          <w:spacing w:val="-9"/>
-        </w:rPr>
-        <w:t xml:space="preserve"/>
-      </w:r>
-      <w:r>
-        <w:rPr>
-          <w:color w:val="545454"/>
-        </w:rPr>
-        <w:t/>
-      </w:r>
-      <w:r>
-        <w:rPr>
-          <w:color w:val="545454"/>
-          <w:spacing w:val="-9"/>
-        </w:rPr>
-        <w:t xml:space="preserve"/>
-      </w:r>
-      <w:r>
-        <w:rPr>
-          <w:color w:val="545454"/>
-          <w:spacing w:val="-2"/>
-        </w:rPr>
-        <w:t/>
       </w:r>
     </w:p>
     <w:p>
@@ -22468,34 +22368,6 @@
           <w:color w:val="545454"/>
         </w:rPr>
         <w:tab/>
-        <w:t/>
-      </w:r>
-      <w:r>
-        <w:rPr>
-          <w:color w:val="545454"/>
-          <w:spacing w:val="-11"/>
-        </w:rPr>
-        <w:t xml:space="preserve"/>
-      </w:r>
-      <w:r>
-        <w:rPr>
-          <w:color w:val="545454"/>
-        </w:rPr>
-        <w:t/>
-      </w:r>
-      <w:r>
-        <w:rPr>
-          <w:color w:val="545454"/>
-          <w:spacing w:val="-11"/>
-        </w:rPr>
-        <w:t xml:space="preserve"/>
-      </w:r>
-      <w:r>
-        <w:rPr>
-          <w:color w:val="545454"/>
-          <w:spacing w:val="-2"/>
-        </w:rPr>
-        <w:t/>
       </w:r>
     </w:p>
     <w:p>
@@ -22517,21 +22389,6 @@
           <w:color w:val="545454"/>
         </w:rPr>
         <w:tab/>
-        <w:t/>
-      </w:r>
-      <w:r>
-        <w:rPr>
-          <w:color w:val="545454"/>
-          <w:spacing w:val="-4"/>
-        </w:rPr>
-        <w:t xml:space="preserve"/>
-      </w:r>
-      <w:r>
-        <w:rPr>
-          <w:color w:val="545454"/>
-          <w:spacing w:val="-2"/>
-        </w:rPr>
-        <w:t/>
       </w:r>
     </w:p>
     <w:p>
@@ -22554,26 +22411,6 @@
         </w:rPr>
         <w:tab/>
       </w:r>
-      <w:r>
-        <w:rPr>
-          <w:color w:val="545454"/>
-          <w:spacing w:val="-2"/>
-        </w:rPr>
-        <w:t/>
-      </w:r>
-      <w:r>
-        <w:rPr>
-          <w:color w:val="545454"/>
-        </w:rPr>
-        <w:t xml:space="preserve"/>
-      </w:r>
-      <w:r>
-        <w:rPr>
-          <w:color w:val="545454"/>
-          <w:spacing w:val="-2"/>
-        </w:rPr>
-        <w:t/>
-      </w:r>
     </w:p>
     <w:p>
       <w:pPr>
@@ -22594,47 +22431,6 @@
           <w:color w:val="545454"/>
         </w:rPr>
         <w:tab/>
-        <w:t/>
-      </w:r>
-      <w:r>
-        <w:rPr>
-          <w:color w:val="545454"/>
-          <w:spacing w:val="-10"/>
-        </w:rPr>
-        <w:t xml:space="preserve"/>
-      </w:r>
-      <w:r>
-        <w:rPr>
-          <w:color w:val="545454"/>
-        </w:rPr>
-        <w:t/>
-      </w:r>
-      <w:r>
-        <w:rPr>
-          <w:color w:val="545454"/>
-          <w:spacing w:val="-10"/>
-        </w:rPr>
-        <w:t xml:space="preserve"/>
-      </w:r>
-      <w:r>
-        <w:rPr>
-          <w:color w:val="545454"/>
-        </w:rPr>
-        <w:t/>
-      </w:r>
-      <w:r>
-        <w:rPr>
-          <w:color w:val="545454"/>
-          <w:spacing w:val="-9"/>
-        </w:rPr>
-        <w:t xml:space="preserve"/>
-      </w:r>
-      <w:r>
-        <w:rPr>
-          <w:color w:val="545454"/>
-          <w:spacing w:val="-5"/>
-        </w:rPr>
-        <w:t/>
       </w:r>
     </w:p>
     <w:p>
@@ -22656,34 +22452,6 @@
           <w:color w:val="545454"/>
         </w:rPr>
         <w:tab/>
-        <w:t/>
-      </w:r>
-      <w:r>
-        <w:rPr>
-          <w:color w:val="545454"/>
-          <w:spacing w:val="-7"/>
-        </w:rPr>
-        <w:t xml:space="preserve"/>
-      </w:r>
-      <w:r>
-        <w:rPr>
-          <w:color w:val="545454"/>
-        </w:rPr>
-        <w:t/>
-      </w:r>
-      <w:r>
-        <w:rPr>
-          <w:color w:val="545454"/>
-          <w:spacing w:val="-6"/>
-        </w:rPr>
-        <w:t xml:space="preserve"/>
-      </w:r>
-      <w:r>
-        <w:rPr>
-          <w:color w:val="545454"/>
-          <w:spacing w:val="-2"/>
-        </w:rPr>
-        <w:t/>
       </w:r>
     </w:p>
     <w:p>
@@ -22706,40 +22474,6 @@
         </w:rPr>
         <w:tab/>
       </w:r>
-      <w:r>
-        <w:rPr>
-          <w:color w:val="545454"/>
-          <w:spacing w:val="-2"/>
-        </w:rPr>
-        <w:t/>
-      </w:r>
-      <w:r>
-        <w:rPr>
-          <w:color w:val="545454"/>
-        </w:rPr>
-        <w:t xml:space="preserve"/>
-      </w:r>
-      <w:r>
-        <w:rPr>
-          <w:color w:val="545454"/>
-          <w:spacing w:val="-2"/>
-        </w:rPr>
-        <w:t/>
-      </w:r>
-      <w:r>
-        <w:rPr>
-          <w:color w:val="545454"/>
-          <w:spacing w:val="1"/>
-        </w:rPr>
-        <w:t xml:space="preserve"/>
-      </w:r>
-      <w:r>
-        <w:rPr>
-          <w:color w:val="545454"/>
-          <w:spacing w:val="-2"/>
-        </w:rPr>
-        <w:t/>
-      </w:r>
     </w:p>
     <w:p>
       <w:pPr>
@@ -22760,60 +22494,6 @@
           <w:color w:val="545454"/>
         </w:rPr>
         <w:tab/>
-        <w:t/>
-      </w:r>
-      <w:r>
-        <w:rPr>
-          <w:color w:val="545454"/>
-          <w:spacing w:val="-14"/>
-        </w:rPr>
-        <w:t xml:space="preserve"/>
-      </w:r>
-      <w:r>
-        <w:rPr>
-          <w:color w:val="545454"/>
-        </w:rPr>
-        <w:t/>
-      </w:r>
-      <w:r>
-        <w:rPr>
-          <w:color w:val="545454"/>
-          <w:spacing w:val="-11"/>
-        </w:rPr>
-        <w:t xml:space="preserve"/>
-      </w:r>
-      <w:r>
-        <w:rPr>
-          <w:color w:val="545454"/>
-        </w:rPr>
-        <w:t/>
-      </w:r>
-      <w:r>
-        <w:rPr>
-          <w:color w:val="545454"/>
-          <w:spacing w:val="-12"/>
-        </w:rPr>
-        <w:t xml:space="preserve"/>
-      </w:r>
-      <w:r>
-        <w:rPr>
-          <w:color w:val="545454"/>
-        </w:rPr>
-        <w:t/>
-      </w:r>
-      <w:r>
-        <w:rPr>
-          <w:color w:val="545454"/>
-          <w:spacing w:val="-11"/>
-        </w:rPr>
-        <w:t xml:space="preserve"/>
-      </w:r>
-      <w:r>
-        <w:rPr>
-          <w:color w:val="545454"/>
-          <w:spacing w:val="-2"/>
-        </w:rPr>
-        <w:t/>
       </w:r>
     </w:p>
     <w:p>
@@ -22846,177 +22526,7 @@
         <w:rPr>
           <w:color w:val="545454"/>
         </w:rPr>
-        <w:t xml:space="preserve">по договору аренды № {{contract_number}} между: {{owner_full_name}}, именуемый в дальнейшем «Арендодатель», с одной стороны, и {{client_full_name}} именуемый(ая) в дальнейшем «Арендатор», с другой стороны, о том, что «Арендодатель» передает, «Арендатор» принимает автомобиль в исправном техническом состоянии и следующей комплектации, а именно:</w:t>
-      </w:r>
-      <w:r>
-        <w:rPr>
-          <w:color w:val="545454"/>
-        </w:rPr>
-        <w:t xml:space="preserve"/>
-      </w:r>
-      <w:r>
-        <w:rPr>
-          <w:color w:val="545454"/>
-        </w:rPr>
-        <w:t/>
-      </w:r>
-      <w:r>
-        <w:rPr>
-          <w:color w:val="545454"/>
-        </w:rPr>
-        <w:t xml:space="preserve"/>
-      </w:r>
-      <w:r>
-        <w:rPr>
-          <w:color w:val="545454"/>
-        </w:rPr>
-        <w:t/>
-      </w:r>
-      <w:r>
-        <w:rPr>
-          <w:color w:val="545454"/>
-          <w:spacing w:val="-7"/>
-        </w:rPr>
-        <w:t xml:space="preserve"/>
-      </w:r>
-      <w:r>
-        <w:rPr>
-          <w:color w:val="545454"/>
-        </w:rPr>
-        <w:t/>
-      </w:r>
-      <w:r>
-        <w:rPr>
-          <w:color w:val="545454"/>
-          <w:spacing w:val="-7"/>
-        </w:rPr>
-        <w:t xml:space="preserve"/>
-      </w:r>
-      <w:r>
-        <w:rPr>
-          <w:color w:val="545454"/>
-        </w:rPr>
-        <w:t/>
-      </w:r>
-      <w:r>
-        <w:rPr>
-          <w:color w:val="545454"/>
-          <w:spacing w:val="-7"/>
-        </w:rPr>
-        <w:t xml:space="preserve"/>
-      </w:r>
-      <w:r>
-        <w:rPr>
-          <w:color w:val="545454"/>
-        </w:rPr>
-        <w:t/>
-      </w:r>
-      <w:r>
-        <w:rPr>
-          <w:color w:val="545454"/>
-          <w:spacing w:val="-7"/>
-        </w:rPr>
-        <w:t xml:space="preserve"/>
-      </w:r>
-      <w:r>
-        <w:rPr>
-          <w:color w:val="545454"/>
-        </w:rPr>
-        <w:t/>
-      </w:r>
-      <w:r>
-        <w:rPr>
-          <w:color w:val="545454"/>
-          <w:spacing w:val="-7"/>
-        </w:rPr>
-        <w:t xml:space="preserve"/>
-      </w:r>
-      <w:r>
-        <w:rPr>
-          <w:color w:val="545454"/>
-        </w:rPr>
-        <w:t/>
-      </w:r>
-      <w:r>
-        <w:rPr>
-          <w:color w:val="545454"/>
-          <w:spacing w:val="-7"/>
-        </w:rPr>
-        <w:t xml:space="preserve"/>
-      </w:r>
-      <w:r>
-        <w:rPr>
-          <w:color w:val="545454"/>
-        </w:rPr>
-        <w:t/>
-      </w:r>
-      <w:r>
-        <w:rPr>
-          <w:color w:val="545454"/>
-          <w:spacing w:val="-7"/>
-        </w:rPr>
-        <w:t xml:space="preserve"/>
-      </w:r>
-      <w:r>
-        <w:rPr>
-          <w:color w:val="545454"/>
-        </w:rPr>
-        <w:t/>
-      </w:r>
-      <w:r>
-        <w:rPr>
-          <w:color w:val="545454"/>
-          <w:spacing w:val="-7"/>
-        </w:rPr>
-        <w:t xml:space="preserve"/>
-      </w:r>
-      <w:r>
-        <w:rPr>
-          <w:color w:val="545454"/>
-        </w:rPr>
-        <w:t xml:space="preserve"/>
-      </w:r>
-      <w:r>
-        <w:rPr>
-          <w:color w:val="545454"/>
-        </w:rPr>
-        <w:t/>
-      </w:r>
-      <w:r>
-        <w:rPr>
-          <w:color w:val="545454"/>
-          <w:sz w:val="20"/>
-        </w:rPr>
-        <w:t xml:space="preserve"/>
-      </w:r>
-      <w:r>
-        <w:rPr>
-          <w:color w:val="545454"/>
-          <w:spacing w:val="-2"/>
-        </w:rPr>
-        <w:t/>
-      </w:r>
-      <w:proofErr w:type="spellStart"/>
-      <w:r>
-        <w:rPr>
-          <w:color w:val="545454"/>
-          <w:spacing w:val="-2"/>
-        </w:rPr>
-        <w:t/>
-      </w:r>
-      <w:proofErr w:type="spellEnd"/>
-      <w:r>
-        <w:rPr>
-          <w:color w:val="545454"/>
-          <w:spacing w:val="-2"/>
-        </w:rPr>
-        <w:t xml:space="preserve"/>
-      </w:r>
-      <w:r>
-        <w:rPr>
-          <w:color w:val="545454"/>
-        </w:rPr>
-        <w:t/>
+        <w:t>по договору аренды № {{contract_number}} между: {{owner_full_name}}, именуемый в дальнейшем «Арендодатель», с одной стороны, и {{client_full_name}} именуемый(ая) в дальнейшем «Арендатор», с другой стороны, о том, что «Арендодатель» передает, «Арендатор» принимает автомобиль в исправном техническом состоянии и следующей комплектации, а именно:</w:t>
       </w:r>
     </w:p>
     <w:p>
@@ -24400,7 +23910,7 @@
           <w:noProof/>
         </w:rPr>
         <w:drawing>
-          <wp:inline distT="0" distB="0" distL="0" distR="0" wp14:anchorId="7C98B34D" wp14:editId="4E5D16FE">
+          <wp:inline distT="0" distB="0" distL="0" distR="0" wp14:anchorId="7C98B34D" wp14:editId="55FC2203">
             <wp:extent cx="4733925" cy="5653504"/>
             <wp:effectExtent l="0" t="0" r="0" b="4445"/>
             <wp:docPr id="27" name="Рисунок 27"/>
@@ -26045,334 +25555,6 @@
         </w:rPr>
         <w:t>{{owner_full_name}}, именуемый в дальнейшем «Арендодатель», с одной стороны, и {{client_full_name}} именуемый(ая) в дальнейшем «Арендатор», с другой стороны, совместно именуемые «Стороны», договорились о нижеследующем:</w:t>
       </w:r>
-      <w:r>
-        <w:rPr>
-          <w:color w:val="545454"/>
-          <w:spacing w:val="-12"/>
-        </w:rPr>
-        <w:t xml:space="preserve"/>
-      </w:r>
-      <w:r>
-        <w:rPr>
-          <w:color w:val="545454"/>
-        </w:rPr>
-        <w:t/>
-      </w:r>
-      <w:r>
-        <w:rPr>
-          <w:color w:val="545454"/>
-          <w:spacing w:val="-9"/>
-        </w:rPr>
-        <w:t xml:space="preserve"/>
-      </w:r>
-      <w:r>
-        <w:rPr>
-          <w:color w:val="545454"/>
-        </w:rPr>
-        <w:t/>
-      </w:r>
-      <w:r>
-        <w:rPr>
-          <w:color w:val="545454"/>
-          <w:spacing w:val="-9"/>
-        </w:rPr>
-        <w:t xml:space="preserve"/>
-      </w:r>
-      <w:r>
-        <w:rPr>
-          <w:color w:val="545454"/>
-        </w:rPr>
-        <w:t/>
-      </w:r>
-      <w:r>
-        <w:rPr>
-          <w:color w:val="545454"/>
-          <w:spacing w:val="-10"/>
-        </w:rPr>
-        <w:t xml:space="preserve"/>
-      </w:r>
-      <w:r>
-        <w:rPr>
-          <w:color w:val="545454"/>
-        </w:rPr>
-        <w:t/>
-      </w:r>
-      <w:r>
-        <w:rPr>
-          <w:color w:val="545454"/>
-          <w:spacing w:val="-9"/>
-        </w:rPr>
-        <w:t xml:space="preserve"/>
-      </w:r>
-      <w:r>
-        <w:rPr>
-          <w:color w:val="545454"/>
-        </w:rPr>
-        <w:t/>
-      </w:r>
-      <w:r>
-        <w:rPr>
-          <w:color w:val="545454"/>
-          <w:spacing w:val="-9"/>
-        </w:rPr>
-        <w:t xml:space="preserve"/>
-      </w:r>
-      <w:r>
-        <w:rPr>
-          <w:color w:val="545454"/>
-        </w:rPr>
-        <w:t/>
-      </w:r>
-      <w:r>
-        <w:rPr>
-          <w:color w:val="545454"/>
-          <w:spacing w:val="-10"/>
-        </w:rPr>
-        <w:t xml:space="preserve"/>
-      </w:r>
-      <w:r>
-        <w:rPr>
-          <w:color w:val="545454"/>
-        </w:rPr>
-        <w:t/>
-      </w:r>
-      <w:r>
-        <w:rPr>
-          <w:color w:val="545454"/>
-          <w:spacing w:val="-9"/>
-        </w:rPr>
-        <w:t xml:space="preserve"/>
-      </w:r>
-      <w:r>
-        <w:rPr>
-          <w:color w:val="545454"/>
-        </w:rPr>
-        <w:t/>
-      </w:r>
-      <w:r>
-        <w:rPr>
-          <w:color w:val="545454"/>
-          <w:spacing w:val="-9"/>
-        </w:rPr>
-        <w:t xml:space="preserve"/>
-      </w:r>
-      <w:r>
-        <w:rPr>
-          <w:color w:val="545454"/>
-        </w:rPr>
-        <w:t/>
-      </w:r>
-      <w:r>
-        <w:rPr>
-          <w:color w:val="545454"/>
-          <w:spacing w:val="-9"/>
-        </w:rPr>
-        <w:t xml:space="preserve"/>
-      </w:r>
-      <w:r>
-        <w:rPr>
-          <w:color w:val="545454"/>
-          <w:spacing w:val="-10"/>
-        </w:rPr>
-        <w:t/>
-      </w:r>
-      <w:r>
-        <w:rPr>
-          <w:color w:val="545454"/>
-          <w:spacing w:val="-10"/>
-        </w:rPr>
-        <w:t xml:space="preserve"/>
-      </w:r>
-      <w:r>
-        <w:rPr>
-          <w:color w:val="545454"/>
-        </w:rPr>
-        <w:t/>
-      </w:r>
-      <w:r>
-        <w:rPr>
-          <w:color w:val="545454"/>
-        </w:rPr>
-        <w:t xml:space="preserve"/>
-      </w:r>
-      <w:r>
-        <w:rPr>
-          <w:color w:val="545454"/>
-        </w:rPr>
-        <w:t/>
-      </w:r>
-      <w:proofErr w:type="spellStart"/>
-      <w:r>
-        <w:rPr>
-          <w:color w:val="545454"/>
-        </w:rPr>
-        <w:t/>
-      </w:r>
-      <w:proofErr w:type="spellEnd"/>
-      <w:r>
-        <w:rPr>
-          <w:color w:val="545454"/>
-        </w:rPr>
-        <w:t/>
-      </w:r>
-      <w:r>
-        <w:rPr>
-          <w:color w:val="545454"/>
-          <w:spacing w:val="-8"/>
-        </w:rPr>
-        <w:t xml:space="preserve"/>
-      </w:r>
-      <w:r>
-        <w:rPr>
-          <w:color w:val="545454"/>
-        </w:rPr>
-        <w:t/>
-      </w:r>
-      <w:r>
-        <w:rPr>
-          <w:color w:val="545454"/>
-          <w:spacing w:val="-8"/>
-        </w:rPr>
-        <w:t xml:space="preserve"/>
-      </w:r>
-      <w:r>
-        <w:rPr>
-          <w:color w:val="545454"/>
-          <w:spacing w:val="-2"/>
-        </w:rPr>
-        <w:t/>
-      </w:r>
-      <w:r>
-        <w:rPr>
-          <w:color w:val="545454"/>
-          <w:spacing w:val="-2"/>
-        </w:rPr>
-        <w:t xml:space="preserve"/>
-      </w:r>
-      <w:r>
-        <w:rPr>
-          <w:color w:val="545454"/>
-        </w:rPr>
-        <w:t/>
-      </w:r>
-      <w:r>
-        <w:rPr>
-          <w:color w:val="545454"/>
-          <w:spacing w:val="-13"/>
-        </w:rPr>
-        <w:t xml:space="preserve"/>
-      </w:r>
-      <w:r>
-        <w:rPr>
-          <w:color w:val="545454"/>
-        </w:rPr>
-        <w:t/>
-      </w:r>
-      <w:r>
-        <w:rPr>
-          <w:color w:val="545454"/>
-          <w:spacing w:val="-10"/>
-        </w:rPr>
-        <w:t xml:space="preserve"/>
-      </w:r>
-      <w:r>
-        <w:rPr>
-          <w:color w:val="545454"/>
-        </w:rPr>
-        <w:t/>
-      </w:r>
-      <w:r>
-        <w:rPr>
-          <w:color w:val="545454"/>
-          <w:spacing w:val="-10"/>
-        </w:rPr>
-        <w:t xml:space="preserve"/>
-      </w:r>
-      <w:r>
-        <w:rPr>
-          <w:color w:val="545454"/>
-        </w:rPr>
-        <w:t/>
-      </w:r>
-      <w:r>
-        <w:rPr>
-          <w:color w:val="545454"/>
-          <w:spacing w:val="-10"/>
-        </w:rPr>
-        <w:t xml:space="preserve"/>
-      </w:r>
-      <w:r>
-        <w:rPr>
-          <w:color w:val="545454"/>
-        </w:rPr>
-        <w:t/>
-      </w:r>
-      <w:r>
-        <w:rPr>
-          <w:color w:val="545454"/>
-          <w:spacing w:val="-10"/>
-        </w:rPr>
-        <w:t xml:space="preserve"/>
-      </w:r>
-      <w:r>
-        <w:rPr>
-          <w:color w:val="545454"/>
-        </w:rPr>
-        <w:t/>
-      </w:r>
-      <w:r>
-        <w:rPr>
-          <w:color w:val="545454"/>
-          <w:spacing w:val="-10"/>
-        </w:rPr>
-        <w:t xml:space="preserve"/>
-      </w:r>
-      <w:r>
-        <w:rPr>
-          <w:color w:val="545454"/>
-        </w:rPr>
-        <w:t/>
-      </w:r>
-      <w:r>
-        <w:rPr>
-          <w:color w:val="545454"/>
-          <w:spacing w:val="-10"/>
-        </w:rPr>
-        <w:t xml:space="preserve"/>
-      </w:r>
-      <w:r>
-        <w:rPr>
-          <w:color w:val="545454"/>
-        </w:rPr>
-        <w:t/>
-      </w:r>
-      <w:r>
-        <w:rPr>
-          <w:color w:val="545454"/>
-          <w:spacing w:val="-10"/>
-        </w:rPr>
-        <w:t xml:space="preserve"/>
-      </w:r>
-      <w:r>
-        <w:rPr>
-          <w:color w:val="545454"/>
-        </w:rPr>
-        <w:t/>
-      </w:r>
-      <w:r>
-        <w:rPr>
-          <w:color w:val="545454"/>
-          <w:spacing w:val="-10"/>
-        </w:rPr>
-        <w:t xml:space="preserve"/>
-      </w:r>
-      <w:r>
-        <w:rPr>
-          <w:color w:val="545454"/>
-          <w:spacing w:val="-2"/>
-        </w:rPr>
-        <w:t/>
-      </w:r>
     </w:p>
     <w:p>
       <w:pPr>
@@ -28816,60 +27998,6 @@
           <w:color w:val="545454"/>
         </w:rPr>
         <w:tab/>
-        <w:t/>
-      </w:r>
-      <w:r>
-        <w:rPr>
-          <w:color w:val="545454"/>
-          <w:spacing w:val="-9"/>
-        </w:rPr>
-        <w:t xml:space="preserve"/>
-      </w:r>
-      <w:r>
-        <w:rPr>
-          <w:color w:val="545454"/>
-        </w:rPr>
-        <w:t/>
-      </w:r>
-      <w:r>
-        <w:rPr>
-          <w:color w:val="545454"/>
-          <w:spacing w:val="-9"/>
-        </w:rPr>
-        <w:t xml:space="preserve"/>
-      </w:r>
-      <w:r>
-        <w:rPr>
-          <w:color w:val="545454"/>
-        </w:rPr>
-        <w:t/>
-      </w:r>
-      <w:r>
-        <w:rPr>
-          <w:color w:val="545454"/>
-          <w:spacing w:val="-9"/>
-        </w:rPr>
-        <w:t xml:space="preserve"/>
-      </w:r>
-      <w:r>
-        <w:rPr>
-          <w:color w:val="545454"/>
-        </w:rPr>
-        <w:t/>
-      </w:r>
-      <w:r>
-        <w:rPr>
-          <w:color w:val="545454"/>
-          <w:spacing w:val="-9"/>
-        </w:rPr>
-        <w:t xml:space="preserve"/>
-      </w:r>
-      <w:r>
-        <w:rPr>
-          <w:color w:val="545454"/>
-          <w:spacing w:val="-2"/>
-        </w:rPr>
-        <w:t/>
       </w:r>
     </w:p>
     <w:p>
@@ -28891,34 +28019,6 @@
           <w:color w:val="545454"/>
         </w:rPr>
         <w:tab/>
-        <w:t/>
-      </w:r>
-      <w:r>
-        <w:rPr>
-          <w:color w:val="545454"/>
-          <w:spacing w:val="-11"/>
-        </w:rPr>
-        <w:t xml:space="preserve"/>
-      </w:r>
-      <w:r>
-        <w:rPr>
-          <w:color w:val="545454"/>
-        </w:rPr>
-        <w:t/>
-      </w:r>
-      <w:r>
-        <w:rPr>
-          <w:color w:val="545454"/>
-          <w:spacing w:val="-11"/>
-        </w:rPr>
-        <w:t xml:space="preserve"/>
-      </w:r>
-      <w:r>
-        <w:rPr>
-          <w:color w:val="545454"/>
-          <w:spacing w:val="-2"/>
-        </w:rPr>
-        <w:t/>
       </w:r>
     </w:p>
     <w:p>
@@ -28940,21 +28040,6 @@
           <w:color w:val="545454"/>
         </w:rPr>
         <w:tab/>
-        <w:t/>
-      </w:r>
-      <w:r>
-        <w:rPr>
-          <w:color w:val="545454"/>
-          <w:spacing w:val="-4"/>
-        </w:rPr>
-        <w:t xml:space="preserve"/>
-      </w:r>
-      <w:r>
-        <w:rPr>
-          <w:color w:val="545454"/>
-          <w:spacing w:val="-2"/>
-        </w:rPr>
-        <w:t/>
       </w:r>
     </w:p>
     <w:p>
@@ -28977,26 +28062,6 @@
         </w:rPr>
         <w:tab/>
       </w:r>
-      <w:r>
-        <w:rPr>
-          <w:color w:val="545454"/>
-          <w:spacing w:val="-2"/>
-        </w:rPr>
-        <w:t/>
-      </w:r>
-      <w:r>
-        <w:rPr>
-          <w:color w:val="545454"/>
-        </w:rPr>
-        <w:t xml:space="preserve"/>
-      </w:r>
-      <w:r>
-        <w:rPr>
-          <w:color w:val="545454"/>
-          <w:spacing w:val="-2"/>
-        </w:rPr>
-        <w:t/>
-      </w:r>
     </w:p>
     <w:p>
       <w:pPr>
@@ -29017,47 +28082,6 @@
           <w:color w:val="545454"/>
         </w:rPr>
         <w:tab/>
-        <w:t/>
-      </w:r>
-      <w:r>
-        <w:rPr>
-          <w:color w:val="545454"/>
-          <w:spacing w:val="-10"/>
-        </w:rPr>
-        <w:t xml:space="preserve"/>
-      </w:r>
-      <w:r>
-        <w:rPr>
-          <w:color w:val="545454"/>
-        </w:rPr>
-        <w:t/>
-      </w:r>
-      <w:r>
-        <w:rPr>
-          <w:color w:val="545454"/>
-          <w:spacing w:val="-10"/>
-        </w:rPr>
-        <w:t xml:space="preserve"/>
-      </w:r>
-      <w:r>
-        <w:rPr>
-          <w:color w:val="545454"/>
-        </w:rPr>
-        <w:t/>
-      </w:r>
-      <w:r>
-        <w:rPr>
-          <w:color w:val="545454"/>
-          <w:spacing w:val="-9"/>
-        </w:rPr>
-        <w:t xml:space="preserve"/>
-      </w:r>
-      <w:r>
-        <w:rPr>
-          <w:color w:val="545454"/>
-          <w:spacing w:val="-5"/>
-        </w:rPr>
-        <w:t/>
       </w:r>
     </w:p>
     <w:p>
@@ -29079,34 +28103,6 @@
           <w:color w:val="545454"/>
         </w:rPr>
         <w:tab/>
-        <w:t/>
-      </w:r>
-      <w:r>
-        <w:rPr>
-          <w:color w:val="545454"/>
-          <w:spacing w:val="-7"/>
-        </w:rPr>
-        <w:t xml:space="preserve"/>
-      </w:r>
-      <w:r>
-        <w:rPr>
-          <w:color w:val="545454"/>
-        </w:rPr>
-        <w:t/>
-      </w:r>
-      <w:r>
-        <w:rPr>
-          <w:color w:val="545454"/>
-          <w:spacing w:val="-6"/>
-        </w:rPr>
-        <w:t xml:space="preserve"/>
-      </w:r>
-      <w:r>
-        <w:rPr>
-          <w:color w:val="545454"/>
-          <w:spacing w:val="-2"/>
-        </w:rPr>
-        <w:t/>
       </w:r>
     </w:p>
     <w:p>
@@ -29129,40 +28125,6 @@
         </w:rPr>
         <w:tab/>
       </w:r>
-      <w:r>
-        <w:rPr>
-          <w:color w:val="545454"/>
-          <w:spacing w:val="-2"/>
-        </w:rPr>
-        <w:t/>
-      </w:r>
-      <w:r>
-        <w:rPr>
-          <w:color w:val="545454"/>
-        </w:rPr>
-        <w:t xml:space="preserve"/>
-      </w:r>
-      <w:r>
-        <w:rPr>
-          <w:color w:val="545454"/>
-          <w:spacing w:val="-2"/>
-        </w:rPr>
-        <w:t/>
-      </w:r>
-      <w:r>
-        <w:rPr>
-          <w:color w:val="545454"/>
-          <w:spacing w:val="1"/>
-        </w:rPr>
-        <w:t xml:space="preserve"/>
-      </w:r>
-      <w:r>
-        <w:rPr>
-          <w:color w:val="545454"/>
-          <w:spacing w:val="-2"/>
-        </w:rPr>
-        <w:t/>
-      </w:r>
     </w:p>
     <w:p>
       <w:pPr>
@@ -29183,60 +28145,6 @@
           <w:color w:val="545454"/>
         </w:rPr>
         <w:tab/>
-        <w:t/>
-      </w:r>
-      <w:r>
-        <w:rPr>
-          <w:color w:val="545454"/>
-          <w:spacing w:val="-14"/>
-        </w:rPr>
-        <w:t xml:space="preserve"/>
-      </w:r>
-      <w:r>
-        <w:rPr>
-          <w:color w:val="545454"/>
-        </w:rPr>
-        <w:t/>
-      </w:r>
-      <w:r>
-        <w:rPr>
-          <w:color w:val="545454"/>
-          <w:spacing w:val="-11"/>
-        </w:rPr>
-        <w:t xml:space="preserve"/>
-      </w:r>
-      <w:r>
-        <w:rPr>
-          <w:color w:val="545454"/>
-        </w:rPr>
-        <w:t/>
-      </w:r>
-      <w:r>
-        <w:rPr>
-          <w:color w:val="545454"/>
-          <w:spacing w:val="-12"/>
-        </w:rPr>
-        <w:t xml:space="preserve"/>
-      </w:r>
-      <w:r>
-        <w:rPr>
-          <w:color w:val="545454"/>
-        </w:rPr>
-        <w:t/>
-      </w:r>
-      <w:r>
-        <w:rPr>
-          <w:color w:val="545454"/>
-          <w:spacing w:val="-11"/>
-        </w:rPr>
-        <w:t xml:space="preserve"/>
-      </w:r>
-      <w:r>
-        <w:rPr>
-          <w:color w:val="545454"/>
-          <w:spacing w:val="-2"/>
-        </w:rPr>
-        <w:t/>
       </w:r>
     </w:p>
     <w:p>
@@ -30270,7 +29178,7 @@
         </w:rPr>
         <w:lastRenderedPageBreak/>
         <w:drawing>
-          <wp:inline distT="0" distB="0" distL="0" distR="0" wp14:anchorId="63722DFF" wp14:editId="4A76E5DC">
+          <wp:inline distT="0" distB="0" distL="0" distR="0" wp14:anchorId="63722DFF" wp14:editId="3E68CFE4">
             <wp:extent cx="4733925" cy="5653504"/>
             <wp:effectExtent l="0" t="0" r="0" b="4445"/>
             <wp:docPr id="28" name="Рисунок 28"/>
@@ -30901,97 +29809,6 @@
           <w:sz w:val="20"/>
         </w:rPr>
         <w:t>Свидетельство о регистрации транспортного средства {{car_registration_certificate}}</w:t>
-      </w:r>
-      <w:r>
-        <w:rPr>
-          <w:color w:val="545454"/>
-          <w:spacing w:val="-16"/>
-          <w:sz w:val="20"/>
-        </w:rPr>
-        <w:t xml:space="preserve"/>
-      </w:r>
-      <w:r>
-        <w:rPr>
-          <w:color w:val="545454"/>
-          <w:sz w:val="20"/>
-        </w:rPr>
-        <w:t/>
-      </w:r>
-      <w:r>
-        <w:rPr>
-          <w:color w:val="545454"/>
-          <w:spacing w:val="-13"/>
-          <w:sz w:val="20"/>
-        </w:rPr>
-        <w:t xml:space="preserve"/>
-      </w:r>
-      <w:r>
-        <w:rPr>
-          <w:color w:val="545454"/>
-          <w:sz w:val="20"/>
-        </w:rPr>
-        <w:t/>
-      </w:r>
-      <w:r>
-        <w:rPr>
-          <w:color w:val="545454"/>
-          <w:spacing w:val="-13"/>
-          <w:sz w:val="20"/>
-        </w:rPr>
-        <w:t xml:space="preserve"/>
-      </w:r>
-      <w:r>
-        <w:rPr>
-          <w:color w:val="545454"/>
-          <w:sz w:val="20"/>
-        </w:rPr>
-        <w:t/>
-      </w:r>
-      <w:r>
-        <w:rPr>
-          <w:color w:val="545454"/>
-          <w:spacing w:val="-14"/>
-          <w:sz w:val="20"/>
-        </w:rPr>
-        <w:t xml:space="preserve"/>
-      </w:r>
-      <w:r>
-        <w:rPr>
-          <w:color w:val="545454"/>
-          <w:sz w:val="20"/>
-        </w:rPr>
-        <w:t/>
-      </w:r>
-      <w:r>
-        <w:rPr>
-          <w:color w:val="545454"/>
-          <w:spacing w:val="-13"/>
-          <w:sz w:val="20"/>
-        </w:rPr>
-        <w:t xml:space="preserve"/>
-      </w:r>
-      <w:r>
-        <w:rPr>
-          <w:color w:val="545454"/>
-          <w:sz w:val="20"/>
-        </w:rPr>
-        <w:t/>
-      </w:r>
-      <w:r>
-        <w:rPr>
-          <w:color w:val="545454"/>
-          <w:spacing w:val="-13"/>
-          <w:sz w:val="20"/>
-        </w:rPr>
-        <w:t xml:space="preserve"/>
-      </w:r>
-      <w:r>
-        <w:rPr>
-          <w:color w:val="545454"/>
-          <w:spacing w:val="-2"/>
-          <w:sz w:val="20"/>
-        </w:rPr>
-        <w:t/>
       </w:r>
     </w:p>
     <w:p>
@@ -32782,6 +31599,7 @@
   <w:style w:type="character" w:default="1" w:styleId="a0">
     <w:name w:val="Default Paragraph Font"/>
     <w:uiPriority w:val="1"/>
+    <w:semiHidden/>
     <w:unhideWhenUsed/>
   </w:style>
   <w:style w:type="table" w:default="1" w:styleId="a1">

</xml_diff>

<commit_message>
Add gender-based contract wording
</commit_message>
<xml_diff>
--- a/templates/rental-contract-template-1782471508838.docx
+++ b/templates/rental-contract-template-1782471508838.docx
@@ -33,7 +33,53 @@
         <w:rPr>
           <w:color w:val="545454"/>
         </w:rPr>
-        <w:t>{{owner_full_name}}, именуемый в дальнейшем «Арендодатель», с одной стороны, и {{client_full_name}}, именуемый(ая) в дальнейшем «Арендатор», с другой стороны, совместно именуемые «Стороны», заключили настоящий договор о нижеследующем:</w:t>
+        <w:t>{{owner_full_name}}, именуемый в дальнейшем «Арендодатель», с одной стороны, и {{</w:t>
+      </w:r>
+      <w:proofErr w:type="spellStart"/>
+      <w:r>
+        <w:rPr>
+          <w:color w:val="545454"/>
+        </w:rPr>
+        <w:t>client_full_name</w:t>
+      </w:r>
+      <w:proofErr w:type="spellEnd"/>
+      <w:r>
+        <w:rPr>
+          <w:color w:val="545454"/>
+        </w:rPr>
+        <w:t xml:space="preserve">}}, </w:t>
+      </w:r>
+      <w:r>
+        <w:rPr>
+          <w:color w:val="545454"/>
+        </w:rPr>
+        <w:t>{{</w:t>
+      </w:r>
+      <w:proofErr w:type="spellStart"/>
+      <w:r>
+        <w:rPr>
+          <w:color w:val="545454"/>
+        </w:rPr>
+        <w:t>client_named_as</w:t>
+      </w:r>
+      <w:proofErr w:type="spellEnd"/>
+      <w:r>
+        <w:rPr>
+          <w:color w:val="545454"/>
+        </w:rPr>
+        <w:t>}}</w:t>
+      </w:r>
+      <w:r>
+        <w:rPr>
+          <w:color w:val="545454"/>
+        </w:rPr>
+        <w:t xml:space="preserve"> </w:t>
+      </w:r>
+      <w:r>
+        <w:rPr>
+          <w:color w:val="545454"/>
+        </w:rPr>
+        <w:t>в дальнейшем «Арендатор», с другой стороны, совместно именуемые «Стороны», заключили настоящий договор о нижеследующем:</w:t>
       </w:r>
     </w:p>
     <w:p>
@@ -1990,142 +2036,7 @@
           <w:color w:val="545454"/>
           <w:sz w:val="20"/>
         </w:rPr>
-        <w:t>Автомобиль</w:t>
-      </w:r>
-      <w:r>
-        <w:rPr>
-          <w:color w:val="545454"/>
-          <w:spacing w:val="-14"/>
-          <w:sz w:val="20"/>
-        </w:rPr>
-        <w:t xml:space="preserve"> </w:t>
-      </w:r>
-      <w:r>
-        <w:rPr>
-          <w:color w:val="545454"/>
-          <w:sz w:val="20"/>
-        </w:rPr>
-        <w:t>передается</w:t>
-      </w:r>
-      <w:r>
-        <w:rPr>
-          <w:color w:val="545454"/>
-          <w:spacing w:val="-14"/>
-          <w:sz w:val="20"/>
-        </w:rPr>
-        <w:t xml:space="preserve"> </w:t>
-      </w:r>
-      <w:r>
-        <w:rPr>
-          <w:color w:val="545454"/>
-          <w:sz w:val="20"/>
-        </w:rPr>
-        <w:t>Арендатору,</w:t>
-      </w:r>
-      <w:r>
-        <w:rPr>
-          <w:color w:val="545454"/>
-          <w:spacing w:val="-14"/>
-          <w:sz w:val="20"/>
-        </w:rPr>
-        <w:t xml:space="preserve"> </w:t>
-      </w:r>
-      <w:r>
-        <w:rPr>
-          <w:color w:val="545454"/>
-          <w:sz w:val="20"/>
-        </w:rPr>
-        <w:t>застрахованным</w:t>
-      </w:r>
-      <w:r>
-        <w:rPr>
-          <w:color w:val="545454"/>
-          <w:spacing w:val="-14"/>
-          <w:sz w:val="20"/>
-        </w:rPr>
-        <w:t xml:space="preserve"> </w:t>
-      </w:r>
-      <w:r>
-        <w:rPr>
-          <w:color w:val="545454"/>
-          <w:sz w:val="20"/>
-        </w:rPr>
-        <w:t>по</w:t>
-      </w:r>
-      <w:r>
-        <w:rPr>
-          <w:color w:val="545454"/>
-          <w:spacing w:val="-14"/>
-          <w:sz w:val="20"/>
-        </w:rPr>
-        <w:t xml:space="preserve"> </w:t>
-      </w:r>
-      <w:r>
-        <w:rPr>
-          <w:color w:val="545454"/>
-          <w:sz w:val="20"/>
-        </w:rPr>
-        <w:t>программе</w:t>
-      </w:r>
-      <w:r>
-        <w:rPr>
-          <w:color w:val="545454"/>
-          <w:spacing w:val="-14"/>
-          <w:sz w:val="20"/>
-        </w:rPr>
-        <w:t xml:space="preserve"> </w:t>
-      </w:r>
-      <w:r>
-        <w:rPr>
-          <w:color w:val="545454"/>
-          <w:sz w:val="20"/>
-        </w:rPr>
-        <w:t>ОСАГО.</w:t>
-      </w:r>
-      <w:r>
-        <w:rPr>
-          <w:color w:val="545454"/>
-          <w:spacing w:val="-14"/>
-          <w:sz w:val="20"/>
-        </w:rPr>
-        <w:t xml:space="preserve"> </w:t>
-      </w:r>
-      <w:r>
-        <w:rPr>
-          <w:color w:val="545454"/>
-          <w:sz w:val="20"/>
-        </w:rPr>
-        <w:t>Расходы</w:t>
-      </w:r>
-      <w:r>
-        <w:rPr>
-          <w:color w:val="545454"/>
-          <w:spacing w:val="-14"/>
-          <w:sz w:val="20"/>
-        </w:rPr>
-        <w:t xml:space="preserve"> </w:t>
-      </w:r>
-      <w:r>
-        <w:rPr>
-          <w:color w:val="545454"/>
-          <w:sz w:val="20"/>
-        </w:rPr>
-        <w:t>по</w:t>
-      </w:r>
-      <w:r>
-        <w:rPr>
-          <w:color w:val="545454"/>
-          <w:spacing w:val="-14"/>
-          <w:sz w:val="20"/>
-        </w:rPr>
-        <w:t xml:space="preserve"> </w:t>
-      </w:r>
-      <w:r>
-        <w:rPr>
-          <w:color w:val="545454"/>
-          <w:sz w:val="20"/>
-        </w:rPr>
-        <w:t>страхованию Автомобиля несет Арендодатель.</w:t>
+        <w:t>На момент передачи Автомобиль застрахован по программе ОСАГО. Расходы по страхованию Автомобиля несет Арендодатель.</w:t>
       </w:r>
     </w:p>
     <w:p>
@@ -2796,7 +2707,7 @@
           <w:color w:val="545454"/>
           <w:sz w:val="20"/>
         </w:rPr>
-        <w:t>-</w:t>
+        <w:t>{{discount_percent}}</w:t>
       </w:r>
     </w:p>
     <w:p>
@@ -3061,173 +2972,7 @@
           <w:color w:val="545454"/>
           <w:sz w:val="20"/>
         </w:rPr>
-        <w:t>Окончание</w:t>
-      </w:r>
-      <w:r>
-        <w:rPr>
-          <w:color w:val="545454"/>
-          <w:spacing w:val="-7"/>
-          <w:sz w:val="20"/>
-        </w:rPr>
-        <w:t xml:space="preserve"> </w:t>
-      </w:r>
-      <w:r>
-        <w:rPr>
-          <w:color w:val="545454"/>
-          <w:sz w:val="20"/>
-        </w:rPr>
-        <w:t>срока</w:t>
-      </w:r>
-      <w:r>
-        <w:rPr>
-          <w:color w:val="545454"/>
-          <w:spacing w:val="-7"/>
-          <w:sz w:val="20"/>
-        </w:rPr>
-        <w:t xml:space="preserve"> </w:t>
-      </w:r>
-      <w:r>
-        <w:rPr>
-          <w:color w:val="545454"/>
-          <w:sz w:val="20"/>
-        </w:rPr>
-        <w:t>аренды:</w:t>
-      </w:r>
-      <w:r>
-        <w:rPr>
-          <w:color w:val="545454"/>
-          <w:spacing w:val="-7"/>
-          <w:sz w:val="20"/>
-        </w:rPr>
-        <w:t xml:space="preserve"> </w:t>
-      </w:r>
-      <w:r>
-        <w:rPr>
-          <w:color w:val="545454"/>
-          <w:sz w:val="20"/>
-        </w:rPr>
-        <w:t>Договор</w:t>
-      </w:r>
-      <w:r>
-        <w:rPr>
-          <w:color w:val="545454"/>
-          <w:spacing w:val="-7"/>
-          <w:sz w:val="20"/>
-        </w:rPr>
-        <w:t xml:space="preserve"> </w:t>
-      </w:r>
-      <w:r>
-        <w:rPr>
-          <w:color w:val="545454"/>
-          <w:sz w:val="20"/>
-        </w:rPr>
-        <w:t>является</w:t>
-      </w:r>
-      <w:r>
-        <w:rPr>
-          <w:color w:val="545454"/>
-          <w:spacing w:val="-7"/>
-          <w:sz w:val="20"/>
-        </w:rPr>
-        <w:t xml:space="preserve"> </w:t>
-      </w:r>
-      <w:r>
-        <w:rPr>
-          <w:color w:val="545454"/>
-          <w:sz w:val="20"/>
-        </w:rPr>
-        <w:t>закрытым</w:t>
-      </w:r>
-      <w:r>
-        <w:rPr>
-          <w:color w:val="545454"/>
-          <w:spacing w:val="-7"/>
-          <w:sz w:val="20"/>
-        </w:rPr>
-        <w:t xml:space="preserve"> </w:t>
-      </w:r>
-      <w:r>
-        <w:rPr>
-          <w:color w:val="545454"/>
-          <w:sz w:val="20"/>
-        </w:rPr>
-        <w:t>с</w:t>
-      </w:r>
-      <w:r>
-        <w:rPr>
-          <w:color w:val="545454"/>
-          <w:spacing w:val="-7"/>
-          <w:sz w:val="20"/>
-        </w:rPr>
-        <w:t xml:space="preserve"> </w:t>
-      </w:r>
-      <w:r>
-        <w:rPr>
-          <w:color w:val="545454"/>
-          <w:sz w:val="20"/>
-        </w:rPr>
-        <w:t>момента</w:t>
-      </w:r>
-      <w:r>
-        <w:rPr>
-          <w:color w:val="545454"/>
-          <w:spacing w:val="-7"/>
-          <w:sz w:val="20"/>
-        </w:rPr>
-        <w:t xml:space="preserve"> </w:t>
-      </w:r>
-      <w:r>
-        <w:rPr>
-          <w:color w:val="545454"/>
-          <w:sz w:val="20"/>
-        </w:rPr>
-        <w:t>подписания</w:t>
-      </w:r>
-      <w:r>
-        <w:rPr>
-          <w:color w:val="545454"/>
-          <w:spacing w:val="-7"/>
-          <w:sz w:val="20"/>
-        </w:rPr>
-        <w:t xml:space="preserve"> </w:t>
-      </w:r>
-      <w:r>
-        <w:rPr>
-          <w:color w:val="545454"/>
-          <w:sz w:val="20"/>
-        </w:rPr>
-        <w:t>акта</w:t>
-      </w:r>
-      <w:r>
-        <w:rPr>
-          <w:color w:val="545454"/>
-          <w:spacing w:val="-7"/>
-          <w:sz w:val="20"/>
-        </w:rPr>
-        <w:t xml:space="preserve"> </w:t>
-      </w:r>
-      <w:r>
-        <w:rPr>
-          <w:color w:val="545454"/>
-          <w:sz w:val="20"/>
-        </w:rPr>
-        <w:t xml:space="preserve">приема-передачи автомобиля, в котором указывается окончательная дата закрытия договора </w:t>
-      </w:r>
-      <w:proofErr w:type="gramStart"/>
-      <w:r>
-        <w:rPr>
-          <w:color w:val="545454"/>
-          <w:sz w:val="20"/>
-        </w:rPr>
-        <w:t>при продление</w:t>
-      </w:r>
-      <w:proofErr w:type="gramEnd"/>
-      <w:r>
-        <w:rPr>
-          <w:color w:val="545454"/>
-          <w:sz w:val="20"/>
-        </w:rPr>
-        <w:t xml:space="preserve"> договора (Приложения № 1).</w:t>
+        <w:t>Окончательный срок фактического пользования Автомобилем определяется по акту возврата Автомобиля. Договор считается исполненным в части возврата Автомобиля с момента подписания сторонами акта возврата.</w:t>
       </w:r>
     </w:p>
     <w:p>
@@ -3684,7 +3429,21 @@
           <w:color w:val="545454"/>
           <w:sz w:val="20"/>
         </w:rPr>
-        <w:t>в соответствии с тарифами Арендатора. Возврат остатка суммы осуществляется в течение 1 рабочего дня после возврата Автомобиля.</w:t>
+        <w:t>в соответствии с тарифами Аренд</w:t>
+      </w:r>
+      <w:r>
+        <w:rPr>
+          <w:color w:val="545454"/>
+          <w:sz w:val="20"/>
+        </w:rPr>
+        <w:t>одателя</w:t>
+      </w:r>
+      <w:r>
+        <w:rPr>
+          <w:color w:val="545454"/>
+          <w:sz w:val="20"/>
+        </w:rPr>
+        <w:t>. Возврат остатка суммы осуществляется в течение 1 рабочего дня после возврата Автомобиля.</w:t>
       </w:r>
     </w:p>
     <w:p>
@@ -4704,20 +4463,7 @@
         <w:rPr>
           <w:color w:val="545454"/>
         </w:rPr>
-        <w:t>не</w:t>
-      </w:r>
-      <w:r>
-        <w:rPr>
-          <w:color w:val="545454"/>
-          <w:spacing w:val="-2"/>
-        </w:rPr>
-        <w:t xml:space="preserve"> </w:t>
-      </w:r>
-      <w:r>
-        <w:rPr>
-          <w:color w:val="545454"/>
-        </w:rPr>
-        <w:t>передачи</w:t>
+        <w:t>непередачи</w:t>
       </w:r>
       <w:r>
         <w:rPr>
@@ -7019,7 +6765,21 @@
           <w:color w:val="545454"/>
           <w:sz w:val="20"/>
         </w:rPr>
-        <w:t>в режим охраны или закрывать авто.</w:t>
+        <w:t xml:space="preserve">в режим охраны или закрывать </w:t>
+      </w:r>
+      <w:r>
+        <w:rPr>
+          <w:color w:val="545454"/>
+          <w:sz w:val="20"/>
+        </w:rPr>
+        <w:t>Автомобиль</w:t>
+      </w:r>
+      <w:r>
+        <w:rPr>
+          <w:color w:val="545454"/>
+          <w:sz w:val="20"/>
+        </w:rPr>
+        <w:t>.</w:t>
       </w:r>
     </w:p>
     <w:p>
@@ -7049,127 +6809,14 @@
           <w:color w:val="545454"/>
           <w:sz w:val="20"/>
         </w:rPr>
-        <w:t>Арендатор</w:t>
-      </w:r>
-      <w:r>
-        <w:rPr>
-          <w:color w:val="545454"/>
-          <w:spacing w:val="-7"/>
-          <w:sz w:val="20"/>
-        </w:rPr>
-        <w:t xml:space="preserve"> </w:t>
-      </w:r>
-      <w:r>
-        <w:rPr>
-          <w:color w:val="545454"/>
-          <w:sz w:val="20"/>
-        </w:rPr>
-        <w:t>не</w:t>
-      </w:r>
-      <w:r>
-        <w:rPr>
-          <w:color w:val="545454"/>
-          <w:spacing w:val="-7"/>
-          <w:sz w:val="20"/>
-        </w:rPr>
-        <w:t xml:space="preserve"> </w:t>
-      </w:r>
-      <w:r>
-        <w:rPr>
-          <w:color w:val="545454"/>
-          <w:sz w:val="20"/>
-        </w:rPr>
-        <w:t>имеет</w:t>
-      </w:r>
-      <w:r>
-        <w:rPr>
-          <w:color w:val="545454"/>
-          <w:spacing w:val="-7"/>
-          <w:sz w:val="20"/>
-        </w:rPr>
-        <w:t xml:space="preserve"> </w:t>
-      </w:r>
-      <w:r>
-        <w:rPr>
-          <w:color w:val="545454"/>
-          <w:sz w:val="20"/>
-        </w:rPr>
-        <w:t>права</w:t>
-      </w:r>
-      <w:r>
-        <w:rPr>
-          <w:color w:val="545454"/>
-          <w:spacing w:val="-7"/>
-          <w:sz w:val="20"/>
-        </w:rPr>
-        <w:t xml:space="preserve"> </w:t>
-      </w:r>
-      <w:r>
-        <w:rPr>
-          <w:color w:val="545454"/>
-          <w:sz w:val="20"/>
-        </w:rPr>
-        <w:t>передавать</w:t>
-      </w:r>
-      <w:r>
-        <w:rPr>
-          <w:color w:val="545454"/>
-          <w:spacing w:val="-7"/>
-          <w:sz w:val="20"/>
-        </w:rPr>
-        <w:t xml:space="preserve"> </w:t>
-      </w:r>
-      <w:r>
-        <w:rPr>
-          <w:color w:val="545454"/>
-          <w:sz w:val="20"/>
-        </w:rPr>
-        <w:t>автомобиль</w:t>
-      </w:r>
-      <w:r>
-        <w:rPr>
-          <w:color w:val="545454"/>
-          <w:spacing w:val="-7"/>
-          <w:sz w:val="20"/>
-        </w:rPr>
-        <w:t xml:space="preserve"> </w:t>
-      </w:r>
-      <w:r>
-        <w:rPr>
-          <w:color w:val="545454"/>
-          <w:sz w:val="20"/>
-        </w:rPr>
-        <w:t>третьим</w:t>
-      </w:r>
-      <w:r>
-        <w:rPr>
-          <w:color w:val="545454"/>
-          <w:spacing w:val="-7"/>
-          <w:sz w:val="20"/>
-        </w:rPr>
-        <w:t xml:space="preserve"> </w:t>
-      </w:r>
-      <w:r>
-        <w:rPr>
-          <w:color w:val="545454"/>
-          <w:sz w:val="20"/>
-        </w:rPr>
-        <w:t>лицам,</w:t>
-      </w:r>
-      <w:r>
-        <w:rPr>
-          <w:color w:val="545454"/>
-          <w:spacing w:val="-7"/>
-          <w:sz w:val="20"/>
-        </w:rPr>
-        <w:t xml:space="preserve"> </w:t>
-      </w:r>
-      <w:r>
-        <w:rPr>
-          <w:color w:val="545454"/>
-          <w:sz w:val="20"/>
-        </w:rPr>
-        <w:t>а также заключать с третьими лицами договоры перевозки, договоры субаренды, в ходе которых используется Автомобиль и иных договоров, противоречащих п.1.6 настоящего договора. Не использовать Автомобиль для буксировки автотранспорта, автогонок и подготовке к ним, езды по бездорожью, а также для обучения вождению.</w:t>
+        <w:t>Арендатор не имеет права передавать Автомобиль третьим лицам, а также заключать с третьими лицами договоры перевозки, договоры субаренды и иные договоры, в ходе которых используется Автомобиль, если это противоречит п. 1.6 настоящего договора.</w:t>
+      </w:r>
+      <w:r>
+        <w:rPr>
+          <w:color w:val="545454"/>
+          <w:sz w:val="20"/>
+        </w:rPr>
+        <w:t xml:space="preserve"> Не использовать Автомобиль для буксировки автотранспорта, автогонок и подготовке к ним, езды по бездорожью, а также для обучения вождению.</w:t>
       </w:r>
     </w:p>
     <w:p>
@@ -7732,152 +7379,10 @@
       <w:r>
         <w:rPr>
           <w:color w:val="545454"/>
-          <w:sz w:val="20"/>
-        </w:rPr>
-        <w:t>При продлении срока аренды Автомобиля, стороны заключают новый Договор аренды. В случае возможных</w:t>
-      </w:r>
-      <w:r>
-        <w:rPr>
-          <w:color w:val="545454"/>
-          <w:spacing w:val="-11"/>
-          <w:sz w:val="20"/>
-        </w:rPr>
-        <w:t xml:space="preserve"> </w:t>
-      </w:r>
-      <w:r>
-        <w:rPr>
-          <w:color w:val="545454"/>
-          <w:sz w:val="20"/>
-        </w:rPr>
-        <w:t>разночтений</w:t>
-      </w:r>
-      <w:r>
-        <w:rPr>
-          <w:color w:val="545454"/>
-          <w:spacing w:val="-11"/>
-          <w:sz w:val="20"/>
-        </w:rPr>
-        <w:t xml:space="preserve"> </w:t>
-      </w:r>
-      <w:r>
-        <w:rPr>
-          <w:color w:val="545454"/>
-          <w:sz w:val="20"/>
-        </w:rPr>
-        <w:t>срок</w:t>
-      </w:r>
-      <w:r>
-        <w:rPr>
-          <w:color w:val="545454"/>
-          <w:spacing w:val="-11"/>
-          <w:sz w:val="20"/>
-        </w:rPr>
-        <w:t xml:space="preserve"> </w:t>
-      </w:r>
-      <w:r>
-        <w:rPr>
-          <w:color w:val="545454"/>
-          <w:sz w:val="20"/>
-        </w:rPr>
-        <w:t>аренды</w:t>
-      </w:r>
-      <w:r>
-        <w:rPr>
-          <w:color w:val="545454"/>
-          <w:spacing w:val="-11"/>
-          <w:sz w:val="20"/>
-        </w:rPr>
-        <w:t xml:space="preserve"> </w:t>
-      </w:r>
-      <w:r>
-        <w:rPr>
-          <w:color w:val="545454"/>
-          <w:sz w:val="20"/>
-        </w:rPr>
-        <w:t>автомобиля</w:t>
-      </w:r>
-      <w:r>
-        <w:rPr>
-          <w:color w:val="545454"/>
-          <w:spacing w:val="-11"/>
-          <w:sz w:val="20"/>
-        </w:rPr>
-        <w:t xml:space="preserve"> </w:t>
-      </w:r>
-      <w:r>
-        <w:rPr>
-          <w:color w:val="545454"/>
-          <w:sz w:val="20"/>
-        </w:rPr>
-        <w:t>определяется</w:t>
-      </w:r>
-      <w:r>
-        <w:rPr>
-          <w:color w:val="545454"/>
-          <w:spacing w:val="-11"/>
-          <w:sz w:val="20"/>
-        </w:rPr>
-        <w:t xml:space="preserve"> </w:t>
-      </w:r>
-      <w:r>
-        <w:rPr>
-          <w:color w:val="545454"/>
-          <w:sz w:val="20"/>
-        </w:rPr>
-        <w:t>на</w:t>
-      </w:r>
-      <w:r>
-        <w:rPr>
-          <w:color w:val="545454"/>
-          <w:spacing w:val="-11"/>
-          <w:sz w:val="20"/>
-        </w:rPr>
-        <w:t xml:space="preserve"> </w:t>
-      </w:r>
-      <w:r>
-        <w:rPr>
-          <w:color w:val="545454"/>
-          <w:sz w:val="20"/>
-        </w:rPr>
-        <w:t>основании</w:t>
-      </w:r>
-      <w:r>
-        <w:rPr>
-          <w:color w:val="545454"/>
-          <w:spacing w:val="-11"/>
-          <w:sz w:val="20"/>
-        </w:rPr>
-        <w:t xml:space="preserve"> </w:t>
-      </w:r>
-      <w:r>
-        <w:rPr>
-          <w:color w:val="545454"/>
-          <w:sz w:val="20"/>
-        </w:rPr>
-        <w:t>Актов</w:t>
-      </w:r>
-      <w:r>
-        <w:rPr>
-          <w:color w:val="545454"/>
-          <w:spacing w:val="-11"/>
-          <w:sz w:val="20"/>
-        </w:rPr>
-        <w:t xml:space="preserve"> </w:t>
-      </w:r>
-      <w:r>
-        <w:rPr>
-          <w:color w:val="545454"/>
-          <w:sz w:val="20"/>
-        </w:rPr>
-        <w:t xml:space="preserve">приема-передачи </w:t>
-      </w:r>
-      <w:r>
-        <w:rPr>
-          <w:color w:val="545454"/>
           <w:spacing w:val="-2"/>
           <w:sz w:val="20"/>
         </w:rPr>
-        <w:t>Автомобиля.</w:t>
+        <w:t>При продлении срока аренды стороны фиксируют фактический срок пользования Автомобилем в акте возврата либо ином подписанном сторонами документе. В случае разночтений срок аренды определяется на основании подписанных сторонами актов приема-передачи и возврата Автомобиля.</w:t>
       </w:r>
     </w:p>
     <w:p>
@@ -8103,7 +7608,21 @@
           <w:color w:val="545454"/>
           <w:sz w:val="20"/>
         </w:rPr>
-        <w:t>с менеджером Компании.</w:t>
+        <w:t xml:space="preserve">с </w:t>
+      </w:r>
+      <w:r>
+        <w:rPr>
+          <w:color w:val="545454"/>
+          <w:sz w:val="20"/>
+        </w:rPr>
+        <w:t>Арендодателем</w:t>
+      </w:r>
+      <w:r>
+        <w:rPr>
+          <w:color w:val="545454"/>
+          <w:sz w:val="20"/>
+        </w:rPr>
+        <w:t>.</w:t>
       </w:r>
     </w:p>
     <w:p>
@@ -8713,7 +8232,21 @@
           <w:color w:val="545454"/>
           <w:sz w:val="20"/>
         </w:rPr>
-        <w:t>некорректного обращения с охранной системой. При выезде транспортного средства за пределы зоны эксплуатации двигатель так же блокируется. В этом случае необходимо связаться с менеджером компании для объяснения</w:t>
+        <w:t xml:space="preserve">некорректного обращения с охранной системой. При выезде транспортного средства за пределы зоны эксплуатации двигатель так же блокируется. В этом случае необходимо связаться с </w:t>
+      </w:r>
+      <w:r>
+        <w:rPr>
+          <w:color w:val="545454"/>
+          <w:sz w:val="20"/>
+        </w:rPr>
+        <w:t>Арендодателем</w:t>
+      </w:r>
+      <w:r>
+        <w:rPr>
+          <w:color w:val="545454"/>
+          <w:sz w:val="20"/>
+        </w:rPr>
+        <w:t xml:space="preserve"> для объяснения</w:t>
       </w:r>
       <w:r>
         <w:rPr>
@@ -9029,7 +8562,21 @@
           <w:color w:val="545454"/>
           <w:szCs w:val="22"/>
         </w:rPr>
-        <w:t>4.7.1. Арендатору устанавливается лимит пробега Автомобиля за весь срок аренды: {{allowed_mileage}}.</w:t>
+        <w:t>4.7.1. Арендатору устанавливается лимит пробега Автомобиля за весь срок аренды: {{allowed_mileage}}</w:t>
+      </w:r>
+      <w:r>
+        <w:rPr>
+          <w:color w:val="545454"/>
+          <w:szCs w:val="22"/>
+        </w:rPr>
+        <w:t xml:space="preserve"> км</w:t>
+      </w:r>
+      <w:r>
+        <w:rPr>
+          <w:color w:val="545454"/>
+          <w:szCs w:val="22"/>
+        </w:rPr>
+        <w:t>.</w:t>
       </w:r>
     </w:p>
     <w:p>
@@ -9061,7 +8608,37 @@
           <w:color w:val="545454"/>
           <w:szCs w:val="22"/>
         </w:rPr>
-        <w:t xml:space="preserve">: 250 км х количество полных </w:t>
+        <w:t xml:space="preserve">: </w:t>
+      </w:r>
+      <w:r>
+        <w:rPr>
+          <w:color w:val="545454"/>
+          <w:szCs w:val="22"/>
+        </w:rPr>
+        <w:t>{{</w:t>
+      </w:r>
+      <w:proofErr w:type="spellStart"/>
+      <w:r>
+        <w:rPr>
+          <w:color w:val="545454"/>
+          <w:szCs w:val="22"/>
+        </w:rPr>
+        <w:t>allowed_mileage</w:t>
+      </w:r>
+      <w:proofErr w:type="spellEnd"/>
+      <w:r>
+        <w:rPr>
+          <w:color w:val="545454"/>
+          <w:szCs w:val="22"/>
+        </w:rPr>
+        <w:t>}}</w:t>
+      </w:r>
+      <w:r>
+        <w:rPr>
+          <w:color w:val="545454"/>
+          <w:szCs w:val="22"/>
+        </w:rPr>
+        <w:t xml:space="preserve"> км х количество полных </w:t>
       </w:r>
       <w:r>
         <w:rPr>
@@ -9787,14 +9364,7 @@
           <w:color w:val="545454"/>
           <w:sz w:val="20"/>
         </w:rPr>
-        <w:t>независимой оценкой, заказ-нарядом СТО либо фактическими расходами на ремонт</w:t>
-      </w:r>
-      <w:r>
-        <w:rPr>
-          <w:color w:val="545454"/>
-          <w:sz w:val="20"/>
-        </w:rPr>
-        <w:t xml:space="preserve">. По соглашению сторон арендуемый автомобиль оценен в 1 </w:t>
+        <w:t xml:space="preserve">независимой оценкой, заказ-нарядом </w:t>
       </w:r>
       <w:r>
         <w:rPr>
@@ -9802,7 +9372,14 @@
           <w:sz w:val="20"/>
         </w:rPr>
         <w:lastRenderedPageBreak/>
-        <w:t>400 000 (один миллион четыреста тысяч) рублей. Данная оценка учитывается при возмещении ущерба.</w:t>
+        <w:t>СТО либо фактическими расходами на ремонт</w:t>
+      </w:r>
+      <w:r>
+        <w:rPr>
+          <w:color w:val="545454"/>
+          <w:sz w:val="20"/>
+        </w:rPr>
+        <w:t>. По соглашению сторон арендуемый автомобиль оценен в 1 400 000 (один миллион четыреста тысяч) рублей. Данная оценка учитывается при возмещении ущерба.</w:t>
       </w:r>
     </w:p>
     <w:p>
@@ -10628,6 +10205,12 @@
       <w:r>
         <w:rPr>
           <w:color w:val="545454"/>
+        </w:rPr>
+        <w:t>.</w:t>
+      </w:r>
+      <w:r>
+        <w:rPr>
+          <w:color w:val="545454"/>
           <w:spacing w:val="-10"/>
         </w:rPr>
         <w:t xml:space="preserve"> </w:t>
@@ -11032,6 +10615,12 @@
           <w:color w:val="545454"/>
         </w:rPr>
         <w:t>5.5</w:t>
+      </w:r>
+      <w:r>
+        <w:rPr>
+          <w:color w:val="545454"/>
+        </w:rPr>
+        <w:t>.</w:t>
       </w:r>
       <w:r>
         <w:rPr>
@@ -12627,7 +12216,21 @@
           <w:color w:val="545454"/>
           <w:sz w:val="20"/>
         </w:rPr>
-        <w:t>и наружной мойки в размере 1000 рублей. В случае сильного загрязнения салона Автомобиля Арендатор выплачивает Арендодателю стоимость химчистки салона в размере 6 000 руб.</w:t>
+        <w:t>и наружной мойки в размере 1</w:t>
+      </w:r>
+      <w:r>
+        <w:rPr>
+          <w:color w:val="545454"/>
+          <w:sz w:val="20"/>
+        </w:rPr>
+        <w:t>5</w:t>
+      </w:r>
+      <w:r>
+        <w:rPr>
+          <w:color w:val="545454"/>
+          <w:sz w:val="20"/>
+        </w:rPr>
+        <w:t>00 рублей. В случае сильного загрязнения салона Автомобиля Арендатор выплачивает Арендодателю стоимость химчистки салона в размере 6 000 руб.</w:t>
       </w:r>
     </w:p>
     <w:p>
@@ -12718,7 +12321,14 @@
           <w:color w:val="545454"/>
           <w:sz w:val="20"/>
         </w:rPr>
-        <w:t>п.4.1.14</w:t>
+        <w:t>п.4.1.1</w:t>
+      </w:r>
+      <w:r>
+        <w:rPr>
+          <w:color w:val="545454"/>
+          <w:sz w:val="20"/>
+        </w:rPr>
+        <w:t>3</w:t>
       </w:r>
       <w:r>
         <w:rPr>
@@ -13251,7 +12861,21 @@
           <w:color w:val="545454"/>
           <w:sz w:val="20"/>
         </w:rPr>
-        <w:t>за собою право потребовать возмещения ущерба по состоянию кузова автомобиля в течение 1 суток с момента сдачи Автомобиля Арендатором.</w:t>
+        <w:t>за собо</w:t>
+      </w:r>
+      <w:r>
+        <w:rPr>
+          <w:color w:val="545454"/>
+          <w:sz w:val="20"/>
+        </w:rPr>
+        <w:t>й</w:t>
+      </w:r>
+      <w:r>
+        <w:rPr>
+          <w:color w:val="545454"/>
+          <w:sz w:val="20"/>
+        </w:rPr>
+        <w:t xml:space="preserve"> право потребовать возмещения ущерба по состоянию кузова автомобиля в течение 1 суток с момента сдачи Автомобиля Арендатором.</w:t>
       </w:r>
     </w:p>
     <w:p>
@@ -13617,6 +13241,13 @@
           <w:sz w:val="20"/>
         </w:rPr>
         <w:t>д</w:t>
+      </w:r>
+      <w:r>
+        <w:rPr>
+          <w:color w:val="545454"/>
+          <w:sz w:val="20"/>
+        </w:rPr>
+        <w:t>.</w:t>
       </w:r>
       <w:r>
         <w:rPr>
@@ -15109,365 +14740,14 @@
         </w:tabs>
         <w:spacing w:before="80"/>
         <w:ind w:right="220" w:firstLine="0"/>
-        <w:rPr>
-          <w:sz w:val="20"/>
-        </w:rPr>
-      </w:pPr>
-      <w:r>
-        <w:rPr>
-          <w:color w:val="545454"/>
-          <w:sz w:val="20"/>
-        </w:rPr>
-        <w:t>Автомобиль застрахован на условиях ОСАГО. Страховая премия включена в тариф. Автомобиль застрахован</w:t>
-      </w:r>
-      <w:r>
-        <w:rPr>
-          <w:color w:val="545454"/>
-          <w:spacing w:val="-6"/>
-          <w:sz w:val="20"/>
-        </w:rPr>
-        <w:t xml:space="preserve"> </w:t>
-      </w:r>
-      <w:r>
-        <w:rPr>
-          <w:color w:val="545454"/>
-          <w:sz w:val="20"/>
-        </w:rPr>
-        <w:t>с</w:t>
-      </w:r>
-      <w:r>
-        <w:rPr>
-          <w:color w:val="545454"/>
-          <w:spacing w:val="-6"/>
-          <w:sz w:val="20"/>
-        </w:rPr>
-        <w:t xml:space="preserve"> </w:t>
-      </w:r>
-      <w:r>
-        <w:rPr>
-          <w:color w:val="545454"/>
-          <w:sz w:val="20"/>
-        </w:rPr>
-        <w:t>безусловной</w:t>
-      </w:r>
-      <w:r>
-        <w:rPr>
-          <w:color w:val="545454"/>
-          <w:spacing w:val="-6"/>
-          <w:sz w:val="20"/>
-        </w:rPr>
-        <w:t xml:space="preserve"> </w:t>
-      </w:r>
-      <w:r>
-        <w:rPr>
-          <w:color w:val="545454"/>
-          <w:sz w:val="20"/>
-        </w:rPr>
-        <w:t>франшизой</w:t>
-      </w:r>
-      <w:r>
-        <w:rPr>
-          <w:color w:val="545454"/>
-          <w:spacing w:val="-6"/>
-          <w:sz w:val="20"/>
-        </w:rPr>
-        <w:t xml:space="preserve"> </w:t>
-      </w:r>
-      <w:r>
-        <w:rPr>
-          <w:color w:val="545454"/>
-          <w:sz w:val="20"/>
-        </w:rPr>
-        <w:t>0</w:t>
-      </w:r>
-      <w:r>
-        <w:rPr>
-          <w:color w:val="545454"/>
-          <w:spacing w:val="-6"/>
-          <w:sz w:val="20"/>
-        </w:rPr>
-        <w:t xml:space="preserve"> </w:t>
-      </w:r>
-      <w:r>
-        <w:rPr>
-          <w:color w:val="545454"/>
-          <w:sz w:val="20"/>
-        </w:rPr>
-        <w:t>руб.</w:t>
-      </w:r>
-      <w:r>
-        <w:rPr>
-          <w:color w:val="545454"/>
-          <w:spacing w:val="-6"/>
-          <w:sz w:val="20"/>
-        </w:rPr>
-        <w:t xml:space="preserve"> </w:t>
-      </w:r>
-      <w:r>
-        <w:rPr>
-          <w:color w:val="545454"/>
-          <w:sz w:val="20"/>
-        </w:rPr>
-        <w:t>при</w:t>
-      </w:r>
-      <w:r>
-        <w:rPr>
-          <w:color w:val="545454"/>
-          <w:spacing w:val="-6"/>
-          <w:sz w:val="20"/>
-        </w:rPr>
-        <w:t xml:space="preserve"> </w:t>
-      </w:r>
-      <w:r>
-        <w:rPr>
-          <w:color w:val="545454"/>
-          <w:sz w:val="20"/>
-        </w:rPr>
-        <w:t>наличии</w:t>
-      </w:r>
-      <w:r>
-        <w:rPr>
-          <w:color w:val="545454"/>
-          <w:spacing w:val="-6"/>
-          <w:sz w:val="20"/>
-        </w:rPr>
-        <w:t xml:space="preserve"> </w:t>
-      </w:r>
-      <w:r>
-        <w:rPr>
-          <w:color w:val="545454"/>
-          <w:sz w:val="20"/>
-        </w:rPr>
-        <w:t>справок</w:t>
-      </w:r>
-      <w:r>
-        <w:rPr>
-          <w:color w:val="545454"/>
-          <w:spacing w:val="-6"/>
-          <w:sz w:val="20"/>
-        </w:rPr>
-        <w:t xml:space="preserve"> </w:t>
-      </w:r>
-      <w:r>
-        <w:rPr>
-          <w:color w:val="545454"/>
-          <w:sz w:val="20"/>
-        </w:rPr>
-        <w:t>по</w:t>
-      </w:r>
-      <w:r>
-        <w:rPr>
-          <w:color w:val="545454"/>
-          <w:spacing w:val="-6"/>
-          <w:sz w:val="20"/>
-        </w:rPr>
-        <w:t xml:space="preserve"> </w:t>
-      </w:r>
-      <w:r>
-        <w:rPr>
-          <w:color w:val="545454"/>
-          <w:sz w:val="20"/>
-        </w:rPr>
-        <w:t>форме</w:t>
-      </w:r>
-      <w:r>
-        <w:rPr>
-          <w:color w:val="545454"/>
-          <w:spacing w:val="-6"/>
-          <w:sz w:val="20"/>
-        </w:rPr>
-        <w:t xml:space="preserve"> </w:t>
-      </w:r>
-      <w:r>
-        <w:rPr>
-          <w:color w:val="545454"/>
-          <w:sz w:val="20"/>
-        </w:rPr>
-        <w:t>№</w:t>
-      </w:r>
-      <w:r>
-        <w:rPr>
-          <w:color w:val="545454"/>
-          <w:spacing w:val="-6"/>
-          <w:sz w:val="20"/>
-        </w:rPr>
-        <w:t xml:space="preserve"> </w:t>
-      </w:r>
-      <w:r>
-        <w:rPr>
-          <w:color w:val="545454"/>
-          <w:sz w:val="20"/>
-        </w:rPr>
-        <w:t>154</w:t>
-      </w:r>
-      <w:r>
-        <w:rPr>
-          <w:color w:val="545454"/>
-          <w:spacing w:val="-6"/>
-          <w:sz w:val="20"/>
-        </w:rPr>
-        <w:t xml:space="preserve"> </w:t>
-      </w:r>
-      <w:r>
-        <w:rPr>
-          <w:color w:val="545454"/>
-          <w:sz w:val="20"/>
-        </w:rPr>
-        <w:t>(форма</w:t>
-      </w:r>
-      <w:r>
-        <w:rPr>
-          <w:color w:val="545454"/>
-          <w:spacing w:val="-6"/>
-          <w:sz w:val="20"/>
-        </w:rPr>
-        <w:t xml:space="preserve"> </w:t>
-      </w:r>
-      <w:r>
-        <w:rPr>
-          <w:color w:val="545454"/>
-          <w:sz w:val="20"/>
-        </w:rPr>
-        <w:t>от</w:t>
-      </w:r>
-      <w:r>
-        <w:rPr>
-          <w:color w:val="545454"/>
-          <w:spacing w:val="-6"/>
-          <w:sz w:val="20"/>
-        </w:rPr>
-        <w:t xml:space="preserve"> </w:t>
-      </w:r>
-      <w:r>
-        <w:rPr>
-          <w:color w:val="545454"/>
-          <w:sz w:val="20"/>
-        </w:rPr>
-        <w:t>01.04.2011),</w:t>
-      </w:r>
-    </w:p>
-    <w:p>
-      <w:pPr>
-        <w:pStyle w:val="a3"/>
-      </w:pPr>
-      <w:r>
-        <w:rPr>
-          <w:color w:val="545454"/>
-        </w:rPr>
-        <w:t>№</w:t>
-      </w:r>
-      <w:r>
-        <w:rPr>
-          <w:color w:val="545454"/>
-          <w:spacing w:val="-12"/>
-        </w:rPr>
-        <w:t xml:space="preserve"> </w:t>
-      </w:r>
-      <w:r>
-        <w:rPr>
-          <w:color w:val="545454"/>
-        </w:rPr>
-        <w:t>3,</w:t>
-      </w:r>
-      <w:r>
-        <w:rPr>
-          <w:color w:val="545454"/>
-          <w:spacing w:val="-10"/>
-        </w:rPr>
-        <w:t xml:space="preserve"> </w:t>
-      </w:r>
-      <w:r>
-        <w:rPr>
-          <w:color w:val="545454"/>
-        </w:rPr>
-        <w:t>протоколов,</w:t>
-      </w:r>
-      <w:r>
-        <w:rPr>
-          <w:color w:val="545454"/>
-          <w:spacing w:val="-10"/>
-        </w:rPr>
-        <w:t xml:space="preserve"> </w:t>
-      </w:r>
-      <w:r>
-        <w:rPr>
-          <w:color w:val="545454"/>
-        </w:rPr>
-        <w:t>постановлений</w:t>
-      </w:r>
-      <w:r>
-        <w:rPr>
-          <w:color w:val="545454"/>
-          <w:spacing w:val="-9"/>
-        </w:rPr>
-        <w:t xml:space="preserve"> </w:t>
-      </w:r>
-      <w:r>
-        <w:rPr>
-          <w:color w:val="545454"/>
-        </w:rPr>
-        <w:t>и</w:t>
-      </w:r>
-      <w:r>
-        <w:rPr>
-          <w:color w:val="545454"/>
-          <w:spacing w:val="-10"/>
-        </w:rPr>
-        <w:t xml:space="preserve"> </w:t>
-      </w:r>
-      <w:r>
-        <w:rPr>
-          <w:color w:val="545454"/>
-        </w:rPr>
-        <w:t>определений</w:t>
-      </w:r>
-      <w:r>
-        <w:rPr>
-          <w:color w:val="545454"/>
-          <w:spacing w:val="-10"/>
-        </w:rPr>
-        <w:t xml:space="preserve"> </w:t>
-      </w:r>
-      <w:r>
-        <w:rPr>
-          <w:color w:val="545454"/>
-        </w:rPr>
-        <w:t>органами</w:t>
-      </w:r>
-      <w:r>
-        <w:rPr>
-          <w:color w:val="545454"/>
-          <w:spacing w:val="-10"/>
-        </w:rPr>
-        <w:t xml:space="preserve"> </w:t>
-      </w:r>
-      <w:r>
-        <w:rPr>
-          <w:color w:val="545454"/>
-        </w:rPr>
-        <w:t>МВД</w:t>
-      </w:r>
-      <w:r>
-        <w:rPr>
-          <w:color w:val="545454"/>
-          <w:spacing w:val="-9"/>
-        </w:rPr>
-        <w:t xml:space="preserve"> </w:t>
-      </w:r>
-      <w:r>
-        <w:rPr>
-          <w:color w:val="545454"/>
-          <w:spacing w:val="-5"/>
-        </w:rPr>
-        <w:t>РФ.</w:t>
-      </w:r>
-    </w:p>
-    <w:p>
-      <w:pPr>
-        <w:pStyle w:val="a3"/>
-        <w:spacing w:before="10"/>
-        <w:ind w:left="0"/>
-      </w:pPr>
+      </w:pPr>
+      <w:r>
+        <w:rPr>
+          <w:color w:val="545454"/>
+          <w:sz w:val="20"/>
+        </w:rPr>
+        <w:t>Автомобиль застрахован по договору ОСАГО. Страховая премия включена в тариф аренды.</w:t>
+      </w:r>
     </w:p>
     <w:p>
       <w:pPr>
@@ -21464,7 +20744,24 @@
                 <w:sz w:val="20"/>
                 <w:lang w:val="en-US"/>
               </w:rPr>
-              <w:t>}}; Email: {{</w:t>
+              <w:t>}}</w:t>
+            </w:r>
+          </w:p>
+          <w:p>
+            <w:pPr>
+              <w:rPr>
+                <w:color w:val="545454"/>
+                <w:sz w:val="20"/>
+                <w:lang w:val="en-US"/>
+              </w:rPr>
+            </w:pPr>
+            <w:r>
+              <w:rPr>
+                <w:color w:val="545454"/>
+                <w:sz w:val="20"/>
+                <w:lang w:val="en-US"/>
+              </w:rPr>
+              <w:t>Email: {{</w:t>
             </w:r>
             <w:proofErr w:type="spellStart"/>
             <w:r>
@@ -21484,33 +20781,6 @@
               </w:rPr>
               <w:t>}}</w:t>
             </w:r>
-          </w:p>
-          <w:p>
-            <w:pPr>
-              <w:rPr>
-                <w:color w:val="545454"/>
-                <w:sz w:val="20"/>
-                <w:lang w:val="en-US"/>
-              </w:rPr>
-            </w:pPr>
-            <w:r>
-              <w:rPr>
-                <w:color w:val="545454"/>
-                <w:sz w:val="20"/>
-                <w:lang w:val="en-US"/>
-              </w:rPr>
-              <w:t xml:space="preserve">Email: </w:t>
-            </w:r>
-            <w:hyperlink r:id="rId6" w:history="1">
-              <w:r>
-                <w:rPr>
-                  <w:color w:val="545454"/>
-                  <w:sz w:val="20"/>
-                  <w:lang w:val="en-US"/>
-                </w:rPr>
-                <w:t>den240388@mail.ru</w:t>
-              </w:r>
-            </w:hyperlink>
           </w:p>
           <w:p>
             <w:pPr>
@@ -22111,12 +21381,18 @@
     <w:p>
       <w:pPr>
         <w:pStyle w:val="1"/>
+        <w:rPr>
+          <w:sz w:val="24"/>
+          <w:szCs w:val="24"/>
+        </w:rPr>
       </w:pPr>
       <w:bookmarkStart w:id="11" w:name="Приложение_№_1_к_договору_аренды_автомоб"/>
       <w:bookmarkEnd w:id="11"/>
       <w:r>
         <w:rPr>
           <w:color w:val="1D2021"/>
+          <w:sz w:val="24"/>
+          <w:szCs w:val="24"/>
         </w:rPr>
         <w:lastRenderedPageBreak/>
         <w:t>Приложение</w:t>
@@ -22125,12 +21401,16 @@
         <w:rPr>
           <w:color w:val="1D2021"/>
           <w:spacing w:val="-12"/>
+          <w:sz w:val="24"/>
+          <w:szCs w:val="24"/>
         </w:rPr>
         <w:t xml:space="preserve"> </w:t>
       </w:r>
       <w:r>
         <w:rPr>
           <w:color w:val="1D2021"/>
+          <w:sz w:val="24"/>
+          <w:szCs w:val="24"/>
         </w:rPr>
         <w:t>№</w:t>
       </w:r>
@@ -22138,12 +21418,16 @@
         <w:rPr>
           <w:color w:val="1D2021"/>
           <w:spacing w:val="-10"/>
+          <w:sz w:val="24"/>
+          <w:szCs w:val="24"/>
         </w:rPr>
         <w:t xml:space="preserve"> </w:t>
       </w:r>
       <w:r>
         <w:rPr>
           <w:color w:val="1D2021"/>
+          <w:sz w:val="24"/>
+          <w:szCs w:val="24"/>
         </w:rPr>
         <w:t>1</w:t>
       </w:r>
@@ -22151,12 +21435,16 @@
         <w:rPr>
           <w:color w:val="1D2021"/>
           <w:spacing w:val="-10"/>
+          <w:sz w:val="24"/>
+          <w:szCs w:val="24"/>
         </w:rPr>
         <w:t xml:space="preserve"> </w:t>
       </w:r>
       <w:r>
         <w:rPr>
           <w:color w:val="1D2021"/>
+          <w:sz w:val="24"/>
+          <w:szCs w:val="24"/>
         </w:rPr>
         <w:t>к</w:t>
       </w:r>
@@ -22164,12 +21452,16 @@
         <w:rPr>
           <w:color w:val="1D2021"/>
           <w:spacing w:val="-10"/>
+          <w:sz w:val="24"/>
+          <w:szCs w:val="24"/>
         </w:rPr>
         <w:t xml:space="preserve"> </w:t>
       </w:r>
       <w:r>
         <w:rPr>
           <w:color w:val="1D2021"/>
+          <w:sz w:val="24"/>
+          <w:szCs w:val="24"/>
         </w:rPr>
         <w:t>договору</w:t>
       </w:r>
@@ -22177,12 +21469,16 @@
         <w:rPr>
           <w:color w:val="1D2021"/>
           <w:spacing w:val="-10"/>
+          <w:sz w:val="24"/>
+          <w:szCs w:val="24"/>
         </w:rPr>
         <w:t xml:space="preserve"> </w:t>
       </w:r>
       <w:r>
         <w:rPr>
           <w:color w:val="1D2021"/>
+          <w:sz w:val="24"/>
+          <w:szCs w:val="24"/>
         </w:rPr>
         <w:t>аренды</w:t>
       </w:r>
@@ -22190,12 +21486,16 @@
         <w:rPr>
           <w:color w:val="1D2021"/>
           <w:spacing w:val="-10"/>
+          <w:sz w:val="24"/>
+          <w:szCs w:val="24"/>
         </w:rPr>
         <w:t xml:space="preserve"> </w:t>
       </w:r>
       <w:r>
         <w:rPr>
           <w:color w:val="1D2021"/>
+          <w:sz w:val="24"/>
+          <w:szCs w:val="24"/>
         </w:rPr>
         <w:t>автомобиля</w:t>
       </w:r>
@@ -22203,12 +21503,16 @@
         <w:rPr>
           <w:color w:val="1D2021"/>
           <w:spacing w:val="-10"/>
+          <w:sz w:val="24"/>
+          <w:szCs w:val="24"/>
         </w:rPr>
         <w:t xml:space="preserve"> </w:t>
       </w:r>
       <w:r>
         <w:rPr>
           <w:color w:val="1D2021"/>
+          <w:sz w:val="24"/>
+          <w:szCs w:val="24"/>
         </w:rPr>
         <w:t>без</w:t>
       </w:r>
@@ -22216,6 +21520,8 @@
         <w:rPr>
           <w:color w:val="1D2021"/>
           <w:spacing w:val="-10"/>
+          <w:sz w:val="24"/>
+          <w:szCs w:val="24"/>
         </w:rPr>
         <w:t xml:space="preserve"> </w:t>
       </w:r>
@@ -22223,8 +21529,63 @@
         <w:rPr>
           <w:color w:val="1D2021"/>
           <w:spacing w:val="-2"/>
+          <w:sz w:val="24"/>
+          <w:szCs w:val="24"/>
         </w:rPr>
         <w:t>экипажа</w:t>
+      </w:r>
+      <w:r>
+        <w:rPr>
+          <w:color w:val="1D2021"/>
+          <w:spacing w:val="-2"/>
+          <w:sz w:val="24"/>
+          <w:szCs w:val="24"/>
+        </w:rPr>
+        <w:t xml:space="preserve"> </w:t>
+      </w:r>
+      <w:r>
+        <w:rPr>
+          <w:color w:val="1D2021"/>
+          <w:sz w:val="24"/>
+          <w:szCs w:val="24"/>
+        </w:rPr>
+        <w:t>№ {{</w:t>
+      </w:r>
+      <w:proofErr w:type="spellStart"/>
+      <w:r>
+        <w:rPr>
+          <w:color w:val="1D2021"/>
+          <w:sz w:val="24"/>
+          <w:szCs w:val="24"/>
+        </w:rPr>
+        <w:t>contract_number</w:t>
+      </w:r>
+      <w:proofErr w:type="spellEnd"/>
+      <w:r>
+        <w:rPr>
+          <w:color w:val="1D2021"/>
+          <w:sz w:val="24"/>
+          <w:szCs w:val="24"/>
+        </w:rPr>
+        <w:t>}} от {{</w:t>
+      </w:r>
+      <w:proofErr w:type="spellStart"/>
+      <w:r>
+        <w:rPr>
+          <w:color w:val="1D2021"/>
+          <w:sz w:val="24"/>
+          <w:szCs w:val="24"/>
+        </w:rPr>
+        <w:t>contract_date</w:t>
+      </w:r>
+      <w:proofErr w:type="spellEnd"/>
+      <w:r>
+        <w:rPr>
+          <w:color w:val="1D2021"/>
+          <w:sz w:val="24"/>
+          <w:szCs w:val="24"/>
+        </w:rPr>
+        <w:t>}}</w:t>
       </w:r>
     </w:p>
     <w:p>
@@ -22252,7 +21613,19 @@
         <w:rPr>
           <w:color w:val="1D2021"/>
         </w:rPr>
-        <w:t>приема/передачи</w:t>
+        <w:t>приема</w:t>
+      </w:r>
+      <w:r>
+        <w:rPr>
+          <w:color w:val="1D2021"/>
+        </w:rPr>
+        <w:t>-</w:t>
+      </w:r>
+      <w:r>
+        <w:rPr>
+          <w:color w:val="1D2021"/>
+        </w:rPr>
+        <w:t>передачи</w:t>
       </w:r>
       <w:r>
         <w:rPr>
@@ -22526,7 +21899,73 @@
         <w:rPr>
           <w:color w:val="545454"/>
         </w:rPr>
-        <w:t>по договору аренды № {{contract_number}} между: {{owner_full_name}}, именуемый в дальнейшем «Арендодатель», с одной стороны, и {{client_full_name}} именуемый(ая) в дальнейшем «Арендатор», с другой стороны, о том, что «Арендодатель» передает, «Арендатор» принимает автомобиль в исправном техническом состоянии и следующей комплектации, а именно:</w:t>
+        <w:t>{{</w:t>
+      </w:r>
+      <w:proofErr w:type="spellStart"/>
+      <w:r>
+        <w:rPr>
+          <w:color w:val="545454"/>
+        </w:rPr>
+        <w:t>owner_full_name</w:t>
+      </w:r>
+      <w:proofErr w:type="spellEnd"/>
+      <w:r>
+        <w:rPr>
+          <w:color w:val="545454"/>
+        </w:rPr>
+        <w:t>}}, именуемый в дальнейшем «Арендодатель», с одной стороны, и {{</w:t>
+      </w:r>
+      <w:proofErr w:type="spellStart"/>
+      <w:r>
+        <w:rPr>
+          <w:color w:val="545454"/>
+        </w:rPr>
+        <w:t>client_full_name</w:t>
+      </w:r>
+      <w:proofErr w:type="spellEnd"/>
+      <w:r>
+        <w:rPr>
+          <w:color w:val="545454"/>
+        </w:rPr>
+        <w:t>}}</w:t>
+      </w:r>
+      <w:r>
+        <w:rPr>
+          <w:color w:val="545454"/>
+        </w:rPr>
+        <w:t>,</w:t>
+      </w:r>
+      <w:r>
+        <w:rPr>
+          <w:color w:val="545454"/>
+        </w:rPr>
+        <w:t xml:space="preserve"> </w:t>
+      </w:r>
+      <w:r>
+        <w:rPr>
+          <w:color w:val="545454"/>
+        </w:rPr>
+        <w:t>{{</w:t>
+      </w:r>
+      <w:proofErr w:type="spellStart"/>
+      <w:r>
+        <w:rPr>
+          <w:color w:val="545454"/>
+        </w:rPr>
+        <w:t>client_named_as</w:t>
+      </w:r>
+      <w:proofErr w:type="spellEnd"/>
+      <w:r>
+        <w:rPr>
+          <w:color w:val="545454"/>
+        </w:rPr>
+        <w:t>}}</w:t>
+      </w:r>
+      <w:r>
+        <w:rPr>
+          <w:color w:val="545454"/>
+        </w:rPr>
+        <w:t xml:space="preserve"> в дальнейшем «Арендатор», с другой стороны, о том, что «Арендодатель» передает, «Арендатор» принимает автомобиль в исправном техническом состоянии и следующей комплектации, а именно:</w:t>
       </w:r>
     </w:p>
     <w:p>
@@ -23910,7 +23349,7 @@
           <w:noProof/>
         </w:rPr>
         <w:drawing>
-          <wp:inline distT="0" distB="0" distL="0" distR="0" wp14:anchorId="7C98B34D" wp14:editId="55FC2203">
+          <wp:inline distT="0" distB="0" distL="0" distR="0" wp14:anchorId="7C98B34D" wp14:editId="30333894">
             <wp:extent cx="4733925" cy="5653504"/>
             <wp:effectExtent l="0" t="0" r="0" b="4445"/>
             <wp:docPr id="27" name="Рисунок 27"/>
@@ -23925,7 +23364,7 @@
                     <pic:cNvPicPr/>
                   </pic:nvPicPr>
                   <pic:blipFill>
-                    <a:blip r:embed="rId7" cstate="print">
+                    <a:blip r:embed="rId6" cstate="print">
                       <a:extLst>
                         <a:ext uri="{28A0092B-C50C-407E-A947-70E740481C1C}">
                           <a14:useLocalDpi xmlns:a14="http://schemas.microsoft.com/office/drawing/2010/main" val="0"/>
@@ -25394,12 +24833,18 @@
       <w:pPr>
         <w:pStyle w:val="1"/>
         <w:spacing w:before="55"/>
+        <w:rPr>
+          <w:sz w:val="24"/>
+          <w:szCs w:val="24"/>
+        </w:rPr>
       </w:pPr>
       <w:bookmarkStart w:id="13" w:name="Приложение_№_2_к_договору_аренды_автомоб"/>
       <w:bookmarkEnd w:id="13"/>
       <w:r>
         <w:rPr>
           <w:color w:val="1D2021"/>
+          <w:sz w:val="24"/>
+          <w:szCs w:val="24"/>
         </w:rPr>
         <w:t>Приложение</w:t>
       </w:r>
@@ -25407,12 +24852,16 @@
         <w:rPr>
           <w:color w:val="1D2021"/>
           <w:spacing w:val="-12"/>
+          <w:sz w:val="24"/>
+          <w:szCs w:val="24"/>
         </w:rPr>
         <w:t xml:space="preserve"> </w:t>
       </w:r>
       <w:r>
         <w:rPr>
           <w:color w:val="1D2021"/>
+          <w:sz w:val="24"/>
+          <w:szCs w:val="24"/>
         </w:rPr>
         <w:t>№</w:t>
       </w:r>
@@ -25420,12 +24869,16 @@
         <w:rPr>
           <w:color w:val="1D2021"/>
           <w:spacing w:val="-10"/>
+          <w:sz w:val="24"/>
+          <w:szCs w:val="24"/>
         </w:rPr>
         <w:t xml:space="preserve"> </w:t>
       </w:r>
       <w:r>
         <w:rPr>
           <w:color w:val="1D2021"/>
+          <w:sz w:val="24"/>
+          <w:szCs w:val="24"/>
         </w:rPr>
         <w:t>2</w:t>
       </w:r>
@@ -25433,12 +24886,16 @@
         <w:rPr>
           <w:color w:val="1D2021"/>
           <w:spacing w:val="-10"/>
+          <w:sz w:val="24"/>
+          <w:szCs w:val="24"/>
         </w:rPr>
         <w:t xml:space="preserve"> </w:t>
       </w:r>
       <w:r>
         <w:rPr>
           <w:color w:val="1D2021"/>
+          <w:sz w:val="24"/>
+          <w:szCs w:val="24"/>
         </w:rPr>
         <w:t>к</w:t>
       </w:r>
@@ -25446,12 +24903,16 @@
         <w:rPr>
           <w:color w:val="1D2021"/>
           <w:spacing w:val="-10"/>
+          <w:sz w:val="24"/>
+          <w:szCs w:val="24"/>
         </w:rPr>
         <w:t xml:space="preserve"> </w:t>
       </w:r>
       <w:r>
         <w:rPr>
           <w:color w:val="1D2021"/>
+          <w:sz w:val="24"/>
+          <w:szCs w:val="24"/>
         </w:rPr>
         <w:t>договору</w:t>
       </w:r>
@@ -25459,12 +24920,16 @@
         <w:rPr>
           <w:color w:val="1D2021"/>
           <w:spacing w:val="-10"/>
+          <w:sz w:val="24"/>
+          <w:szCs w:val="24"/>
         </w:rPr>
         <w:t xml:space="preserve"> </w:t>
       </w:r>
       <w:r>
         <w:rPr>
           <w:color w:val="1D2021"/>
+          <w:sz w:val="24"/>
+          <w:szCs w:val="24"/>
         </w:rPr>
         <w:t>аренды</w:t>
       </w:r>
@@ -25472,12 +24937,16 @@
         <w:rPr>
           <w:color w:val="1D2021"/>
           <w:spacing w:val="-10"/>
+          <w:sz w:val="24"/>
+          <w:szCs w:val="24"/>
         </w:rPr>
         <w:t xml:space="preserve"> </w:t>
       </w:r>
       <w:r>
         <w:rPr>
           <w:color w:val="1D2021"/>
+          <w:sz w:val="24"/>
+          <w:szCs w:val="24"/>
         </w:rPr>
         <w:t>автомобиля</w:t>
       </w:r>
@@ -25485,12 +24954,16 @@
         <w:rPr>
           <w:color w:val="1D2021"/>
           <w:spacing w:val="-10"/>
+          <w:sz w:val="24"/>
+          <w:szCs w:val="24"/>
         </w:rPr>
         <w:t xml:space="preserve"> </w:t>
       </w:r>
       <w:r>
         <w:rPr>
           <w:color w:val="1D2021"/>
+          <w:sz w:val="24"/>
+          <w:szCs w:val="24"/>
         </w:rPr>
         <w:t>без</w:t>
       </w:r>
@@ -25498,6 +24971,8 @@
         <w:rPr>
           <w:color w:val="1D2021"/>
           <w:spacing w:val="-10"/>
+          <w:sz w:val="24"/>
+          <w:szCs w:val="24"/>
         </w:rPr>
         <w:t xml:space="preserve"> </w:t>
       </w:r>
@@ -25505,8 +24980,63 @@
         <w:rPr>
           <w:color w:val="1D2021"/>
           <w:spacing w:val="-2"/>
+          <w:sz w:val="24"/>
+          <w:szCs w:val="24"/>
         </w:rPr>
         <w:t>экипажа</w:t>
+      </w:r>
+      <w:r>
+        <w:rPr>
+          <w:color w:val="1D2021"/>
+          <w:spacing w:val="-2"/>
+          <w:sz w:val="24"/>
+          <w:szCs w:val="24"/>
+        </w:rPr>
+        <w:t xml:space="preserve"> </w:t>
+      </w:r>
+      <w:r>
+        <w:rPr>
+          <w:color w:val="1D2021"/>
+          <w:sz w:val="24"/>
+          <w:szCs w:val="24"/>
+        </w:rPr>
+        <w:t>№ {{</w:t>
+      </w:r>
+      <w:proofErr w:type="spellStart"/>
+      <w:r>
+        <w:rPr>
+          <w:color w:val="1D2021"/>
+          <w:sz w:val="24"/>
+          <w:szCs w:val="24"/>
+        </w:rPr>
+        <w:t>contract_number</w:t>
+      </w:r>
+      <w:proofErr w:type="spellEnd"/>
+      <w:r>
+        <w:rPr>
+          <w:color w:val="1D2021"/>
+          <w:sz w:val="24"/>
+          <w:szCs w:val="24"/>
+        </w:rPr>
+        <w:t>}} от {{</w:t>
+      </w:r>
+      <w:proofErr w:type="spellStart"/>
+      <w:r>
+        <w:rPr>
+          <w:color w:val="1D2021"/>
+          <w:sz w:val="24"/>
+          <w:szCs w:val="24"/>
+        </w:rPr>
+        <w:t>contract_date</w:t>
+      </w:r>
+      <w:proofErr w:type="spellEnd"/>
+      <w:r>
+        <w:rPr>
+          <w:color w:val="1D2021"/>
+          <w:sz w:val="24"/>
+          <w:szCs w:val="24"/>
+        </w:rPr>
+        <w:t>}}</w:t>
       </w:r>
     </w:p>
     <w:p>
@@ -25553,7 +25083,59 @@
         <w:rPr>
           <w:color w:val="545454"/>
         </w:rPr>
-        <w:t>{{owner_full_name}}, именуемый в дальнейшем «Арендодатель», с одной стороны, и {{client_full_name}} именуемый(ая) в дальнейшем «Арендатор», с другой стороны, совместно именуемые «Стороны», договорились о нижеследующем:</w:t>
+        <w:t>{{owner_full_name}}, именуемый в дальнейшем «Арендодатель», с одной стороны, и {{</w:t>
+      </w:r>
+      <w:proofErr w:type="spellStart"/>
+      <w:r>
+        <w:rPr>
+          <w:color w:val="545454"/>
+        </w:rPr>
+        <w:t>client_full_name</w:t>
+      </w:r>
+      <w:proofErr w:type="spellEnd"/>
+      <w:r>
+        <w:rPr>
+          <w:color w:val="545454"/>
+        </w:rPr>
+        <w:t>}}</w:t>
+      </w:r>
+      <w:r>
+        <w:rPr>
+          <w:color w:val="545454"/>
+        </w:rPr>
+        <w:t xml:space="preserve">, </w:t>
+      </w:r>
+      <w:r>
+        <w:rPr>
+          <w:color w:val="545454"/>
+        </w:rPr>
+        <w:t>{{</w:t>
+      </w:r>
+      <w:proofErr w:type="spellStart"/>
+      <w:r>
+        <w:rPr>
+          <w:color w:val="545454"/>
+        </w:rPr>
+        <w:t>client_named_as</w:t>
+      </w:r>
+      <w:proofErr w:type="spellEnd"/>
+      <w:r>
+        <w:rPr>
+          <w:color w:val="545454"/>
+        </w:rPr>
+        <w:t>}}</w:t>
+      </w:r>
+      <w:r>
+        <w:rPr>
+          <w:color w:val="545454"/>
+        </w:rPr>
+        <w:t xml:space="preserve"> </w:t>
+      </w:r>
+      <w:r>
+        <w:rPr>
+          <w:color w:val="545454"/>
+        </w:rPr>
+        <w:t>в дальнейшем «Арендатор», с другой стороны, совместно именуемые «Стороны», договорились о нижеследующем:</w:t>
       </w:r>
     </w:p>
     <w:p>
@@ -26090,15 +25672,14 @@
         <w:rPr>
           <w:color w:val="545454"/>
         </w:rPr>
-        <w:t>срок компенсировать их, уплатив неустойку в размере 10% от суммы взысканий. Если Арендатор нарушает данный пункт, то Арендатор имеет право обратиться в суд.</w:t>
-      </w:r>
-    </w:p>
-    <w:p>
-      <w:pPr>
-        <w:pStyle w:val="a3"/>
-        <w:spacing w:before="10"/>
-        <w:ind w:left="0"/>
-      </w:pPr>
+        <w:t xml:space="preserve">срок компенсировать их, уплатив неустойку в размере 10% от суммы взысканий. </w:t>
+      </w:r>
+      <w:r>
+        <w:rPr>
+          <w:color w:val="545454"/>
+        </w:rPr>
+        <w:t>В случае нарушения Арендатором данного пункта Арендодатель вправе обратиться в суд для взыскания задолженности, неустойки и иных предусмотренных договором сумм.</w:t>
+      </w:r>
     </w:p>
     <w:p>
       <w:pPr>
@@ -27252,12 +26833,18 @@
     <w:p>
       <w:pPr>
         <w:pStyle w:val="1"/>
+        <w:rPr>
+          <w:sz w:val="24"/>
+          <w:szCs w:val="24"/>
+        </w:rPr>
       </w:pPr>
       <w:bookmarkStart w:id="16" w:name="Приложение_№_3_к_договору_аренды_автомоб"/>
       <w:bookmarkEnd w:id="16"/>
       <w:r>
         <w:rPr>
           <w:color w:val="1D2021"/>
+          <w:sz w:val="24"/>
+          <w:szCs w:val="24"/>
         </w:rPr>
         <w:lastRenderedPageBreak/>
         <w:t>Приложение</w:t>
@@ -27266,12 +26853,16 @@
         <w:rPr>
           <w:color w:val="1D2021"/>
           <w:spacing w:val="-12"/>
+          <w:sz w:val="24"/>
+          <w:szCs w:val="24"/>
         </w:rPr>
         <w:t xml:space="preserve"> </w:t>
       </w:r>
       <w:r>
         <w:rPr>
           <w:color w:val="1D2021"/>
+          <w:sz w:val="24"/>
+          <w:szCs w:val="24"/>
         </w:rPr>
         <w:t>№</w:t>
       </w:r>
@@ -27279,12 +26870,16 @@
         <w:rPr>
           <w:color w:val="1D2021"/>
           <w:spacing w:val="-10"/>
+          <w:sz w:val="24"/>
+          <w:szCs w:val="24"/>
         </w:rPr>
         <w:t xml:space="preserve"> </w:t>
       </w:r>
       <w:r>
         <w:rPr>
           <w:color w:val="1D2021"/>
+          <w:sz w:val="24"/>
+          <w:szCs w:val="24"/>
         </w:rPr>
         <w:t>3</w:t>
       </w:r>
@@ -27292,12 +26887,16 @@
         <w:rPr>
           <w:color w:val="1D2021"/>
           <w:spacing w:val="-10"/>
+          <w:sz w:val="24"/>
+          <w:szCs w:val="24"/>
         </w:rPr>
         <w:t xml:space="preserve"> </w:t>
       </w:r>
       <w:r>
         <w:rPr>
           <w:color w:val="1D2021"/>
+          <w:sz w:val="24"/>
+          <w:szCs w:val="24"/>
         </w:rPr>
         <w:t>к</w:t>
       </w:r>
@@ -27305,12 +26904,16 @@
         <w:rPr>
           <w:color w:val="1D2021"/>
           <w:spacing w:val="-10"/>
+          <w:sz w:val="24"/>
+          <w:szCs w:val="24"/>
         </w:rPr>
         <w:t xml:space="preserve"> </w:t>
       </w:r>
       <w:r>
         <w:rPr>
           <w:color w:val="1D2021"/>
+          <w:sz w:val="24"/>
+          <w:szCs w:val="24"/>
         </w:rPr>
         <w:t>договору</w:t>
       </w:r>
@@ -27318,12 +26921,16 @@
         <w:rPr>
           <w:color w:val="1D2021"/>
           <w:spacing w:val="-10"/>
+          <w:sz w:val="24"/>
+          <w:szCs w:val="24"/>
         </w:rPr>
         <w:t xml:space="preserve"> </w:t>
       </w:r>
       <w:r>
         <w:rPr>
           <w:color w:val="1D2021"/>
+          <w:sz w:val="24"/>
+          <w:szCs w:val="24"/>
         </w:rPr>
         <w:t>аренды</w:t>
       </w:r>
@@ -27331,12 +26938,16 @@
         <w:rPr>
           <w:color w:val="1D2021"/>
           <w:spacing w:val="-10"/>
+          <w:sz w:val="24"/>
+          <w:szCs w:val="24"/>
         </w:rPr>
         <w:t xml:space="preserve"> </w:t>
       </w:r>
       <w:r>
         <w:rPr>
           <w:color w:val="1D2021"/>
+          <w:sz w:val="24"/>
+          <w:szCs w:val="24"/>
         </w:rPr>
         <w:t>автомобиля</w:t>
       </w:r>
@@ -27344,12 +26955,16 @@
         <w:rPr>
           <w:color w:val="1D2021"/>
           <w:spacing w:val="-10"/>
+          <w:sz w:val="24"/>
+          <w:szCs w:val="24"/>
         </w:rPr>
         <w:t xml:space="preserve"> </w:t>
       </w:r>
       <w:r>
         <w:rPr>
           <w:color w:val="1D2021"/>
+          <w:sz w:val="24"/>
+          <w:szCs w:val="24"/>
         </w:rPr>
         <w:t>без</w:t>
       </w:r>
@@ -27357,6 +26972,8 @@
         <w:rPr>
           <w:color w:val="1D2021"/>
           <w:spacing w:val="-10"/>
+          <w:sz w:val="24"/>
+          <w:szCs w:val="24"/>
         </w:rPr>
         <w:t xml:space="preserve"> </w:t>
       </w:r>
@@ -27364,8 +26981,63 @@
         <w:rPr>
           <w:color w:val="1D2021"/>
           <w:spacing w:val="-2"/>
+          <w:sz w:val="24"/>
+          <w:szCs w:val="24"/>
         </w:rPr>
         <w:t>экипажа</w:t>
+      </w:r>
+      <w:r>
+        <w:rPr>
+          <w:color w:val="1D2021"/>
+          <w:spacing w:val="-2"/>
+          <w:sz w:val="24"/>
+          <w:szCs w:val="24"/>
+        </w:rPr>
+        <w:t xml:space="preserve"> </w:t>
+      </w:r>
+      <w:r>
+        <w:rPr>
+          <w:color w:val="1D2021"/>
+          <w:sz w:val="24"/>
+          <w:szCs w:val="24"/>
+        </w:rPr>
+        <w:t>№ {{</w:t>
+      </w:r>
+      <w:proofErr w:type="spellStart"/>
+      <w:r>
+        <w:rPr>
+          <w:color w:val="1D2021"/>
+          <w:sz w:val="24"/>
+          <w:szCs w:val="24"/>
+        </w:rPr>
+        <w:t>contract_number</w:t>
+      </w:r>
+      <w:proofErr w:type="spellEnd"/>
+      <w:r>
+        <w:rPr>
+          <w:color w:val="1D2021"/>
+          <w:sz w:val="24"/>
+          <w:szCs w:val="24"/>
+        </w:rPr>
+        <w:t>}} от {{</w:t>
+      </w:r>
+      <w:proofErr w:type="spellStart"/>
+      <w:r>
+        <w:rPr>
+          <w:color w:val="1D2021"/>
+          <w:sz w:val="24"/>
+          <w:szCs w:val="24"/>
+        </w:rPr>
+        <w:t>contract_date</w:t>
+      </w:r>
+      <w:proofErr w:type="spellEnd"/>
+      <w:r>
+        <w:rPr>
+          <w:color w:val="1D2021"/>
+          <w:sz w:val="24"/>
+          <w:szCs w:val="24"/>
+        </w:rPr>
+        <w:t>}}</w:t>
       </w:r>
     </w:p>
     <w:p>
@@ -27437,28 +27109,32 @@
         <w:tabs>
           <w:tab w:val="left" w:pos="10307"/>
         </w:tabs>
-        <w:rPr>
-          <w:rFonts w:ascii="Times New Roman" w:hAnsi="Times New Roman"/>
-        </w:rPr>
-      </w:pPr>
-      <w:r>
-        <w:rPr>
-          <w:color w:val="545454"/>
-        </w:rPr>
-        <w:t>Попов</w:t>
-      </w:r>
-      <w:r>
-        <w:rPr>
-          <w:color w:val="545454"/>
-          <w:spacing w:val="-12"/>
-        </w:rPr>
-        <w:t xml:space="preserve"> </w:t>
-      </w:r>
-      <w:r>
-        <w:rPr>
-          <w:color w:val="545454"/>
-        </w:rPr>
-        <w:t>Денис</w:t>
+      </w:pPr>
+      <w:r>
+        <w:rPr>
+          <w:color w:val="545454"/>
+        </w:rPr>
+        <w:t>{{</w:t>
+      </w:r>
+      <w:proofErr w:type="spellStart"/>
+      <w:r>
+        <w:rPr>
+          <w:color w:val="545454"/>
+        </w:rPr>
+        <w:t>owner_full_name</w:t>
+      </w:r>
+      <w:proofErr w:type="spellEnd"/>
+      <w:r>
+        <w:rPr>
+          <w:color w:val="545454"/>
+        </w:rPr>
+        <w:t>}}</w:t>
+      </w:r>
+      <w:r>
+        <w:rPr>
+          <w:color w:val="545454"/>
+        </w:rPr>
+        <w:t>,</w:t>
       </w:r>
       <w:r>
         <w:rPr>
@@ -27471,7 +27147,20 @@
         <w:rPr>
           <w:color w:val="545454"/>
         </w:rPr>
-        <w:t>Андреевич,</w:t>
+        <w:t>именуемый</w:t>
+      </w:r>
+      <w:r>
+        <w:rPr>
+          <w:color w:val="545454"/>
+          <w:spacing w:val="-10"/>
+        </w:rPr>
+        <w:t xml:space="preserve"> </w:t>
+      </w:r>
+      <w:r>
+        <w:rPr>
+          <w:color w:val="545454"/>
+        </w:rPr>
+        <w:t>в</w:t>
       </w:r>
       <w:r>
         <w:rPr>
@@ -27484,7 +27173,20 @@
         <w:rPr>
           <w:color w:val="545454"/>
         </w:rPr>
-        <w:t>именуемый</w:t>
+        <w:t>дальнейшем</w:t>
+      </w:r>
+      <w:r>
+        <w:rPr>
+          <w:color w:val="545454"/>
+          <w:spacing w:val="-9"/>
+        </w:rPr>
+        <w:t xml:space="preserve"> </w:t>
+      </w:r>
+      <w:r>
+        <w:rPr>
+          <w:color w:val="545454"/>
+        </w:rPr>
+        <w:t>«Арендодатель»,</w:t>
       </w:r>
       <w:r>
         <w:rPr>
@@ -27497,11 +27199,149 @@
         <w:rPr>
           <w:color w:val="545454"/>
         </w:rPr>
+        <w:t>с</w:t>
+      </w:r>
+      <w:r>
+        <w:rPr>
+          <w:color w:val="545454"/>
+          <w:spacing w:val="-9"/>
+        </w:rPr>
+        <w:t xml:space="preserve"> </w:t>
+      </w:r>
+      <w:r>
+        <w:rPr>
+          <w:color w:val="545454"/>
+        </w:rPr>
+        <w:t>одной</w:t>
+      </w:r>
+      <w:r>
+        <w:rPr>
+          <w:color w:val="545454"/>
+          <w:spacing w:val="-9"/>
+        </w:rPr>
+        <w:t xml:space="preserve"> </w:t>
+      </w:r>
+      <w:r>
+        <w:rPr>
+          <w:color w:val="545454"/>
+        </w:rPr>
+        <w:t>стороны,</w:t>
+      </w:r>
+      <w:r>
+        <w:rPr>
+          <w:color w:val="545454"/>
+          <w:spacing w:val="-9"/>
+        </w:rPr>
+        <w:t xml:space="preserve"> </w:t>
+      </w:r>
+      <w:r>
+        <w:rPr>
+          <w:color w:val="545454"/>
+          <w:spacing w:val="-10"/>
+        </w:rPr>
+        <w:t>и</w:t>
+      </w:r>
+      <w:r>
+        <w:rPr>
+          <w:color w:val="545454"/>
+          <w:spacing w:val="-10"/>
+        </w:rPr>
+        <w:t xml:space="preserve"> </w:t>
+      </w:r>
+      <w:r>
+        <w:rPr>
+          <w:color w:val="545454"/>
+        </w:rPr>
+        <w:t>{{</w:t>
+      </w:r>
+      <w:proofErr w:type="spellStart"/>
+      <w:r>
+        <w:rPr>
+          <w:color w:val="545454"/>
+        </w:rPr>
+        <w:t>client_full_name</w:t>
+      </w:r>
+      <w:proofErr w:type="spellEnd"/>
+      <w:r>
+        <w:rPr>
+          <w:color w:val="545454"/>
+        </w:rPr>
+        <w:t>}}</w:t>
+      </w:r>
+      <w:r>
+        <w:rPr>
+          <w:color w:val="545454"/>
+        </w:rPr>
+        <w:t>,</w:t>
+      </w:r>
+      <w:r>
+        <w:rPr>
+          <w:color w:val="545454"/>
+        </w:rPr>
+        <w:t xml:space="preserve"> </w:t>
+      </w:r>
+      <w:r>
+        <w:rPr>
+          <w:color w:val="545454"/>
+        </w:rPr>
+        <w:t>{{</w:t>
+      </w:r>
+      <w:proofErr w:type="spellStart"/>
+      <w:r>
+        <w:rPr>
+          <w:color w:val="545454"/>
+        </w:rPr>
+        <w:t>client_named_as</w:t>
+      </w:r>
+      <w:proofErr w:type="spellEnd"/>
+      <w:r>
+        <w:rPr>
+          <w:color w:val="545454"/>
+        </w:rPr>
+        <w:t>}}</w:t>
+      </w:r>
+      <w:r>
+        <w:rPr>
+          <w:color w:val="545454"/>
+        </w:rPr>
+        <w:t xml:space="preserve"> </w:t>
+      </w:r>
+      <w:r>
+        <w:rPr>
+          <w:color w:val="545454"/>
+        </w:rPr>
         <w:t>в</w:t>
       </w:r>
       <w:r>
         <w:rPr>
           <w:color w:val="545454"/>
+          <w:spacing w:val="-8"/>
+        </w:rPr>
+        <w:t xml:space="preserve"> </w:t>
+      </w:r>
+      <w:r>
+        <w:rPr>
+          <w:color w:val="545454"/>
+          <w:spacing w:val="-2"/>
+        </w:rPr>
+        <w:t>дальнейшем</w:t>
+      </w:r>
+      <w:r>
+        <w:rPr>
+          <w:color w:val="545454"/>
+          <w:spacing w:val="-2"/>
+        </w:rPr>
+        <w:t xml:space="preserve"> </w:t>
+      </w:r>
+      <w:r>
+        <w:rPr>
+          <w:color w:val="545454"/>
+        </w:rPr>
+        <w:t>«Арендатор»,</w:t>
+      </w:r>
+      <w:r>
+        <w:rPr>
+          <w:color w:val="545454"/>
           <w:spacing w:val="-9"/>
         </w:rPr>
         <w:t xml:space="preserve"> </w:t>
@@ -27510,7 +27350,7 @@
         <w:rPr>
           <w:color w:val="545454"/>
         </w:rPr>
-        <w:t>дальнейшем</w:t>
+        <w:t>с</w:t>
       </w:r>
       <w:r>
         <w:rPr>
@@ -27523,20 +27363,7 @@
         <w:rPr>
           <w:color w:val="545454"/>
         </w:rPr>
-        <w:t>«Арендодатель»,</w:t>
-      </w:r>
-      <w:r>
-        <w:rPr>
-          <w:color w:val="545454"/>
-          <w:spacing w:val="-10"/>
-        </w:rPr>
-        <w:t xml:space="preserve"> </w:t>
-      </w:r>
-      <w:r>
-        <w:rPr>
-          <w:color w:val="545454"/>
-        </w:rPr>
-        <w:t>с</w:t>
+        <w:t>другой</w:t>
       </w:r>
       <w:r>
         <w:rPr>
@@ -27549,7 +27376,7 @@
         <w:rPr>
           <w:color w:val="545454"/>
         </w:rPr>
-        <w:t>одной</w:t>
+        <w:t>стороны,</w:t>
       </w:r>
       <w:r>
         <w:rPr>
@@ -27562,7 +27389,7 @@
         <w:rPr>
           <w:color w:val="545454"/>
         </w:rPr>
-        <w:t>стороны,</w:t>
+        <w:t>составили</w:t>
       </w:r>
       <w:r>
         <w:rPr>
@@ -27574,246 +27401,106 @@
       <w:r>
         <w:rPr>
           <w:color w:val="545454"/>
-          <w:spacing w:val="-10"/>
-        </w:rPr>
-        <w:t>и</w:t>
-      </w:r>
-      <w:r>
-        <w:rPr>
-          <w:rFonts w:ascii="Times New Roman" w:hAnsi="Times New Roman"/>
-          <w:color w:val="545454"/>
-          <w:u w:val="single" w:color="535353"/>
-        </w:rPr>
-        <w:tab/>
-      </w:r>
-    </w:p>
-    <w:p>
-      <w:pPr>
-        <w:pStyle w:val="a3"/>
-        <w:tabs>
-          <w:tab w:val="left" w:pos="7180"/>
-        </w:tabs>
-      </w:pPr>
-      <w:r>
-        <w:rPr>
-          <w:rFonts w:ascii="Times New Roman" w:hAnsi="Times New Roman"/>
-          <w:color w:val="545454"/>
-          <w:u w:val="single" w:color="535353"/>
-        </w:rPr>
-        <w:tab/>
-      </w:r>
-      <w:r>
-        <w:rPr>
-          <w:color w:val="545454"/>
-        </w:rPr>
-        <w:t>именуемый(</w:t>
+        </w:rPr>
+        <w:t>настоящий</w:t>
+      </w:r>
+      <w:r>
+        <w:rPr>
+          <w:color w:val="545454"/>
+          <w:spacing w:val="-9"/>
+        </w:rPr>
+        <w:t xml:space="preserve"> </w:t>
+      </w:r>
+      <w:r>
+        <w:rPr>
+          <w:color w:val="545454"/>
+        </w:rPr>
+        <w:t>акт</w:t>
+      </w:r>
+      <w:r>
+        <w:rPr>
+          <w:color w:val="545454"/>
+          <w:spacing w:val="-9"/>
+        </w:rPr>
+        <w:t xml:space="preserve"> </w:t>
+      </w:r>
+      <w:r>
+        <w:rPr>
+          <w:color w:val="545454"/>
+        </w:rPr>
+        <w:t>возврата</w:t>
+      </w:r>
+      <w:r>
+        <w:rPr>
+          <w:color w:val="545454"/>
+          <w:spacing w:val="-9"/>
+        </w:rPr>
+        <w:t xml:space="preserve"> </w:t>
+      </w:r>
+      <w:r>
+        <w:rPr>
+          <w:color w:val="545454"/>
+        </w:rPr>
+        <w:t>транспортного</w:t>
+      </w:r>
+      <w:r>
+        <w:rPr>
+          <w:color w:val="545454"/>
+          <w:spacing w:val="-9"/>
+        </w:rPr>
+        <w:t xml:space="preserve"> </w:t>
+      </w:r>
+      <w:r>
+        <w:rPr>
+          <w:color w:val="545454"/>
+        </w:rPr>
+        <w:t>средства</w:t>
+      </w:r>
+      <w:r>
+        <w:rPr>
+          <w:color w:val="545454"/>
+          <w:spacing w:val="-9"/>
+        </w:rPr>
+        <w:t xml:space="preserve"> </w:t>
+      </w:r>
+      <w:r>
+        <w:rPr>
+          <w:color w:val="545454"/>
+        </w:rPr>
+        <w:t>(автомобиля)</w:t>
+      </w:r>
+      <w:r>
+        <w:rPr>
+          <w:color w:val="545454"/>
+          <w:spacing w:val="-9"/>
+        </w:rPr>
+        <w:t xml:space="preserve"> </w:t>
+      </w:r>
+      <w:r>
+        <w:rPr>
+          <w:color w:val="545454"/>
+        </w:rPr>
+        <w:t xml:space="preserve">по договору аренды автомобиля без экипажа № </w:t>
+      </w:r>
+      <w:r>
+        <w:rPr>
+          <w:color w:val="545454"/>
+        </w:rPr>
+        <w:t>{{</w:t>
       </w:r>
       <w:proofErr w:type="spellStart"/>
       <w:r>
         <w:rPr>
           <w:color w:val="545454"/>
         </w:rPr>
-        <w:t>ая</w:t>
+        <w:t>contract_number</w:t>
       </w:r>
       <w:proofErr w:type="spellEnd"/>
       <w:r>
         <w:rPr>
           <w:color w:val="545454"/>
         </w:rPr>
-        <w:t>)</w:t>
-      </w:r>
-      <w:r>
-        <w:rPr>
-          <w:color w:val="545454"/>
-          <w:spacing w:val="-8"/>
-        </w:rPr>
-        <w:t xml:space="preserve"> </w:t>
-      </w:r>
-      <w:r>
-        <w:rPr>
-          <w:color w:val="545454"/>
-        </w:rPr>
-        <w:t>в</w:t>
-      </w:r>
-      <w:r>
-        <w:rPr>
-          <w:color w:val="545454"/>
-          <w:spacing w:val="-8"/>
-        </w:rPr>
-        <w:t xml:space="preserve"> </w:t>
-      </w:r>
-      <w:r>
-        <w:rPr>
-          <w:color w:val="545454"/>
-          <w:spacing w:val="-2"/>
-        </w:rPr>
-        <w:t>дальнейшем</w:t>
-      </w:r>
-    </w:p>
-    <w:p>
-      <w:pPr>
-        <w:pStyle w:val="a3"/>
-        <w:tabs>
-          <w:tab w:val="left" w:pos="5005"/>
-        </w:tabs>
-        <w:ind w:right="117"/>
-      </w:pPr>
-      <w:r>
-        <w:rPr>
-          <w:color w:val="545454"/>
-        </w:rPr>
-        <w:t>«Арендатор»,</w:t>
-      </w:r>
-      <w:r>
-        <w:rPr>
-          <w:color w:val="545454"/>
-          <w:spacing w:val="-9"/>
-        </w:rPr>
-        <w:t xml:space="preserve"> </w:t>
-      </w:r>
-      <w:r>
-        <w:rPr>
-          <w:color w:val="545454"/>
-        </w:rPr>
-        <w:t>с</w:t>
-      </w:r>
-      <w:r>
-        <w:rPr>
-          <w:color w:val="545454"/>
-          <w:spacing w:val="-9"/>
-        </w:rPr>
-        <w:t xml:space="preserve"> </w:t>
-      </w:r>
-      <w:r>
-        <w:rPr>
-          <w:color w:val="545454"/>
-        </w:rPr>
-        <w:t>другой</w:t>
-      </w:r>
-      <w:r>
-        <w:rPr>
-          <w:color w:val="545454"/>
-          <w:spacing w:val="-9"/>
-        </w:rPr>
-        <w:t xml:space="preserve"> </w:t>
-      </w:r>
-      <w:r>
-        <w:rPr>
-          <w:color w:val="545454"/>
-        </w:rPr>
-        <w:t>стороны,</w:t>
-      </w:r>
-      <w:r>
-        <w:rPr>
-          <w:color w:val="545454"/>
-          <w:spacing w:val="-9"/>
-        </w:rPr>
-        <w:t xml:space="preserve"> </w:t>
-      </w:r>
-      <w:r>
-        <w:rPr>
-          <w:color w:val="545454"/>
-        </w:rPr>
-        <w:t>составили</w:t>
-      </w:r>
-      <w:r>
-        <w:rPr>
-          <w:color w:val="545454"/>
-          <w:spacing w:val="-9"/>
-        </w:rPr>
-        <w:t xml:space="preserve"> </w:t>
-      </w:r>
-      <w:r>
-        <w:rPr>
-          <w:color w:val="545454"/>
-        </w:rPr>
-        <w:t>настоящий</w:t>
-      </w:r>
-      <w:r>
-        <w:rPr>
-          <w:color w:val="545454"/>
-          <w:spacing w:val="-9"/>
-        </w:rPr>
-        <w:t xml:space="preserve"> </w:t>
-      </w:r>
-      <w:r>
-        <w:rPr>
-          <w:color w:val="545454"/>
-        </w:rPr>
-        <w:t>акт</w:t>
-      </w:r>
-      <w:r>
-        <w:rPr>
-          <w:color w:val="545454"/>
-          <w:spacing w:val="-9"/>
-        </w:rPr>
-        <w:t xml:space="preserve"> </w:t>
-      </w:r>
-      <w:r>
-        <w:rPr>
-          <w:color w:val="545454"/>
-        </w:rPr>
-        <w:t>возврата</w:t>
-      </w:r>
-      <w:r>
-        <w:rPr>
-          <w:color w:val="545454"/>
-          <w:spacing w:val="-9"/>
-        </w:rPr>
-        <w:t xml:space="preserve"> </w:t>
-      </w:r>
-      <w:r>
-        <w:rPr>
-          <w:color w:val="545454"/>
-        </w:rPr>
-        <w:t>транспортного</w:t>
-      </w:r>
-      <w:r>
-        <w:rPr>
-          <w:color w:val="545454"/>
-          <w:spacing w:val="-9"/>
-        </w:rPr>
-        <w:t xml:space="preserve"> </w:t>
-      </w:r>
-      <w:r>
-        <w:rPr>
-          <w:color w:val="545454"/>
-        </w:rPr>
-        <w:t>средства</w:t>
-      </w:r>
-      <w:r>
-        <w:rPr>
-          <w:color w:val="545454"/>
-          <w:spacing w:val="-9"/>
-        </w:rPr>
-        <w:t xml:space="preserve"> </w:t>
-      </w:r>
-      <w:r>
-        <w:rPr>
-          <w:color w:val="545454"/>
-        </w:rPr>
-        <w:t>(автомобиля)</w:t>
-      </w:r>
-      <w:r>
-        <w:rPr>
-          <w:color w:val="545454"/>
-          <w:spacing w:val="-9"/>
-        </w:rPr>
-        <w:t xml:space="preserve"> </w:t>
-      </w:r>
-      <w:r>
-        <w:rPr>
-          <w:color w:val="545454"/>
-        </w:rPr>
-        <w:t xml:space="preserve">по договору аренды автомобиля без экипажа № </w:t>
-      </w:r>
-      <w:r>
-        <w:rPr>
-          <w:rFonts w:ascii="Times New Roman" w:hAnsi="Times New Roman"/>
-          <w:color w:val="545454"/>
-          <w:u w:val="single" w:color="535353"/>
-        </w:rPr>
-        <w:tab/>
+        <w:t xml:space="preserve">}} </w:t>
       </w:r>
       <w:r>
         <w:rPr>
@@ -29178,7 +28865,7 @@
         </w:rPr>
         <w:lastRenderedPageBreak/>
         <w:drawing>
-          <wp:inline distT="0" distB="0" distL="0" distR="0" wp14:anchorId="63722DFF" wp14:editId="3E68CFE4">
+          <wp:inline distT="0" distB="0" distL="0" distR="0" wp14:anchorId="63722DFF" wp14:editId="4163E41E">
             <wp:extent cx="4733925" cy="5653504"/>
             <wp:effectExtent l="0" t="0" r="0" b="4445"/>
             <wp:docPr id="28" name="Рисунок 28"/>
@@ -29193,7 +28880,7 @@
                     <pic:cNvPicPr/>
                   </pic:nvPicPr>
                   <pic:blipFill>
-                    <a:blip r:embed="rId7" cstate="print">
+                    <a:blip r:embed="rId6" cstate="print">
                       <a:extLst>
                         <a:ext uri="{28A0092B-C50C-407E-A947-70E740481C1C}">
                           <a14:useLocalDpi xmlns:a14="http://schemas.microsoft.com/office/drawing/2010/main" val="0"/>
@@ -30098,6 +29785,30 @@
           <w:sz w:val="20"/>
         </w:rPr>
         <w:t>литр</w:t>
+      </w:r>
+    </w:p>
+    <w:p>
+      <w:pPr>
+        <w:pStyle w:val="a4"/>
+        <w:numPr>
+          <w:ilvl w:val="1"/>
+          <w:numId w:val="1"/>
+        </w:numPr>
+        <w:tabs>
+          <w:tab w:val="left" w:pos="1420"/>
+          <w:tab w:val="left" w:pos="5030"/>
+        </w:tabs>
+        <w:rPr>
+          <w:sz w:val="20"/>
+        </w:rPr>
+      </w:pPr>
+      <w:r>
+        <w:rPr>
+          <w:color w:val="545454"/>
+          <w:spacing w:val="-4"/>
+          <w:sz w:val="20"/>
+        </w:rPr>
+        <w:t>Время возврата ___________________</w:t>
       </w:r>
     </w:p>
     <w:p>
@@ -31599,7 +31310,6 @@
   <w:style w:type="character" w:default="1" w:styleId="a0">
     <w:name w:val="Default Paragraph Font"/>
     <w:uiPriority w:val="1"/>
-    <w:semiHidden/>
     <w:unhideWhenUsed/>
   </w:style>
   <w:style w:type="table" w:default="1" w:styleId="a1">

</xml_diff>